<commit_message>
BMS lader en USB stromen
</commit_message>
<xml_diff>
--- a/Componenten.docx
+++ b/Componenten.docx
@@ -70,11 +70,9 @@
           <w:pPr>
             <w:pStyle w:val="TOCHeading"/>
           </w:pPr>
-          <w:proofErr w:type="spellStart"/>
           <w:r>
             <w:t>Inhoud</w:t>
           </w:r>
-          <w:proofErr w:type="spellEnd"/>
         </w:p>
         <w:p>
           <w:pPr>
@@ -4797,13 +4795,8 @@
           <w:lang w:val="en-US"/>
         </w:rPr>
       </w:pPr>
-      <w:proofErr w:type="gramStart"/>
-      <w:r>
-        <w:t>EEC chip</w:t>
-      </w:r>
-      <w:proofErr w:type="gramEnd"/>
-      <w:r>
-        <w:t>: elliptische curve bereke</w:t>
+      <w:r>
+        <w:t>EEC chip: elliptische curve bereke</w:t>
       </w:r>
       <w:r>
         <w:t>ning</w:t>
@@ -4980,16 +4973,11 @@
       <w:r>
         <w:t xml:space="preserve">externe </w:t>
       </w:r>
-      <w:proofErr w:type="gramStart"/>
       <w:r>
         <w:t>EEC c</w:t>
       </w:r>
       <w:r>
-        <w:t>hip</w:t>
-      </w:r>
-      <w:proofErr w:type="gramEnd"/>
-      <w:r>
-        <w:t>)</w:t>
+        <w:t>hip)</w:t>
       </w:r>
     </w:p>
     <w:p>
@@ -5283,13 +5271,8 @@
             <w:pPr>
               <w:spacing w:line="240" w:lineRule="auto"/>
             </w:pPr>
-            <w:proofErr w:type="gramStart"/>
-            <w:r>
-              <w:t>Debug /</w:t>
-            </w:r>
-            <w:proofErr w:type="gramEnd"/>
-            <w:r>
-              <w:t xml:space="preserve"> utils</w:t>
+            <w:r>
+              <w:t>Debug / utils</w:t>
             </w:r>
           </w:p>
         </w:tc>
@@ -5524,11 +5507,9 @@
             <w:pPr>
               <w:spacing w:line="240" w:lineRule="auto"/>
             </w:pPr>
-            <w:proofErr w:type="gramStart"/>
             <w:r>
               <w:t>QR matrix</w:t>
             </w:r>
-            <w:proofErr w:type="gramEnd"/>
           </w:p>
         </w:tc>
         <w:tc>
@@ -6436,16 +6417,8 @@
               <w:rPr>
                 <w:lang w:val="en-US"/>
               </w:rPr>
-              <w:t>1-</w:t>
-            </w:r>
-            <w:proofErr w:type="gramStart"/>
-            <w:r>
-              <w:rPr>
-                <w:lang w:val="en-US"/>
-              </w:rPr>
-              <w:t>3 ?</w:t>
-            </w:r>
-            <w:proofErr w:type="gramEnd"/>
+              <w:t>1-3 ?</w:t>
+            </w:r>
           </w:p>
           <w:p>
             <w:pPr>
@@ -7544,21 +7517,7 @@
             <w:rStyle w:val="Hyperlink"/>
             <w:lang w:val="en-US"/>
           </w:rPr>
-          <w:t>https://www.digikey.be/en/products/filter/embedded-microcontrollers/685?s=N4IgjCBcpgbFoDGUBmBDANgZwKYBoQB7KAbRACZyBWATjAAYQCwAOFgFgHYBmEAXQIAHAC5QQAZWEAnAJYA7AOYgAvsypUEIZJHTZ8RUuFZV68NS3r1yTEC1gnGAkCLGTZilWvjQtqTLgJiSDIwdnIaLhtWFm4aDQJ</w:t>
-        </w:r>
-        <w:r>
-          <w:rPr>
-            <w:rStyle w:val="Hyperlink"/>
-            <w:lang w:val="en-US"/>
-          </w:rPr>
-          <w:t>y</w:t>
-        </w:r>
-        <w:r>
-          <w:rPr>
-            <w:rStyle w:val="Hyperlink"/>
-            <w:lang w:val="en-US"/>
-          </w:rPr>
-          <w:t>UM5yXicXSAlpeSVVEABaCB9tXQCDYJB2Gk5%2BXLz2TWL-fSCydjCWawIwnl4uulgaGtyNH0EoMCExyGplZSA</w:t>
+          <w:t>https://www.digikey.be/en/products/filter/embedded-microcontrollers/685?s=N4IgjCBcpgbFoDGUBmBDANgZwKYBoQB7KAbRACZyBWATjAAYQCwAOFgFgHYBmEAXQIAHAC5QQAZWEAnAJYA7AOYgAvsypUEIZJHTZ8RUuFZV68NS3r1yTEC1gnGAkCLGTZilWvjQtqTLgJiSDIwdnIaLhtWFm4aDQJyUM5yXicXSAlpeSVVEABaCB9tXQCDYJB2Gk5%2BXLz2TWL-fSCydjCWawIwnl4uulgaGtyNH0EoMCExyGplZSA</w:t>
         </w:r>
       </w:hyperlink>
     </w:p>
@@ -7860,7 +7819,7 @@
         </w:rPr>
         <w:lastRenderedPageBreak/>
         <w:drawing>
-          <wp:inline distT="0" distB="0" distL="0" distR="0" wp14:anchorId="246ED48E" wp14:editId="1F7E6043">
+          <wp:inline distT="0" distB="0" distL="0" distR="0" wp14:anchorId="246ED48E" wp14:editId="1AA1DD7A">
             <wp:extent cx="5876925" cy="6946601"/>
             <wp:effectExtent l="0" t="0" r="0" b="6985"/>
             <wp:docPr id="1060474358" name="Picture 2"/>
@@ -7950,21 +7909,7 @@
             <w:rStyle w:val="Hyperlink"/>
             <w:lang w:val="en-US"/>
           </w:rPr>
-          <w:t>STM32L431</w:t>
-        </w:r>
-        <w:r>
-          <w:rPr>
-            <w:rStyle w:val="Hyperlink"/>
-            <w:lang w:val="en-US"/>
-          </w:rPr>
-          <w:t>C</w:t>
-        </w:r>
-        <w:r>
-          <w:rPr>
-            <w:rStyle w:val="Hyperlink"/>
-            <w:lang w:val="en-US"/>
-          </w:rPr>
-          <w:t>CT6TR</w:t>
+          <w:t>STM32L431CCT6TR</w:t>
         </w:r>
       </w:hyperlink>
       <w:r>
@@ -8061,26 +8006,10 @@
         <w:t>868MHz voor Europa</w:t>
       </w:r>
       <w:r>
-        <w:t xml:space="preserve"> (863–870 </w:t>
-      </w:r>
-      <w:proofErr w:type="gramStart"/>
-      <w:r>
-        <w:t>MHz</w:t>
-      </w:r>
-      <w:r>
-        <w:t xml:space="preserve"> /</w:t>
-      </w:r>
-      <w:proofErr w:type="gramEnd"/>
-      <w:r>
-        <w:t xml:space="preserve"> EU</w:t>
-      </w:r>
-      <w:proofErr w:type="gramStart"/>
-      <w:r>
-        <w:t>868 /</w:t>
-      </w:r>
-      <w:proofErr w:type="gramEnd"/>
-      <w:r>
-        <w:t xml:space="preserve"> ISM band)</w:t>
+        <w:t xml:space="preserve"> (863–870 MHz</w:t>
+      </w:r>
+      <w:r>
+        <w:t xml:space="preserve"> / EU868 / ISM band)</w:t>
       </w:r>
     </w:p>
     <w:p>
@@ -8122,16 +8051,8 @@
         <w:rPr>
           <w:lang w:val="nl-NL"/>
         </w:rPr>
-        <w:t>ETSI EN 300 220-</w:t>
-      </w:r>
-      <w:proofErr w:type="gramStart"/>
-      <w:r>
-        <w:rPr>
-          <w:lang w:val="nl-NL"/>
-        </w:rPr>
-        <w:t>conform</w:t>
-      </w:r>
-      <w:proofErr w:type="gramEnd"/>
+        <w:t>ETSI EN 300 220-conform</w:t>
+      </w:r>
     </w:p>
     <w:p>
       <w:pPr>
@@ -8145,22 +8066,14 @@
         <w:rPr>
           <w:lang w:val="nl-NL"/>
         </w:rPr>
-        <w:t xml:space="preserve">RX-stroom ≈ 4–6 </w:t>
-      </w:r>
-      <w:proofErr w:type="gramStart"/>
+        <w:t xml:space="preserve">RX-stroom ≈ 4–6 mA </w:t>
+      </w:r>
       <w:r>
         <w:rPr>
           <w:lang w:val="nl-NL"/>
         </w:rPr>
-        <w:t xml:space="preserve">mA </w:t>
-      </w:r>
-      <w:r>
-        <w:rPr>
-          <w:lang w:val="nl-NL"/>
-        </w:rPr>
         <w:t>?</w:t>
       </w:r>
-      <w:proofErr w:type="gramEnd"/>
     </w:p>
     <w:p>
       <w:pPr>
@@ -8174,22 +8087,14 @@
         <w:rPr>
           <w:lang w:val="nl-NL"/>
         </w:rPr>
-        <w:t>TX-stroom ≈ 40–120 mA (afhankelijk van het vermogen</w:t>
-      </w:r>
-      <w:proofErr w:type="gramStart"/>
+        <w:t xml:space="preserve">TX-stroom ≈ 40–120 mA (afhankelijk van het vermogen) </w:t>
+      </w:r>
       <w:r>
         <w:rPr>
           <w:lang w:val="nl-NL"/>
         </w:rPr>
-        <w:t xml:space="preserve">) </w:t>
-      </w:r>
-      <w:r>
-        <w:rPr>
-          <w:lang w:val="nl-NL"/>
-        </w:rPr>
         <w:t>?</w:t>
       </w:r>
-      <w:proofErr w:type="gramEnd"/>
     </w:p>
     <w:p>
       <w:pPr>
@@ -8292,13 +8197,8 @@
           <w:numId w:val="67"/>
         </w:numPr>
       </w:pPr>
-      <w:proofErr w:type="gramStart"/>
-      <w:r>
-        <w:t>RF matching</w:t>
-      </w:r>
-      <w:proofErr w:type="gramEnd"/>
-      <w:r>
-        <w:t xml:space="preserve"> en antenne design zelf doe</w:t>
+      <w:r>
+        <w:t>RF matching en antenne design zelf doe</w:t>
       </w:r>
       <w:r>
         <w:t>n</w:t>
@@ -8451,13 +8351,8 @@
           <w:numId w:val="67"/>
         </w:numPr>
       </w:pPr>
-      <w:proofErr w:type="gramStart"/>
-      <w:r>
-        <w:t>RF ontwerp</w:t>
-      </w:r>
-      <w:proofErr w:type="gramEnd"/>
-      <w:r>
-        <w:t xml:space="preserve"> moeilijker (antenne interface, ground keep-outs)</w:t>
+      <w:r>
+        <w:t>RF ontwerp moeilijker (antenne interface, ground keep-outs)</w:t>
       </w:r>
     </w:p>
     <w:p>
@@ -8469,31 +8364,7 @@
         </w:numPr>
       </w:pPr>
       <w:r>
-        <w:t>Moeilijkere configuratie (</w:t>
-      </w:r>
-      <w:proofErr w:type="gramStart"/>
-      <w:r>
-        <w:t>EU regels</w:t>
-      </w:r>
-      <w:proofErr w:type="gramEnd"/>
-      <w:r>
-        <w:t xml:space="preserve">, </w:t>
-      </w:r>
-      <w:proofErr w:type="gramStart"/>
-      <w:r>
-        <w:t>RF matching</w:t>
-      </w:r>
-      <w:proofErr w:type="gramEnd"/>
-      <w:r>
-        <w:t xml:space="preserve"> zelf </w:t>
-      </w:r>
-      <w:proofErr w:type="gramStart"/>
-      <w:r>
-        <w:t>instellen,…</w:t>
-      </w:r>
-      <w:proofErr w:type="gramEnd"/>
-      <w:r>
-        <w:t>)</w:t>
+        <w:t>Moeilijkere configuratie (EU regels, RF matching zelf instellen,…)</w:t>
       </w:r>
     </w:p>
     <w:p>
@@ -8676,13 +8547,8 @@
           <w:numId w:val="75"/>
         </w:numPr>
       </w:pPr>
-      <w:proofErr w:type="gramStart"/>
-      <w:r>
-        <w:t>met</w:t>
-      </w:r>
-      <w:proofErr w:type="gramEnd"/>
-      <w:r>
-        <w:t xml:space="preserve"> STM32WLE5CCU6</w:t>
+      <w:r>
+        <w:t>met STM32WLE5CCU6</w:t>
       </w:r>
     </w:p>
     <w:p>
@@ -8693,14 +8559,12 @@
           <w:numId w:val="75"/>
         </w:numPr>
       </w:pPr>
-      <w:proofErr w:type="gramStart"/>
       <w:r>
         <w:t>UART</w:t>
       </w:r>
       <w:r>
         <w:t xml:space="preserve"> interface</w:t>
       </w:r>
-      <w:proofErr w:type="gramEnd"/>
     </w:p>
     <w:p>
       <w:pPr>
@@ -8714,15 +8578,7 @@
         <w:t>SPI mogelijk?? “</w:t>
       </w:r>
       <w:r>
-        <w:t xml:space="preserve">SPI voor communicatie met </w:t>
-      </w:r>
-      <w:proofErr w:type="gramStart"/>
-      <w:r>
-        <w:t>RF subsysteem</w:t>
-      </w:r>
-      <w:proofErr w:type="gramEnd"/>
-      <w:r>
-        <w:t xml:space="preserve"> van </w:t>
+        <w:t xml:space="preserve">SPI voor communicatie met RF subsysteem van </w:t>
       </w:r>
       <w:r>
         <w:t>STM32WLE5CCU6</w:t>
@@ -8977,21 +8833,7 @@
             <w:rStyle w:val="Hyperlink"/>
             <w:lang w:val="en-US"/>
           </w:rPr>
-          <w:t>https://www.digikey.be/nl/prod</w:t>
-        </w:r>
-        <w:r>
-          <w:rPr>
-            <w:rStyle w:val="Hyperlink"/>
-            <w:lang w:val="en-US"/>
-          </w:rPr>
-          <w:t>u</w:t>
-        </w:r>
-        <w:r>
-          <w:rPr>
-            <w:rStyle w:val="Hyperlink"/>
-            <w:lang w:val="en-US"/>
-          </w:rPr>
-          <w:t>cts/detail/rakwireless-technology-limited/RAK11720-8-SM-NI/26861635</w:t>
+          <w:t>https://www.digikey.be/nl/products/detail/rakwireless-technology-limited/RAK11720-8-SM-NI/26861635</w:t>
         </w:r>
       </w:hyperlink>
     </w:p>
@@ -9298,13 +9140,8 @@
       <w:r>
         <w:t xml:space="preserve">, </w:t>
       </w:r>
-      <w:proofErr w:type="gramStart"/>
-      <w:r>
-        <w:t>RF ervaring</w:t>
-      </w:r>
-      <w:proofErr w:type="gramEnd"/>
-      <w:r>
-        <w:t xml:space="preserve"> nodig</w:t>
+      <w:r>
+        <w:t>RF ervaring nodig</w:t>
       </w:r>
     </w:p>
     <w:p>
@@ -9315,7 +9152,6 @@
           <w:numId w:val="75"/>
         </w:numPr>
       </w:pPr>
-      <w:proofErr w:type="gramStart"/>
       <w:r>
         <w:rPr>
           <w:b/>
@@ -9330,7 +9166,6 @@
         </w:rPr>
         <w:t xml:space="preserve"> antenne</w:t>
       </w:r>
-      <w:proofErr w:type="gramEnd"/>
       <w:r>
         <w:t>:</w:t>
       </w:r>
@@ -9397,21 +9232,8 @@
     </w:p>
     <w:p/>
     <w:p>
-      <w:proofErr w:type="gramStart"/>
-      <w:r>
-        <w:t>FPC antenne</w:t>
-      </w:r>
-      <w:proofErr w:type="gramEnd"/>
-      <w:r>
-        <w:t xml:space="preserve"> voor prototype, eventueel </w:t>
-      </w:r>
-      <w:proofErr w:type="gramStart"/>
-      <w:r>
-        <w:t>PCB antenne</w:t>
-      </w:r>
-      <w:proofErr w:type="gramEnd"/>
-      <w:r>
-        <w:t xml:space="preserve"> later?</w:t>
+      <w:r>
+        <w:t>FPC antenne voor prototype, eventueel PCB antenne later?</w:t>
       </w:r>
     </w:p>
     <w:p/>
@@ -9636,18 +9458,10 @@
         <w:t>8.6 cm</w:t>
       </w:r>
       <w:r>
-        <w:t xml:space="preserve">: ~ 73 </w:t>
-      </w:r>
-      <w:proofErr w:type="gramStart"/>
-      <w:r>
-        <w:t xml:space="preserve">Ω </w:t>
-      </w:r>
-      <w:r>
-        <w:t>,</w:t>
-      </w:r>
-      <w:proofErr w:type="gramEnd"/>
-      <w:r>
-        <w:t xml:space="preserve"> </w:t>
+        <w:t xml:space="preserve">: ~ 73 Ω </w:t>
+      </w:r>
+      <w:r>
+        <w:t xml:space="preserve">, </w:t>
       </w:r>
       <w:r>
         <w:t>VSWR</w:t>
@@ -10254,27 +10068,13 @@
         <w:rPr>
           <w:lang w:val="nl-NL"/>
         </w:rPr>
-        <w:t xml:space="preserve">a. </w:t>
-      </w:r>
-      <w:proofErr w:type="gramStart"/>
+        <w:t>a. FPC ante</w:t>
+      </w:r>
       <w:r>
         <w:rPr>
           <w:lang w:val="nl-NL"/>
         </w:rPr>
-        <w:t>FPC ante</w:t>
-      </w:r>
-      <w:r>
-        <w:rPr>
-          <w:lang w:val="nl-NL"/>
-        </w:rPr>
-        <w:t>nne</w:t>
-      </w:r>
-      <w:proofErr w:type="gramEnd"/>
-      <w:r>
-        <w:rPr>
-          <w:lang w:val="nl-NL"/>
-        </w:rPr>
-        <w:t xml:space="preserve"> lijkt best.</w:t>
+        <w:t>nne lijkt best.</w:t>
       </w:r>
     </w:p>
     <w:p>
@@ -10543,21 +10343,7 @@
             <w:rStyle w:val="Hyperlink"/>
             <w:lang w:val="nl-NL"/>
           </w:rPr>
-          <w:t>AANI-FB-0086-0100W (100m</w:t>
-        </w:r>
-        <w:r>
-          <w:rPr>
-            <w:rStyle w:val="Hyperlink"/>
-            <w:lang w:val="nl-NL"/>
-          </w:rPr>
-          <w:t>m</w:t>
-        </w:r>
-        <w:r>
-          <w:rPr>
-            <w:rStyle w:val="Hyperlink"/>
-            <w:lang w:val="nl-NL"/>
-          </w:rPr>
-          <w:t>)</w:t>
+          <w:t>AANI-FB-0086-0100W (100mm)</w:t>
         </w:r>
       </w:hyperlink>
       <w:r>
@@ -10990,30 +10776,8 @@
         <w:rPr>
           <w:lang w:val="en-US"/>
         </w:rPr>
-        <w:t xml:space="preserve">: </w:t>
-      </w:r>
-      <w:proofErr w:type="spellStart"/>
-      <w:r>
-        <w:rPr>
-          <w:lang w:val="en-US"/>
-        </w:rPr>
-        <w:t>meer</w:t>
-      </w:r>
-      <w:proofErr w:type="spellEnd"/>
-      <w:r>
-        <w:rPr>
-          <w:lang w:val="en-US"/>
-        </w:rPr>
-        <w:t xml:space="preserve"> </w:t>
-      </w:r>
-      <w:proofErr w:type="spellStart"/>
-      <w:r>
-        <w:rPr>
-          <w:lang w:val="en-US"/>
-        </w:rPr>
-        <w:t>geavanceerd</w:t>
-      </w:r>
-      <w:proofErr w:type="spellEnd"/>
+        <w:t>: meer geavanceerd</w:t>
+      </w:r>
       <w:r>
         <w:rPr>
           <w:lang w:val="en-US"/>
@@ -11974,16 +11738,8 @@
           <w:rPr>
             <w:rStyle w:val="Hyperlink"/>
           </w:rPr>
-          <w:t xml:space="preserve">Goedkoopste modules op </w:t>
+          <w:t>Goedkoopste modules op mouser</w:t>
         </w:r>
-        <w:proofErr w:type="spellStart"/>
-        <w:r>
-          <w:rPr>
-            <w:rStyle w:val="Hyperlink"/>
-          </w:rPr>
-          <w:t>mouser</w:t>
-        </w:r>
-        <w:proofErr w:type="spellEnd"/>
       </w:hyperlink>
     </w:p>
     <w:p/>
@@ -12013,19 +11769,7 @@
           <w:rPr>
             <w:rStyle w:val="Hyperlink"/>
           </w:rPr>
-          <w:t>M</w:t>
-        </w:r>
-        <w:r>
-          <w:rPr>
-            <w:rStyle w:val="Hyperlink"/>
-          </w:rPr>
-          <w:t>o</w:t>
-        </w:r>
-        <w:r>
-          <w:rPr>
-            <w:rStyle w:val="Hyperlink"/>
-          </w:rPr>
-          <w:t>user</w:t>
+          <w:t>Mouser</w:t>
         </w:r>
       </w:hyperlink>
       <w:r>
@@ -12050,38 +11794,12 @@
         </w:numPr>
       </w:pPr>
       <w:hyperlink r:id="rId75" w:history="1">
-        <w:proofErr w:type="spellStart"/>
         <w:r>
           <w:rPr>
             <w:rStyle w:val="Hyperlink"/>
           </w:rPr>
-          <w:t>Di</w:t>
+          <w:t>Digikey</w:t>
         </w:r>
-        <w:r>
-          <w:rPr>
-            <w:rStyle w:val="Hyperlink"/>
-          </w:rPr>
-          <w:t>g</w:t>
-        </w:r>
-        <w:r>
-          <w:rPr>
-            <w:rStyle w:val="Hyperlink"/>
-          </w:rPr>
-          <w:t>i</w:t>
-        </w:r>
-        <w:r>
-          <w:rPr>
-            <w:rStyle w:val="Hyperlink"/>
-          </w:rPr>
-          <w:t>k</w:t>
-        </w:r>
-        <w:r>
-          <w:rPr>
-            <w:rStyle w:val="Hyperlink"/>
-          </w:rPr>
-          <w:t>ey</w:t>
-        </w:r>
-        <w:proofErr w:type="spellEnd"/>
       </w:hyperlink>
       <w:r>
         <w:t>: €5.84 (€5.2 per 1000)</w:t>
@@ -12174,16 +11892,8 @@
         <w:rPr>
           <w:rStyle w:val="Hyperlink"/>
         </w:rPr>
-        <w:t xml:space="preserve">Goedkoopste modules op </w:t>
-      </w:r>
-      <w:proofErr w:type="spellStart"/>
-      <w:r>
-        <w:rPr>
-          <w:rStyle w:val="Hyperlink"/>
-        </w:rPr>
-        <w:t>Mouser</w:t>
-      </w:r>
-      <w:proofErr w:type="spellEnd"/>
+        <w:t>Goedkoopste modules op Mouser</w:t>
+      </w:r>
     </w:p>
     <w:p>
       <w:r>
@@ -12813,15 +12523,7 @@
     </w:p>
     <w:p>
       <w:r>
-        <w:t>U-</w:t>
-      </w:r>
-      <w:proofErr w:type="spellStart"/>
-      <w:r>
-        <w:t>blox</w:t>
-      </w:r>
-      <w:proofErr w:type="spellEnd"/>
-      <w:r>
-        <w:t xml:space="preserve"> </w:t>
+        <w:t xml:space="preserve">U-blox </w:t>
       </w:r>
       <w:hyperlink r:id="rId91" w:history="1">
         <w:r>
@@ -12834,46 +12536,21 @@
     </w:p>
     <w:p>
       <w:r>
-        <w:t xml:space="preserve">Of </w:t>
-      </w:r>
-      <w:proofErr w:type="spellStart"/>
-      <w:r>
-        <w:t>Quectel</w:t>
-      </w:r>
-      <w:proofErr w:type="spellEnd"/>
-      <w:r>
-        <w:t xml:space="preserve"> </w:t>
+        <w:t xml:space="preserve">Of Quectel </w:t>
       </w:r>
       <w:hyperlink r:id="rId92" w:tgtFrame="_blank" w:history="1">
         <w:r>
           <w:rPr>
             <w:rStyle w:val="Hyperlink"/>
           </w:rPr>
-          <w:t>LC76G</w:t>
-        </w:r>
-        <w:r>
-          <w:rPr>
-            <w:rStyle w:val="Hyperlink"/>
-          </w:rPr>
-          <w:t>P</w:t>
-        </w:r>
-        <w:r>
-          <w:rPr>
-            <w:rStyle w:val="Hyperlink"/>
-          </w:rPr>
-          <w:t>AMD</w:t>
+          <w:t>LC76GPAMD</w:t>
         </w:r>
       </w:hyperlink>
     </w:p>
     <w:p/>
     <w:p>
-      <w:proofErr w:type="spellStart"/>
-      <w:r>
-        <w:t>Quectel</w:t>
-      </w:r>
-      <w:proofErr w:type="spellEnd"/>
-      <w:r>
-        <w:t xml:space="preserve"> </w:t>
+      <w:r>
+        <w:t xml:space="preserve">Quectel </w:t>
       </w:r>
       <w:hyperlink r:id="rId93" w:tgtFrame="_blank" w:history="1">
         <w:r>
@@ -12889,15 +12566,7 @@
     </w:p>
     <w:p>
       <w:r>
-        <w:t>U-</w:t>
-      </w:r>
-      <w:proofErr w:type="spellStart"/>
-      <w:r>
-        <w:t>blox</w:t>
-      </w:r>
-      <w:proofErr w:type="spellEnd"/>
-      <w:r>
-        <w:t xml:space="preserve"> </w:t>
+        <w:t xml:space="preserve">U-blox </w:t>
       </w:r>
       <w:hyperlink r:id="rId94" w:history="1">
         <w:r>
@@ -12915,13 +12584,8 @@
       </w:r>
       <w:r>
         <w:noBreakHyphen/>
-        <w:t xml:space="preserve">center, </w:t>
-      </w:r>
-      <w:proofErr w:type="spellStart"/>
-      <w:r>
-        <w:t>AssistNow</w:t>
-      </w:r>
-      <w:proofErr w:type="spellEnd"/>
+        <w:t>center, AssistNow</w:t>
+      </w:r>
       <w:r>
         <w:t>, veel voorbeeldontwerpen) en is beter voor kleine/slechte antennes, (</w:t>
       </w:r>
@@ -12929,15 +12593,7 @@
         <w:t>SAW+LNA</w:t>
       </w:r>
       <w:r>
-        <w:t xml:space="preserve"> &amp; </w:t>
-      </w:r>
-      <w:proofErr w:type="spellStart"/>
-      <w:r>
-        <w:t>Super-S</w:t>
-      </w:r>
-      <w:proofErr w:type="spellEnd"/>
-      <w:r>
-        <w:t xml:space="preserve"> technologie). Stroomverbruik is ook al klein.</w:t>
+        <w:t xml:space="preserve"> &amp; Super-S technologie). Stroomverbruik is ook al klein.</w:t>
       </w:r>
     </w:p>
     <w:p/>
@@ -12957,13 +12613,8 @@
           <w:lang w:val="en-US"/>
         </w:rPr>
       </w:pPr>
-      <w:proofErr w:type="spellStart"/>
-      <w:r>
-        <w:t>Quectel</w:t>
-      </w:r>
-      <w:proofErr w:type="spellEnd"/>
-      <w:r>
-        <w:t xml:space="preserve"> </w:t>
+      <w:r>
+        <w:t xml:space="preserve">Quectel </w:t>
       </w:r>
       <w:hyperlink r:id="rId95" w:tgtFrame="_blank" w:history="1">
         <w:r>
@@ -12984,16 +12635,6 @@
     <w:p>
       <w:pPr>
         <w:spacing w:after="160"/>
-        <w:rPr>
-          <w:rFonts w:asciiTheme="majorHAnsi" w:eastAsiaTheme="majorEastAsia" w:hAnsiTheme="majorHAnsi" w:cstheme="majorBidi"/>
-          <w:b/>
-          <w:bCs/>
-          <w:smallCaps/>
-          <w:color w:val="7030A0"/>
-          <w:sz w:val="36"/>
-          <w:szCs w:val="36"/>
-          <w:lang w:val="en-US"/>
-        </w:rPr>
       </w:pPr>
       <w:r>
         <w:br w:type="page"/>
@@ -13003,9 +12644,24 @@
       <w:pPr>
         <w:pStyle w:val="Heading1"/>
       </w:pPr>
+      <w:r>
+        <w:lastRenderedPageBreak/>
+        <w:t>GPS antenne</w:t>
+      </w:r>
+    </w:p>
+    <w:p>
+      <w:pPr>
+        <w:rPr>
+          <w:lang w:val="en-US"/>
+        </w:rPr>
+      </w:pPr>
+    </w:p>
+    <w:p>
+      <w:pPr>
+        <w:pStyle w:val="Heading1"/>
+      </w:pPr>
       <w:bookmarkStart w:id="36" w:name="_Toc223965562"/>
       <w:r>
-        <w:lastRenderedPageBreak/>
         <w:t>E-ink display</w:t>
       </w:r>
       <w:bookmarkEnd w:id="36"/>
@@ -13016,12 +12672,10 @@
         <w:spacing w:before="0"/>
       </w:pPr>
       <w:bookmarkStart w:id="37" w:name="_Toc223965563"/>
-      <w:proofErr w:type="spellStart"/>
       <w:r>
         <w:t>Vereisten</w:t>
       </w:r>
       <w:bookmarkEnd w:id="37"/>
-      <w:proofErr w:type="spellEnd"/>
     </w:p>
     <w:p>
       <w:pPr>
@@ -13038,16 +12692,8 @@
         <w:rPr>
           <w:lang w:val="en-US"/>
         </w:rPr>
-        <w:t xml:space="preserve">Zwart-wit, </w:t>
-      </w:r>
-      <w:proofErr w:type="spellStart"/>
-      <w:r>
-        <w:rPr>
-          <w:lang w:val="en-US"/>
-        </w:rPr>
-        <w:t>hoog</w:t>
-      </w:r>
-      <w:proofErr w:type="spellEnd"/>
+        <w:t>Zwart-wit, hoog</w:t>
+      </w:r>
       <w:r>
         <w:t xml:space="preserve"> contrast</w:t>
       </w:r>
@@ -13063,42 +12709,12 @@
           <w:lang w:val="en-US"/>
         </w:rPr>
       </w:pPr>
-      <w:proofErr w:type="spellStart"/>
-      <w:r>
-        <w:rPr>
-          <w:lang w:val="en-US"/>
-        </w:rPr>
-        <w:t>Grootte</w:t>
-      </w:r>
-      <w:proofErr w:type="spellEnd"/>
-      <w:r>
-        <w:rPr>
-          <w:lang w:val="en-US"/>
-        </w:rPr>
-        <w:t xml:space="preserve"> </w:t>
-      </w:r>
-      <w:proofErr w:type="spellStart"/>
-      <w:r>
-        <w:rPr>
-          <w:lang w:val="en-US"/>
-        </w:rPr>
-        <w:t>en</w:t>
-      </w:r>
-      <w:proofErr w:type="spellEnd"/>
-      <w:r>
-        <w:rPr>
-          <w:lang w:val="en-US"/>
-        </w:rPr>
-        <w:t xml:space="preserve"> </w:t>
-      </w:r>
-      <w:proofErr w:type="spellStart"/>
-      <w:r>
-        <w:rPr>
-          <w:lang w:val="en-US"/>
-        </w:rPr>
-        <w:t>resolutie</w:t>
-      </w:r>
-      <w:proofErr w:type="spellEnd"/>
+      <w:r>
+        <w:rPr>
+          <w:lang w:val="en-US"/>
+        </w:rPr>
+        <w:t>Grootte en resolutie</w:t>
+      </w:r>
     </w:p>
     <w:p>
       <w:pPr>
@@ -13115,16 +12731,8 @@
         <w:rPr>
           <w:lang w:val="en-US"/>
         </w:rPr>
-        <w:t xml:space="preserve">Klein, </w:t>
-      </w:r>
-      <w:proofErr w:type="spellStart"/>
-      <w:r>
-        <w:rPr>
-          <w:lang w:val="en-US"/>
-        </w:rPr>
-        <w:t>vierkant</w:t>
-      </w:r>
-      <w:proofErr w:type="spellEnd"/>
+        <w:t>Klein, vierkant</w:t>
+      </w:r>
       <w:r>
         <w:rPr>
           <w:lang w:val="en-US"/>
@@ -13177,13 +12785,8 @@
         <w:t>1.54″ 200×200</w:t>
       </w:r>
       <w:r>
-        <w:t xml:space="preserve"> wordt veel gebruikt voor </w:t>
-      </w:r>
-      <w:proofErr w:type="gramStart"/>
-      <w:r>
-        <w:t>QR codes</w:t>
-      </w:r>
-      <w:proofErr w:type="gramEnd"/>
+        <w:t xml:space="preserve"> wordt veel gebruikt voor QR codes</w:t>
+      </w:r>
     </w:p>
     <w:p>
       <w:pPr>
@@ -13193,24 +12796,11 @@
           <w:numId w:val="66"/>
         </w:numPr>
       </w:pPr>
-      <w:proofErr w:type="gramStart"/>
-      <w:r>
-        <w:t>QR code</w:t>
-      </w:r>
-      <w:proofErr w:type="gramEnd"/>
-      <w:r>
-        <w:t xml:space="preserve"> versie? (</w:t>
-      </w:r>
-      <w:proofErr w:type="gramStart"/>
-      <w:r>
-        <w:t>z</w:t>
-      </w:r>
-      <w:r>
-        <w:t>ie</w:t>
-      </w:r>
-      <w:proofErr w:type="gramEnd"/>
-      <w:r>
-        <w:t xml:space="preserve"> </w:t>
+      <w:r>
+        <w:t>QR code versie? (z</w:t>
+      </w:r>
+      <w:r>
+        <w:t xml:space="preserve">ie </w:t>
       </w:r>
       <w:hyperlink r:id="rId96" w:history="1">
         <w:r>
@@ -13302,31 +12892,14 @@
           <w:b/>
           <w:bCs/>
         </w:rPr>
-        <w:t xml:space="preserve">Berekening grootst mogelijke </w:t>
-      </w:r>
-      <w:proofErr w:type="gramStart"/>
-      <w:r>
-        <w:rPr>
-          <w:b/>
-          <w:bCs/>
-        </w:rPr>
-        <w:t>QR code</w:t>
-      </w:r>
-      <w:proofErr w:type="gramEnd"/>
+        <w:t>Berekening grootst mogelijke QR code</w:t>
+      </w:r>
       <w:r>
         <w:t>:</w:t>
       </w:r>
       <w:r>
         <w:br/>
-        <w:t xml:space="preserve">De kleinste scanbare </w:t>
-      </w:r>
-      <w:proofErr w:type="gramStart"/>
-      <w:r>
-        <w:t>QR code</w:t>
-      </w:r>
-      <w:proofErr w:type="gramEnd"/>
-      <w:r>
-        <w:t xml:space="preserve"> is 1x1cm 38x38 pixel -&gt; 0.263mm per pixel</w:t>
+        <w:t>De kleinste scanbare QR code is 1x1cm 38x38 pixel -&gt; 0.263mm per pixel</w:t>
       </w:r>
       <w:r>
         <w:br/>
@@ -13334,27 +12907,11 @@
       </w:r>
       <w:r>
         <w:br/>
-        <w:t xml:space="preserve">kleinste mogelijke </w:t>
-      </w:r>
-      <w:proofErr w:type="gramStart"/>
-      <w:r>
-        <w:t>QR pixel</w:t>
-      </w:r>
-      <w:proofErr w:type="gramEnd"/>
-      <w:r>
-        <w:t xml:space="preserve"> is 2x2 pixels op het scherm (0.27x0.27mm)</w:t>
+        <w:t>kleinste mogelijke QR pixel is 2x2 pixels op het scherm (0.27x0.27mm)</w:t>
       </w:r>
       <w:r>
         <w:br/>
-        <w:t xml:space="preserve">dus grootste </w:t>
-      </w:r>
-      <w:proofErr w:type="gramStart"/>
-      <w:r>
-        <w:t>QR code</w:t>
-      </w:r>
-      <w:proofErr w:type="gramEnd"/>
-      <w:r>
-        <w:t xml:space="preserve"> is 97x97 (versie 20) </w:t>
+        <w:t xml:space="preserve">dus grootste QR code is 97x97 (versie 20) </w:t>
       </w:r>
       <w:r>
         <w:br/>
@@ -13479,13 +13036,8 @@
       <w:r>
         <w:t xml:space="preserve">is </w:t>
       </w:r>
-      <w:proofErr w:type="spellStart"/>
-      <w:r>
-        <w:t>efficienter</w:t>
-      </w:r>
-      <w:proofErr w:type="spellEnd"/>
-      <w:r>
-        <w:t xml:space="preserve"> op lage s</w:t>
+      <w:r>
+        <w:t>efficienter op lage s</w:t>
       </w:r>
       <w:r>
         <w:t>nelheden</w:t>
@@ -13503,18 +13055,10 @@
         <w:t xml:space="preserve">De meeste </w:t>
       </w:r>
       <w:r>
-        <w:t>E-</w:t>
-      </w:r>
-      <w:proofErr w:type="spellStart"/>
-      <w:r>
-        <w:t>ink</w:t>
-      </w:r>
-      <w:r>
-        <w:t>s</w:t>
-      </w:r>
-      <w:proofErr w:type="spellEnd"/>
-      <w:r>
-        <w:t xml:space="preserve"> zijn SPI</w:t>
+        <w:t>E-ink</w:t>
+      </w:r>
+      <w:r>
+        <w:t>s zijn SPI</w:t>
       </w:r>
     </w:p>
     <w:p>
@@ -13543,41 +13087,20 @@
           <w:lang w:val="en-US"/>
         </w:rPr>
       </w:pPr>
-      <w:proofErr w:type="spellStart"/>
-      <w:r>
-        <w:rPr>
-          <w:lang w:val="en-US"/>
-        </w:rPr>
-        <w:t>geen</w:t>
-      </w:r>
-      <w:proofErr w:type="spellEnd"/>
-      <w:r>
-        <w:rPr>
-          <w:lang w:val="en-US"/>
-        </w:rPr>
-        <w:t xml:space="preserve"> partial refresh of fast update </w:t>
-      </w:r>
-      <w:proofErr w:type="spellStart"/>
-      <w:r>
-        <w:rPr>
-          <w:lang w:val="en-US"/>
-        </w:rPr>
-        <w:t>nodig</w:t>
-      </w:r>
-      <w:proofErr w:type="spellEnd"/>
+      <w:r>
+        <w:rPr>
+          <w:lang w:val="en-US"/>
+        </w:rPr>
+        <w:t>geen partial refresh of fast update nodig</w:t>
+      </w:r>
     </w:p>
     <w:p>
       <w:pPr>
         <w:pStyle w:val="Heading2"/>
       </w:pPr>
       <w:bookmarkStart w:id="38" w:name="_Toc223965564"/>
-      <w:proofErr w:type="spellStart"/>
-      <w:r>
-        <w:t>Paneel</w:t>
-      </w:r>
-      <w:proofErr w:type="spellEnd"/>
-      <w:r>
-        <w:t xml:space="preserve"> </w:t>
+      <w:r>
+        <w:t xml:space="preserve">Paneel </w:t>
       </w:r>
       <w:r>
         <w:t>of module?</w:t>
@@ -13593,7 +13116,6 @@
         </w:rPr>
       </w:pPr>
       <w:bookmarkStart w:id="39" w:name="_Toc223965565"/>
-      <w:proofErr w:type="spellStart"/>
       <w:r>
         <w:rPr>
           <w:lang w:val="en-US"/>
@@ -13601,7 +13123,6 @@
         <w:t>Paneel</w:t>
       </w:r>
       <w:bookmarkEnd w:id="39"/>
-      <w:proofErr w:type="spellEnd"/>
     </w:p>
     <w:p>
       <w:pPr>
@@ -13618,21 +13139,7 @@
         <w:rPr>
           <w:lang w:val="en-US"/>
         </w:rPr>
-        <w:t xml:space="preserve">SPI via </w:t>
-      </w:r>
-      <w:proofErr w:type="spellStart"/>
-      <w:r>
-        <w:rPr>
-          <w:lang w:val="en-US"/>
-        </w:rPr>
-        <w:t>korte</w:t>
-      </w:r>
-      <w:proofErr w:type="spellEnd"/>
-      <w:r>
-        <w:rPr>
-          <w:lang w:val="en-US"/>
-        </w:rPr>
-        <w:t xml:space="preserve"> </w:t>
+        <w:t xml:space="preserve">SPI via korte </w:t>
       </w:r>
       <w:r>
         <w:rPr>
@@ -13647,33 +13154,11 @@
         <w:noBreakHyphen/>
         <w:t xml:space="preserve">flex (FPC) </w:t>
       </w:r>
-      <w:proofErr w:type="spellStart"/>
-      <w:r>
-        <w:rPr>
-          <w:lang w:val="en-US"/>
-        </w:rPr>
-        <w:t>kabel</w:t>
-      </w:r>
-      <w:proofErr w:type="spellEnd"/>
-      <w:r>
-        <w:rPr>
-          <w:lang w:val="en-US"/>
-        </w:rPr>
-        <w:t xml:space="preserve"> </w:t>
-      </w:r>
-      <w:proofErr w:type="gramStart"/>
-      <w:r>
-        <w:rPr>
-          <w:lang w:val="en-US"/>
-        </w:rPr>
-        <w:t>( 0</w:t>
-      </w:r>
-      <w:proofErr w:type="gramEnd"/>
-      <w:r>
-        <w:rPr>
-          <w:lang w:val="en-US"/>
-        </w:rPr>
-        <w:t xml:space="preserve">.5mm pitch, </w:t>
+      <w:r>
+        <w:rPr>
+          <w:lang w:val="en-US"/>
+        </w:rPr>
+        <w:t xml:space="preserve">kabel ( 0.5mm pitch, </w:t>
       </w:r>
       <w:r>
         <w:rPr>
@@ -13709,30 +13194,8 @@
         <w:rPr>
           <w:lang w:val="en-US"/>
         </w:rPr>
-        <w:t xml:space="preserve">Kan </w:t>
-      </w:r>
-      <w:proofErr w:type="spellStart"/>
-      <w:r>
-        <w:rPr>
-          <w:lang w:val="en-US"/>
-        </w:rPr>
-        <w:t>verlengd</w:t>
-      </w:r>
-      <w:proofErr w:type="spellEnd"/>
-      <w:r>
-        <w:rPr>
-          <w:lang w:val="en-US"/>
-        </w:rPr>
-        <w:t xml:space="preserve"> </w:t>
-      </w:r>
-      <w:proofErr w:type="spellStart"/>
-      <w:r>
-        <w:rPr>
-          <w:lang w:val="en-US"/>
-        </w:rPr>
-        <w:t>worden</w:t>
-      </w:r>
-      <w:proofErr w:type="spellEnd"/>
+        <w:t>Kan verlengd worden</w:t>
+      </w:r>
     </w:p>
     <w:p>
       <w:pPr>
@@ -13745,14 +13208,12 @@
           <w:lang w:val="en-US"/>
         </w:rPr>
       </w:pPr>
-      <w:proofErr w:type="spellStart"/>
       <w:r>
         <w:rPr>
           <w:lang w:val="en-US"/>
         </w:rPr>
         <w:t>Fragiel</w:t>
       </w:r>
-      <w:proofErr w:type="spellEnd"/>
     </w:p>
     <w:p>
       <w:pPr>
@@ -13765,14 +13226,12 @@
           <w:lang w:val="en-US"/>
         </w:rPr>
       </w:pPr>
-      <w:proofErr w:type="spellStart"/>
       <w:r>
         <w:rPr>
           <w:lang w:val="en-US"/>
         </w:rPr>
         <w:t>Goedkoper</w:t>
       </w:r>
-      <w:proofErr w:type="spellEnd"/>
     </w:p>
     <w:p>
       <w:pPr>
@@ -13798,18 +13257,10 @@
         <w:t>, AVDD/VSH</w:t>
       </w:r>
       <w:r>
-        <w:t xml:space="preserve">, </w:t>
-      </w:r>
-      <w:proofErr w:type="gramStart"/>
-      <w:r>
-        <w:t>VCOM</w:t>
-      </w:r>
-      <w:r>
-        <w:t>,…</w:t>
-      </w:r>
-      <w:proofErr w:type="gramEnd"/>
-      <w:r>
-        <w:t>)</w:t>
+        <w:t>, VCOM</w:t>
+      </w:r>
+      <w:r>
+        <w:t>,…)</w:t>
       </w:r>
     </w:p>
     <w:p>
@@ -13864,6 +13315,7 @@
         <w:rPr>
           <w:lang w:val="en-US"/>
         </w:rPr>
+        <w:lastRenderedPageBreak/>
         <w:t>Module</w:t>
       </w:r>
       <w:bookmarkEnd w:id="40"/>
@@ -13883,35 +13335,7 @@
         <w:rPr>
           <w:lang w:val="en-US"/>
         </w:rPr>
-        <w:t xml:space="preserve">Veel </w:t>
-      </w:r>
-      <w:proofErr w:type="spellStart"/>
-      <w:r>
-        <w:rPr>
-          <w:lang w:val="en-US"/>
-        </w:rPr>
-        <w:t>eenvoudiger</w:t>
-      </w:r>
-      <w:proofErr w:type="spellEnd"/>
-      <w:r>
-        <w:rPr>
-          <w:lang w:val="en-US"/>
-        </w:rPr>
-        <w:t xml:space="preserve"> </w:t>
-      </w:r>
-      <w:proofErr w:type="spellStart"/>
-      <w:r>
-        <w:rPr>
-          <w:lang w:val="en-US"/>
-        </w:rPr>
-        <w:t>voor</w:t>
-      </w:r>
-      <w:proofErr w:type="spellEnd"/>
-      <w:r>
-        <w:rPr>
-          <w:lang w:val="en-US"/>
-        </w:rPr>
-        <w:t xml:space="preserve"> prototype</w:t>
+        <w:t>Veel eenvoudiger voor prototype</w:t>
       </w:r>
     </w:p>
     <w:p>
@@ -13945,17 +13369,9 @@
         <w:rPr>
           <w:lang w:val="en-US"/>
         </w:rPr>
-        <w:t xml:space="preserve">Andere </w:t>
-      </w:r>
-      <w:proofErr w:type="spellStart"/>
-      <w:r>
-        <w:rPr>
-          <w:lang w:val="en-US"/>
-        </w:rPr>
-        <w:t>opties</w:t>
+        <w:t>Andere opties</w:t>
       </w:r>
       <w:bookmarkEnd w:id="41"/>
-      <w:proofErr w:type="spellEnd"/>
     </w:p>
     <w:p>
       <w:pPr>
@@ -14038,13 +13454,8 @@
           <w:numId w:val="66"/>
         </w:numPr>
       </w:pPr>
-      <w:proofErr w:type="spellStart"/>
-      <w:r>
-        <w:t>Orient</w:t>
-      </w:r>
-      <w:proofErr w:type="spellEnd"/>
-      <w:r>
-        <w:t xml:space="preserve"> Display </w:t>
+      <w:r>
+        <w:t xml:space="preserve">Orient Display </w:t>
       </w:r>
       <w:hyperlink r:id="rId101" w:history="1">
         <w:r>
@@ -14076,13 +13487,8 @@
         </w:numPr>
       </w:pPr>
       <w:r>
-        <w:t xml:space="preserve">Enige bij </w:t>
-      </w:r>
-      <w:proofErr w:type="spellStart"/>
-      <w:r>
-        <w:t>digikey</w:t>
-      </w:r>
-      <w:proofErr w:type="spellEnd"/>
+        <w:t>Enige bij digikey</w:t>
+      </w:r>
     </w:p>
     <w:p>
       <w:pPr>
@@ -14111,29 +13517,8 @@
         <w:t>1.54”</w:t>
       </w:r>
       <w:r>
-        <w:t xml:space="preserve"> E-</w:t>
-      </w:r>
-      <w:proofErr w:type="spellStart"/>
-      <w:r>
-        <w:t>inks</w:t>
-      </w:r>
-      <w:proofErr w:type="spellEnd"/>
-      <w:r>
-        <w:t xml:space="preserve"> bij </w:t>
-      </w:r>
-      <w:proofErr w:type="spellStart"/>
-      <w:r>
-        <w:t>Mouser</w:t>
-      </w:r>
-      <w:proofErr w:type="spellEnd"/>
-      <w:r>
-        <w:t xml:space="preserve"> of </w:t>
-      </w:r>
-      <w:proofErr w:type="spellStart"/>
-      <w:r>
-        <w:t>Farnell</w:t>
-      </w:r>
-      <w:proofErr w:type="spellEnd"/>
+        <w:t xml:space="preserve"> E-inks bij Mouser of Farnell</w:t>
+      </w:r>
     </w:p>
     <w:p>
       <w:pPr>
@@ -14144,19 +13529,11 @@
         </w:numPr>
       </w:pPr>
       <w:hyperlink r:id="rId102" w:history="1">
-        <w:proofErr w:type="spellStart"/>
         <w:r>
           <w:rPr>
             <w:rStyle w:val="Hyperlink"/>
           </w:rPr>
-          <w:t>Good</w:t>
-        </w:r>
-        <w:proofErr w:type="spellEnd"/>
-        <w:r>
-          <w:rPr>
-            <w:rStyle w:val="Hyperlink"/>
-          </w:rPr>
-          <w:t xml:space="preserve"> Display</w:t>
+          <w:t>Good Display</w:t>
         </w:r>
       </w:hyperlink>
       <w:r>
@@ -14179,29 +13556,8 @@
           <w:numId w:val="66"/>
         </w:numPr>
       </w:pPr>
-      <w:proofErr w:type="spellStart"/>
-      <w:r>
-        <w:t>GoodDisplay</w:t>
-      </w:r>
-      <w:proofErr w:type="spellEnd"/>
-      <w:r>
-        <w:t xml:space="preserve"> heeft ook paneel dat met lagere </w:t>
-      </w:r>
-      <w:proofErr w:type="spellStart"/>
-      <w:r>
-        <w:t>temparetuur</w:t>
-      </w:r>
-      <w:proofErr w:type="spellEnd"/>
-      <w:r>
-        <w:t xml:space="preserve"> werkt (-25-50°C </w:t>
-      </w:r>
-      <w:proofErr w:type="spellStart"/>
-      <w:r>
-        <w:t>ipv</w:t>
-      </w:r>
-      <w:proofErr w:type="spellEnd"/>
-      <w:r>
-        <w:t>. 0-50°C), maar die is niet geschikt voor in de zon.</w:t>
+      <w:r>
+        <w:t>GoodDisplay heeft ook paneel dat met lagere temparetuur werkt (-25-50°C ipv. 0-50°C), maar die is niet geschikt voor in de zon.</w:t>
       </w:r>
     </w:p>
     <w:p>
@@ -14276,19 +13632,11 @@
           <w:lang w:val="en-US"/>
         </w:rPr>
       </w:pPr>
-      <w:proofErr w:type="spellStart"/>
-      <w:r>
-        <w:rPr>
-          <w:lang w:val="en-US"/>
-        </w:rPr>
-        <w:t>Elecrow</w:t>
-      </w:r>
-      <w:proofErr w:type="spellEnd"/>
-      <w:r>
-        <w:rPr>
-          <w:lang w:val="en-US"/>
-        </w:rPr>
-        <w:t xml:space="preserve">: </w:t>
+      <w:r>
+        <w:rPr>
+          <w:lang w:val="en-US"/>
+        </w:rPr>
+        <w:t xml:space="preserve">Elecrow: </w:t>
       </w:r>
       <w:hyperlink r:id="rId106" w:history="1">
         <w:r>
@@ -14296,17 +13644,8 @@
             <w:rStyle w:val="Hyperlink"/>
             <w:lang w:val="en-US"/>
           </w:rPr>
-          <w:t xml:space="preserve">1.54” 152x152 </w:t>
+          <w:t>1.54” 152x152 paneel</w:t>
         </w:r>
-        <w:proofErr w:type="spellStart"/>
-        <w:r>
-          <w:rPr>
-            <w:rStyle w:val="Hyperlink"/>
-            <w:lang w:val="en-US"/>
-          </w:rPr>
-          <w:t>paneel</w:t>
-        </w:r>
-        <w:proofErr w:type="spellEnd"/>
       </w:hyperlink>
       <w:r>
         <w:rPr>
@@ -14368,19 +13707,11 @@
           <w:lang w:val="en-BE"/>
         </w:rPr>
       </w:pPr>
-      <w:proofErr w:type="spellStart"/>
-      <w:r>
-        <w:rPr>
-          <w:lang w:val="en-US"/>
-        </w:rPr>
-        <w:t>Waveshare</w:t>
-      </w:r>
-      <w:proofErr w:type="spellEnd"/>
-      <w:r>
-        <w:rPr>
-          <w:lang w:val="en-US"/>
-        </w:rPr>
-        <w:t xml:space="preserve"> </w:t>
+      <w:r>
+        <w:rPr>
+          <w:lang w:val="en-US"/>
+        </w:rPr>
+        <w:t xml:space="preserve">Waveshare </w:t>
       </w:r>
       <w:hyperlink r:id="rId107" w:history="1">
         <w:r>
@@ -14410,39 +13741,17 @@
           <w:lang w:val="en-BE"/>
         </w:rPr>
       </w:pPr>
-      <w:proofErr w:type="spellStart"/>
-      <w:r>
-        <w:rPr>
-          <w:lang w:val="en-US"/>
-        </w:rPr>
-        <w:t>Aansluiting</w:t>
-      </w:r>
-      <w:proofErr w:type="spellEnd"/>
-      <w:r>
-        <w:rPr>
-          <w:lang w:val="en-US"/>
-        </w:rPr>
-        <w:t xml:space="preserve">: </w:t>
-      </w:r>
-      <w:r>
-        <w:rPr>
-          <w:lang w:val="en-US"/>
-        </w:rPr>
-        <w:t xml:space="preserve">8-pin JST PH 2.0mm SMT Header Horizontal </w:t>
-      </w:r>
-      <w:proofErr w:type="gramStart"/>
-      <w:r>
-        <w:rPr>
-          <w:lang w:val="en-US"/>
-        </w:rPr>
-        <w:t>Right Angle</w:t>
-      </w:r>
-      <w:proofErr w:type="gramEnd"/>
-      <w:r>
-        <w:rPr>
-          <w:lang w:val="en-US"/>
-        </w:rPr>
-        <w:t xml:space="preserve"> Side </w:t>
+      <w:r>
+        <w:rPr>
+          <w:lang w:val="en-US"/>
+        </w:rPr>
+        <w:t xml:space="preserve">Aansluiting: </w:t>
+      </w:r>
+      <w:r>
+        <w:rPr>
+          <w:lang w:val="en-US"/>
+        </w:rPr>
+        <w:t xml:space="preserve">8-pin JST PH 2.0mm SMT Header Horizontal Right Angle Side </w:t>
       </w:r>
       <w:r>
         <w:rPr>
@@ -14456,12 +13765,10 @@
         <w:pStyle w:val="Heading2"/>
       </w:pPr>
       <w:bookmarkStart w:id="43" w:name="_Toc223965569"/>
-      <w:proofErr w:type="spellStart"/>
       <w:r>
         <w:t>Keuze</w:t>
       </w:r>
       <w:bookmarkEnd w:id="43"/>
-      <w:proofErr w:type="spellEnd"/>
     </w:p>
     <w:p>
       <w:pPr>
@@ -14474,19 +13781,11 @@
           <w:lang w:val="en-BE"/>
         </w:rPr>
       </w:pPr>
-      <w:proofErr w:type="spellStart"/>
-      <w:r>
-        <w:rPr>
-          <w:lang w:val="en-US"/>
-        </w:rPr>
-        <w:t>Waveshare</w:t>
-      </w:r>
-      <w:proofErr w:type="spellEnd"/>
-      <w:r>
-        <w:rPr>
-          <w:lang w:val="en-US"/>
-        </w:rPr>
-        <w:t xml:space="preserve"> </w:t>
+      <w:r>
+        <w:rPr>
+          <w:lang w:val="en-US"/>
+        </w:rPr>
+        <w:t xml:space="preserve">Waveshare </w:t>
       </w:r>
       <w:hyperlink r:id="rId108" w:history="1">
         <w:r>
@@ -14532,14 +13831,9 @@
       </w:r>
     </w:p>
     <w:p>
-      <w:proofErr w:type="spellStart"/>
-      <w:r>
-        <w:t>A</w:t>
-      </w:r>
-      <w:r>
-        <w:t>ccelerometer</w:t>
-      </w:r>
-      <w:proofErr w:type="spellEnd"/>
+      <w:r>
+        <w:t>Accelerometer</w:t>
+      </w:r>
       <w:r>
         <w:t xml:space="preserve"> </w:t>
       </w:r>
@@ -14547,15 +13841,7 @@
         <w:t>kan gebruikt worden</w:t>
       </w:r>
       <w:r>
-        <w:t xml:space="preserve"> voor </w:t>
-      </w:r>
-      <w:proofErr w:type="spellStart"/>
-      <w:r>
-        <w:t>interrupts</w:t>
-      </w:r>
-      <w:proofErr w:type="spellEnd"/>
-      <w:r>
-        <w:t xml:space="preserve"> (wake up bij beweging)</w:t>
+        <w:t xml:space="preserve"> voor interrupts (wake up bij beweging)</w:t>
       </w:r>
       <w:r>
         <w:t>,</w:t>
@@ -14564,31 +13850,7 @@
         <w:t xml:space="preserve"> om te detecteren of de fiets gestolen wordt</w:t>
       </w:r>
       <w:r>
-        <w:t xml:space="preserve"> en evt. om </w:t>
-      </w:r>
-      <w:proofErr w:type="spellStart"/>
-      <w:r>
-        <w:t>LoRa</w:t>
-      </w:r>
-      <w:proofErr w:type="spellEnd"/>
-      <w:r>
-        <w:t xml:space="preserve"> en </w:t>
-      </w:r>
-      <w:proofErr w:type="gramStart"/>
-      <w:r>
-        <w:t>GPS update</w:t>
-      </w:r>
-      <w:proofErr w:type="gramEnd"/>
-      <w:r>
-        <w:t xml:space="preserve"> </w:t>
-      </w:r>
-      <w:proofErr w:type="spellStart"/>
-      <w:r>
-        <w:t>rate</w:t>
-      </w:r>
-      <w:proofErr w:type="spellEnd"/>
-      <w:r>
-        <w:t xml:space="preserve"> te bepalen</w:t>
+        <w:t xml:space="preserve"> en evt. om LoRa en GPS update rate te bepalen</w:t>
       </w:r>
       <w:r>
         <w:t>.</w:t>
@@ -14598,11 +13860,9 @@
       <w:pPr>
         <w:pStyle w:val="Heading2"/>
       </w:pPr>
-      <w:proofErr w:type="spellStart"/>
       <w:r>
         <w:t>Vereisten</w:t>
       </w:r>
-      <w:proofErr w:type="spellEnd"/>
     </w:p>
     <w:p>
       <w:pPr>
@@ -14631,18 +13891,7 @@
         </w:numPr>
       </w:pPr>
       <w:r>
-        <w:t xml:space="preserve">Output data </w:t>
-      </w:r>
-      <w:proofErr w:type="spellStart"/>
-      <w:r>
-        <w:t>rate</w:t>
-      </w:r>
-      <w:proofErr w:type="spellEnd"/>
-      <w:r>
-        <w:t xml:space="preserve"> (ODR)</w:t>
-      </w:r>
-      <w:r>
-        <w:t>: 10-50Hz is genoeg (lager = zu</w:t>
+        <w:t>Output data rate (ODR): 10-50Hz is genoeg (lager = zu</w:t>
       </w:r>
       <w:r>
         <w:t>iniger)</w:t>
@@ -14722,30 +13971,8 @@
         <w:rPr>
           <w:lang w:val="en-US"/>
         </w:rPr>
-        <w:t xml:space="preserve"> </w:t>
-      </w:r>
-      <w:proofErr w:type="spellStart"/>
-      <w:r>
-        <w:rPr>
-          <w:lang w:val="en-US"/>
-        </w:rPr>
-        <w:t>gebaseerd</w:t>
-      </w:r>
-      <w:proofErr w:type="spellEnd"/>
-      <w:r>
-        <w:rPr>
-          <w:lang w:val="en-US"/>
-        </w:rPr>
-        <w:t xml:space="preserve"> op </w:t>
-      </w:r>
-      <w:proofErr w:type="spellStart"/>
-      <w:r>
-        <w:rPr>
-          <w:lang w:val="en-US"/>
-        </w:rPr>
-        <w:t>beweging</w:t>
-      </w:r>
-      <w:proofErr w:type="spellEnd"/>
+        <w:t xml:space="preserve"> gebaseerd op beweging</w:t>
+      </w:r>
     </w:p>
     <w:p>
       <w:pPr>
@@ -14767,27 +13994,16 @@
       <w:pPr>
         <w:pStyle w:val="Heading2"/>
       </w:pPr>
-      <w:proofErr w:type="spellStart"/>
-      <w:r>
-        <w:lastRenderedPageBreak/>
+      <w:r>
         <w:t>Opties</w:t>
       </w:r>
-      <w:proofErr w:type="spellEnd"/>
     </w:p>
     <w:p>
       <w:r>
         <w:t>Moeilijk met hand te so</w:t>
       </w:r>
       <w:r>
-        <w:t xml:space="preserve">lderen -&gt; </w:t>
-      </w:r>
-      <w:proofErr w:type="spellStart"/>
-      <w:r>
-        <w:t>breakout</w:t>
-      </w:r>
-      <w:proofErr w:type="spellEnd"/>
-      <w:r>
-        <w:t xml:space="preserve"> voor prototype?</w:t>
+        <w:t>lderen -&gt; breakout voor prototype?</w:t>
       </w:r>
     </w:p>
     <w:p/>
@@ -14963,30 +14179,8 @@
         <w:rPr>
           <w:lang w:val="en-BE"/>
         </w:rPr>
-        <w:t xml:space="preserve">Zeer </w:t>
-      </w:r>
-      <w:proofErr w:type="spellStart"/>
-      <w:r>
-        <w:rPr>
-          <w:lang w:val="en-BE"/>
-        </w:rPr>
-        <w:t>laag</w:t>
-      </w:r>
-      <w:proofErr w:type="spellEnd"/>
-      <w:r>
-        <w:rPr>
-          <w:lang w:val="en-BE"/>
-        </w:rPr>
-        <w:t xml:space="preserve"> </w:t>
-      </w:r>
-      <w:proofErr w:type="spellStart"/>
-      <w:r>
-        <w:rPr>
-          <w:lang w:val="en-BE"/>
-        </w:rPr>
-        <w:t>verbruik</w:t>
-      </w:r>
-      <w:proofErr w:type="spellEnd"/>
+        <w:t>Zeer laag verbruik</w:t>
+      </w:r>
     </w:p>
     <w:p>
       <w:pPr>
@@ -15006,39 +14200,1679 @@
         <w:t>SPI</w:t>
       </w:r>
     </w:p>
-    <w:p>
-      <w:pPr>
+    <w:p/>
+    <w:p>
+      <w:pPr>
+        <w:pStyle w:val="Heading1"/>
+      </w:pPr>
+      <w:bookmarkStart w:id="45" w:name="_Toc223965571"/>
+      <w:r>
+        <w:t>SD-kaart</w:t>
+      </w:r>
+      <w:bookmarkEnd w:id="45"/>
+    </w:p>
+    <w:p>
+      <w:pPr>
+        <w:rPr>
+          <w:lang w:val="en-US"/>
+        </w:rPr>
+      </w:pPr>
+    </w:p>
+    <w:p>
+      <w:pPr>
+        <w:pStyle w:val="Heading1"/>
+      </w:pPr>
+      <w:r>
+        <w:t>ROM chip</w:t>
+      </w:r>
+    </w:p>
+    <w:p>
+      <w:pPr>
+        <w:rPr>
+          <w:lang w:val="en-US"/>
+        </w:rPr>
+      </w:pPr>
+    </w:p>
+    <w:p>
+      <w:pPr>
+        <w:pStyle w:val="Heading1"/>
+      </w:pPr>
+      <w:bookmarkStart w:id="46" w:name="_Toc223965572"/>
+      <w:r>
+        <w:t>Battery management system</w:t>
+      </w:r>
+      <w:bookmarkEnd w:id="46"/>
+    </w:p>
+    <w:p>
+      <w:pPr>
+        <w:pStyle w:val="Heading2"/>
+        <w:spacing w:before="0"/>
+      </w:pPr>
+      <w:r>
+        <w:t>Batterijen</w:t>
+      </w:r>
+    </w:p>
+    <w:p>
+      <w:r>
+        <w:t>Twee tot vier</w:t>
+      </w:r>
+      <w:r>
+        <w:t xml:space="preserve"> 18650 Li-ion batterijen in p</w:t>
+      </w:r>
+      <w:r>
+        <w:t>arallel</w:t>
+      </w:r>
+      <w:r>
+        <w:t>.</w:t>
+      </w:r>
+    </w:p>
+    <w:p>
+      <w:r>
+        <w:t xml:space="preserve">Het is aan te raden om batterijen van een bekend merk te gebruiken. </w:t>
+      </w:r>
+      <w:r>
+        <w:t xml:space="preserve">Slechte productiekwaliteit kan gevaarlijk zijn: </w:t>
+      </w:r>
+      <w:hyperlink r:id="rId110" w:history="1">
+        <w:r>
+          <w:rPr>
+            <w:rStyle w:val="Hyperlink"/>
+          </w:rPr>
+          <w:t>https://www.lumafield.com/battery-report#battery-quality-report</w:t>
+        </w:r>
+      </w:hyperlink>
+    </w:p>
+    <w:p>
+      <w:pPr>
+        <w:pStyle w:val="Heading2"/>
+      </w:pPr>
+      <w:r>
+        <w:t>Laadstroom</w:t>
+      </w:r>
+    </w:p>
+    <w:p>
+      <w:pPr>
+        <w:pStyle w:val="ListParagraph"/>
+        <w:ind w:left="0"/>
+      </w:pPr>
+      <w:r>
+        <w:t>A</w:t>
+      </w:r>
+      <w:r>
+        <w:t>fhankelijk van c</w:t>
+      </w:r>
+      <w:r>
+        <w:t>apaciteit</w:t>
+      </w:r>
+      <w:r>
+        <w:t xml:space="preserve"> en C-rating</w:t>
+      </w:r>
+      <w:r>
+        <w:t xml:space="preserve"> </w:t>
+      </w:r>
+    </w:p>
+    <w:p>
+      <w:pPr>
+        <w:pStyle w:val="ListParagraph"/>
+      </w:pPr>
+      <w:r>
+        <w:t xml:space="preserve">Bv. 1C -&gt; </w:t>
+      </w:r>
+      <w:r>
+        <w:t>1A voor 1000mAh</w:t>
+      </w:r>
+      <w:r>
+        <w:t xml:space="preserve"> (</w:t>
+      </w:r>
+      <w:r>
+        <w:t xml:space="preserve">opgeladen in </w:t>
+      </w:r>
+      <w:r>
+        <w:t>~</w:t>
+      </w:r>
+      <w:r>
+        <w:t>1u</w:t>
+      </w:r>
+      <w:r>
+        <w:t>) of 2A voor 2000mAh,…</w:t>
+      </w:r>
+    </w:p>
+    <w:p>
+      <w:pPr>
+        <w:pStyle w:val="ListParagraph"/>
+      </w:pPr>
+      <w:r>
+        <w:t>0.5C -&gt; 0.5A voor 1000mAh</w:t>
+      </w:r>
+    </w:p>
+    <w:p>
+      <w:pPr>
+        <w:pStyle w:val="ListParagraph"/>
+        <w:ind w:left="0"/>
+      </w:pPr>
+      <w:r>
+        <w:t xml:space="preserve">De meeste </w:t>
+      </w:r>
+      <w:r>
+        <w:t>18650</w:t>
+      </w:r>
+      <w:r>
+        <w:t xml:space="preserve"> batterijen zijn</w:t>
+      </w:r>
+      <w:r>
+        <w:t xml:space="preserve"> 0.5C-1C en</w:t>
+      </w:r>
+      <w:r>
+        <w:t xml:space="preserve"> 2600-3400mAh</w:t>
+      </w:r>
+      <w:r>
+        <w:t xml:space="preserve">. </w:t>
+      </w:r>
+    </w:p>
+    <w:p>
+      <w:pPr>
+        <w:pStyle w:val="ListParagraph"/>
+        <w:ind w:left="0"/>
+      </w:pPr>
+      <w:r>
+        <w:t>Afhankelijk van de</w:t>
+      </w:r>
+      <w:r>
+        <w:t xml:space="preserve"> </w:t>
+      </w:r>
+      <w:r>
+        <w:t>batterij</w:t>
+      </w:r>
+      <w:r>
+        <w:t xml:space="preserve"> kunnen t</w:t>
+      </w:r>
+      <w:r>
+        <w:t>wee in parallel met 2.5A</w:t>
+      </w:r>
+      <w:r>
+        <w:t xml:space="preserve"> of meer</w:t>
+      </w:r>
+      <w:r>
+        <w:t xml:space="preserve"> worden opgeladen.</w:t>
+      </w:r>
+    </w:p>
+    <w:p>
+      <w:pPr>
+        <w:pStyle w:val="ListParagraph"/>
+        <w:ind w:left="0"/>
+      </w:pPr>
+    </w:p>
+    <w:p>
+      <w:pPr>
+        <w:pStyle w:val="ListParagraph"/>
+        <w:ind w:left="0"/>
+      </w:pPr>
+      <w:r>
+        <w:t>USB-poorten</w:t>
+      </w:r>
+      <w:r>
+        <w:t xml:space="preserve"> zonder power delivery</w:t>
+      </w:r>
+      <w:r>
+        <w:t xml:space="preserve"> leveren </w:t>
+      </w:r>
+      <w:r>
+        <w:t>tussen 500mAh en 3A.</w:t>
+      </w:r>
+    </w:p>
+    <w:p>
+      <w:pPr>
+        <w:pStyle w:val="ListParagraph"/>
+        <w:ind w:left="0"/>
+      </w:pPr>
+      <w:r>
+        <w:drawing>
+          <wp:inline distT="0" distB="0" distL="0" distR="0" wp14:anchorId="59319F3E" wp14:editId="3641A19A">
+            <wp:extent cx="5760720" cy="1437005"/>
+            <wp:effectExtent l="0" t="0" r="0" b="0"/>
+            <wp:docPr id="1141723322" name="Picture 1"/>
+            <wp:cNvGraphicFramePr>
+              <a:graphicFrameLocks xmlns:a="http://schemas.openxmlformats.org/drawingml/2006/main" noChangeAspect="1"/>
+            </wp:cNvGraphicFramePr>
+            <a:graphic xmlns:a="http://schemas.openxmlformats.org/drawingml/2006/main">
+              <a:graphicData uri="http://schemas.openxmlformats.org/drawingml/2006/picture">
+                <pic:pic xmlns:pic="http://schemas.openxmlformats.org/drawingml/2006/picture">
+                  <pic:nvPicPr>
+                    <pic:cNvPr id="1141723322" name=""/>
+                    <pic:cNvPicPr/>
+                  </pic:nvPicPr>
+                  <pic:blipFill>
+                    <a:blip r:embed="rId111"/>
+                    <a:stretch>
+                      <a:fillRect/>
+                    </a:stretch>
+                  </pic:blipFill>
+                  <pic:spPr>
+                    <a:xfrm>
+                      <a:off x="0" y="0"/>
+                      <a:ext cx="5760720" cy="1437005"/>
+                    </a:xfrm>
+                    <a:prstGeom prst="rect">
+                      <a:avLst/>
+                    </a:prstGeom>
+                  </pic:spPr>
+                </pic:pic>
+              </a:graphicData>
+            </a:graphic>
+          </wp:inline>
+        </w:drawing>
+      </w:r>
+    </w:p>
+    <w:p>
+      <w:r>
+        <w:lastRenderedPageBreak/>
+        <w:t>Er zijn 3 soorten</w:t>
+      </w:r>
+      <w:r>
+        <w:t xml:space="preserve"> USB</w:t>
+      </w:r>
+      <w:r>
+        <w:t xml:space="preserve"> p</w:t>
+      </w:r>
+      <w:r>
+        <w:t>oorten:</w:t>
+      </w:r>
+    </w:p>
+    <w:p>
+      <w:pPr>
+        <w:pStyle w:val="ListParagraph"/>
+        <w:numPr>
+          <w:ilvl w:val="0"/>
+          <w:numId w:val="66"/>
+        </w:numPr>
         <w:rPr>
           <w:lang w:val="en-BE"/>
         </w:rPr>
       </w:pPr>
-    </w:p>
-    <w:p>
-      <w:pPr>
+      <w:r>
         <w:rPr>
           <w:lang w:val="en-BE"/>
         </w:rPr>
-      </w:pPr>
+        <w:t xml:space="preserve"> </w:t>
+      </w:r>
+      <w:r>
+        <w:rPr>
+          <w:b/>
+          <w:bCs/>
+          <w:lang w:val="en-BE"/>
+        </w:rPr>
+        <w:t>Standard Downstream Port (SDP)</w:t>
+      </w:r>
+      <w:r>
+        <w:rPr>
+          <w:lang w:val="en-BE"/>
+        </w:rPr>
+        <w:t xml:space="preserve"> - power is limited to the default power of the applicable USB specification (USB 2.0 or USB 3.x) </w:t>
+      </w:r>
+    </w:p>
+    <w:p>
+      <w:pPr>
+        <w:pStyle w:val="ListParagraph"/>
+        <w:numPr>
+          <w:ilvl w:val="0"/>
+          <w:numId w:val="66"/>
+        </w:numPr>
+        <w:rPr>
+          <w:lang w:val="en-BE"/>
+        </w:rPr>
+      </w:pPr>
+      <w:r>
+        <w:rPr>
+          <w:b/>
+          <w:bCs/>
+          <w:lang w:val="en-BE"/>
+        </w:rPr>
+        <w:t>Dedicated Charging Ports (DCP)</w:t>
+      </w:r>
+      <w:r>
+        <w:rPr>
+          <w:lang w:val="en-BE"/>
+        </w:rPr>
+        <w:t xml:space="preserve"> - delivers power only (no data) up to 1.5A </w:t>
+      </w:r>
+    </w:p>
+    <w:p>
+      <w:pPr>
+        <w:pStyle w:val="ListParagraph"/>
+        <w:numPr>
+          <w:ilvl w:val="0"/>
+          <w:numId w:val="66"/>
+        </w:numPr>
+        <w:rPr>
+          <w:lang w:val="en-BE"/>
+        </w:rPr>
+      </w:pPr>
+      <w:r>
+        <w:rPr>
+          <w:b/>
+          <w:bCs/>
+          <w:lang w:val="en-BE"/>
+        </w:rPr>
+        <w:t>Charging Downstream Port (CDP)</w:t>
+      </w:r>
+      <w:r>
+        <w:rPr>
+          <w:lang w:val="en-BE"/>
+        </w:rPr>
+        <w:t xml:space="preserve"> - capable of delivering both data and power up to 1.5A.</w:t>
+      </w:r>
+    </w:p>
+    <w:p>
+      <w:pPr>
+        <w:pStyle w:val="ListParagraph"/>
+        <w:ind w:left="0"/>
+        <w:rPr>
+          <w:lang w:val="en-BE"/>
+        </w:rPr>
+      </w:pPr>
+    </w:p>
+    <w:p>
+      <w:pPr>
+        <w:pStyle w:val="ListParagraph"/>
+        <w:ind w:left="0"/>
+      </w:pPr>
+      <w:r>
+        <w:t xml:space="preserve">Er is een IC nodig dat de juiste stroom kan trekken afhankelijk van de </w:t>
+      </w:r>
+      <w:r>
+        <w:t>USB</w:t>
+      </w:r>
+      <w:r>
+        <w:t xml:space="preserve"> poort.</w:t>
+      </w:r>
+    </w:p>
+    <w:p>
+      <w:pPr>
+        <w:pStyle w:val="Heading2"/>
+      </w:pPr>
+      <w:r>
+        <w:rPr>
+          <w:lang w:val="nl-BE"/>
+        </w:rPr>
+        <w:t>Load sharing</w:t>
+      </w:r>
+    </w:p>
+    <w:p>
+      <w:pPr>
+        <w:rPr>
+          <w:lang w:val="en-US"/>
+        </w:rPr>
+      </w:pPr>
+      <w:hyperlink r:id="rId112" w:history="1">
+        <w:r>
+          <w:rPr>
+            <w:rStyle w:val="Hyperlink"/>
+            <w:lang w:val="en-US"/>
+          </w:rPr>
+          <w:t>https://www.microtype.io/blog/lithium-ion-battery-charger-circuit-load-sharing</w:t>
+        </w:r>
+      </w:hyperlink>
+    </w:p>
+    <w:p>
+      <w:r>
+        <w:t>Als de batterij rechtstreeks als voeding wordt gebruikt wordt de stroom</w:t>
+      </w:r>
+      <w:r>
+        <w:t xml:space="preserve"> bij het</w:t>
+      </w:r>
+      <w:r>
+        <w:t xml:space="preserve"> laden gesplitst </w:t>
+      </w:r>
+      <w:r>
+        <w:t xml:space="preserve">tussen batterij en systeem. </w:t>
+      </w:r>
+      <w:r>
+        <w:t xml:space="preserve">De batterij wordt dan minder efficiënt opgeladen </w:t>
+      </w:r>
+      <w:r>
+        <w:t>en het laad-IC zou bij een volle batterij niet uitschakelen.</w:t>
+      </w:r>
+      <w:r>
+        <w:br/>
+      </w:r>
+    </w:p>
+    <w:p>
+      <w:pPr>
+        <w:pStyle w:val="Heading3"/>
+      </w:pPr>
+      <w:r>
+        <w:t>Apart circuit</w:t>
+      </w:r>
+    </w:p>
+    <w:p>
+      <w:r>
+        <w:t xml:space="preserve">Circuit om Vbus van </w:t>
+      </w:r>
+      <w:r>
+        <w:t>USB</w:t>
+      </w:r>
+      <w:r>
+        <w:t xml:space="preserve"> met </w:t>
+      </w:r>
+      <w:r>
+        <w:t>systeem</w:t>
+      </w:r>
+      <w:r>
+        <w:t xml:space="preserve"> te verbinden. Tijdens laden wordt het systeem</w:t>
+      </w:r>
+      <w:r>
+        <w:t xml:space="preserve"> (buck/regulator)</w:t>
+      </w:r>
+      <w:r>
+        <w:t xml:space="preserve"> gevoed met 5V.</w:t>
+      </w:r>
+    </w:p>
+    <w:p>
+      <w:pPr>
+        <w:pStyle w:val="ListParagraph"/>
+      </w:pPr>
+      <w:r>
+        <w:drawing>
+          <wp:inline distT="0" distB="0" distL="0" distR="0" wp14:anchorId="14D59C46" wp14:editId="7765610C">
+            <wp:extent cx="3422650" cy="1347631"/>
+            <wp:effectExtent l="0" t="0" r="6350" b="5080"/>
+            <wp:docPr id="353831612" name="Picture 1"/>
+            <wp:cNvGraphicFramePr>
+              <a:graphicFrameLocks xmlns:a="http://schemas.openxmlformats.org/drawingml/2006/main" noChangeAspect="1"/>
+            </wp:cNvGraphicFramePr>
+            <a:graphic xmlns:a="http://schemas.openxmlformats.org/drawingml/2006/main">
+              <a:graphicData uri="http://schemas.openxmlformats.org/drawingml/2006/picture">
+                <pic:pic xmlns:pic="http://schemas.openxmlformats.org/drawingml/2006/picture">
+                  <pic:nvPicPr>
+                    <pic:cNvPr id="353831612" name=""/>
+                    <pic:cNvPicPr/>
+                  </pic:nvPicPr>
+                  <pic:blipFill>
+                    <a:blip r:embed="rId113"/>
+                    <a:stretch>
+                      <a:fillRect/>
+                    </a:stretch>
+                  </pic:blipFill>
+                  <pic:spPr>
+                    <a:xfrm>
+                      <a:off x="0" y="0"/>
+                      <a:ext cx="3445912" cy="1356790"/>
+                    </a:xfrm>
+                    <a:prstGeom prst="rect">
+                      <a:avLst/>
+                    </a:prstGeom>
+                  </pic:spPr>
+                </pic:pic>
+              </a:graphicData>
+            </a:graphic>
+          </wp:inline>
+        </w:drawing>
+      </w:r>
+    </w:p>
+    <w:p>
+      <w:pPr>
+        <w:pStyle w:val="Heading3"/>
+      </w:pPr>
+      <w:r>
+        <w:t>IC met geïntegreerd load sharing</w:t>
+      </w:r>
     </w:p>
     <w:p/>
-    <w:p/>
-    <w:p/>
-    <w:p/>
-    <w:p/>
+    <w:p>
+      <w:pPr>
+        <w:pStyle w:val="ListParagraph"/>
+      </w:pPr>
+    </w:p>
+    <w:p>
+      <w:pPr>
+        <w:pStyle w:val="Heading2"/>
+      </w:pPr>
+      <w:r>
+        <w:t>Opties</w:t>
+      </w:r>
+    </w:p>
+    <w:p>
+      <w:pPr>
+        <w:pStyle w:val="ListParagraph"/>
+        <w:numPr>
+          <w:ilvl w:val="0"/>
+          <w:numId w:val="66"/>
+        </w:numPr>
+        <w:rPr>
+          <w:lang w:val="en-US"/>
+        </w:rPr>
+      </w:pPr>
+      <w:r>
+        <w:rPr>
+          <w:lang w:val="en-US"/>
+        </w:rPr>
+        <w:t>TP4056</w:t>
+      </w:r>
+      <w:r>
+        <w:rPr>
+          <w:lang w:val="en-US"/>
+        </w:rPr>
+        <w:t xml:space="preserve"> </w:t>
+      </w:r>
+    </w:p>
+    <w:p>
+      <w:pPr>
+        <w:pStyle w:val="ListParagraph"/>
+        <w:numPr>
+          <w:ilvl w:val="1"/>
+          <w:numId w:val="66"/>
+        </w:numPr>
+      </w:pPr>
+      <w:r>
+        <w:t>max. 1A, geen load sharing</w:t>
+      </w:r>
+      <w:r>
+        <w:t>, niet gesch</w:t>
+      </w:r>
+      <w:r>
+        <w:t>ikt</w:t>
+      </w:r>
+    </w:p>
+    <w:p>
+      <w:pPr>
+        <w:pStyle w:val="ListParagraph"/>
+        <w:numPr>
+          <w:ilvl w:val="0"/>
+          <w:numId w:val="66"/>
+        </w:numPr>
+        <w:rPr>
+          <w:lang w:val="en-US"/>
+        </w:rPr>
+      </w:pPr>
+      <w:r>
+        <w:rPr>
+          <w:lang w:val="en-US"/>
+        </w:rPr>
+        <w:t>MCP73871</w:t>
+      </w:r>
+    </w:p>
+    <w:p>
+      <w:pPr>
+        <w:pStyle w:val="ListParagraph"/>
+        <w:numPr>
+          <w:ilvl w:val="1"/>
+          <w:numId w:val="66"/>
+        </w:numPr>
+        <w:rPr>
+          <w:lang w:val="en-US"/>
+        </w:rPr>
+      </w:pPr>
+      <w:r>
+        <w:rPr>
+          <w:lang w:val="en-US"/>
+        </w:rPr>
+        <w:t>Load sharing</w:t>
+      </w:r>
+    </w:p>
+    <w:p>
+      <w:pPr>
+        <w:pStyle w:val="ListParagraph"/>
+        <w:numPr>
+          <w:ilvl w:val="1"/>
+          <w:numId w:val="66"/>
+        </w:numPr>
+        <w:rPr>
+          <w:lang w:val="en-US"/>
+        </w:rPr>
+      </w:pPr>
+    </w:p>
+    <w:p>
+      <w:pPr>
+        <w:pStyle w:val="ListParagraph"/>
+        <w:numPr>
+          <w:ilvl w:val="0"/>
+          <w:numId w:val="66"/>
+        </w:numPr>
+        <w:rPr>
+          <w:lang w:val="en-US"/>
+        </w:rPr>
+      </w:pPr>
+      <w:hyperlink r:id="rId114" w:history="1">
+        <w:r>
+          <w:rPr>
+            <w:rStyle w:val="Hyperlink"/>
+            <w:lang w:val="en-US"/>
+          </w:rPr>
+          <w:t>MAX8903</w:t>
+        </w:r>
+      </w:hyperlink>
+    </w:p>
+    <w:p>
+      <w:pPr>
+        <w:pStyle w:val="ListParagraph"/>
+        <w:numPr>
+          <w:ilvl w:val="1"/>
+          <w:numId w:val="66"/>
+        </w:numPr>
+        <w:rPr>
+          <w:lang w:val="en-US"/>
+        </w:rPr>
+      </w:pPr>
+      <w:r>
+        <w:rPr>
+          <w:lang w:val="en-US"/>
+        </w:rPr>
+        <w:t>Load sharing</w:t>
+      </w:r>
+    </w:p>
+    <w:p>
+      <w:pPr>
+        <w:pStyle w:val="ListParagraph"/>
+        <w:numPr>
+          <w:ilvl w:val="1"/>
+          <w:numId w:val="66"/>
+        </w:numPr>
+        <w:rPr>
+          <w:lang w:val="en-US"/>
+        </w:rPr>
+      </w:pPr>
+      <w:r>
+        <w:rPr>
+          <w:lang w:val="en-US"/>
+        </w:rPr>
+        <w:t>Laadstroom tot 2A</w:t>
+      </w:r>
+    </w:p>
+    <w:p>
+      <w:pPr>
+        <w:pStyle w:val="ListParagraph"/>
+        <w:numPr>
+          <w:ilvl w:val="1"/>
+          <w:numId w:val="66"/>
+        </w:numPr>
+        <w:rPr>
+          <w:lang w:val="en-US"/>
+        </w:rPr>
+      </w:pPr>
+      <w:r>
+        <w:rPr>
+          <w:lang w:val="en-US"/>
+        </w:rPr>
+        <w:t>Programmeerbare input stroom</w:t>
+      </w:r>
+    </w:p>
+    <w:p>
+      <w:pPr>
+        <w:pStyle w:val="ListParagraph"/>
+        <w:numPr>
+          <w:ilvl w:val="1"/>
+          <w:numId w:val="66"/>
+        </w:numPr>
+        <w:rPr>
+          <w:lang w:val="en-US"/>
+        </w:rPr>
+      </w:pPr>
+      <w:r>
+        <w:rPr>
+          <w:lang w:val="en-US"/>
+        </w:rPr>
+        <w:lastRenderedPageBreak/>
+        <w:drawing>
+          <wp:inline distT="0" distB="0" distL="0" distR="0" wp14:anchorId="373B969A" wp14:editId="100E0FBA">
+            <wp:extent cx="3511550" cy="2042212"/>
+            <wp:effectExtent l="0" t="0" r="0" b="0"/>
+            <wp:docPr id="813765950" name="Picture 1"/>
+            <wp:cNvGraphicFramePr>
+              <a:graphicFrameLocks xmlns:a="http://schemas.openxmlformats.org/drawingml/2006/main" noChangeAspect="1"/>
+            </wp:cNvGraphicFramePr>
+            <a:graphic xmlns:a="http://schemas.openxmlformats.org/drawingml/2006/main">
+              <a:graphicData uri="http://schemas.openxmlformats.org/drawingml/2006/picture">
+                <pic:pic xmlns:pic="http://schemas.openxmlformats.org/drawingml/2006/picture">
+                  <pic:nvPicPr>
+                    <pic:cNvPr id="813765950" name=""/>
+                    <pic:cNvPicPr/>
+                  </pic:nvPicPr>
+                  <pic:blipFill>
+                    <a:blip r:embed="rId115"/>
+                    <a:stretch>
+                      <a:fillRect/>
+                    </a:stretch>
+                  </pic:blipFill>
+                  <pic:spPr>
+                    <a:xfrm>
+                      <a:off x="0" y="0"/>
+                      <a:ext cx="3535433" cy="2056101"/>
+                    </a:xfrm>
+                    <a:prstGeom prst="rect">
+                      <a:avLst/>
+                    </a:prstGeom>
+                  </pic:spPr>
+                </pic:pic>
+              </a:graphicData>
+            </a:graphic>
+          </wp:inline>
+        </w:drawing>
+      </w:r>
+    </w:p>
+    <w:p>
+      <w:pPr>
+        <w:pStyle w:val="ListParagraph"/>
+        <w:numPr>
+          <w:ilvl w:val="1"/>
+          <w:numId w:val="66"/>
+        </w:numPr>
+      </w:pPr>
+      <w:r>
+        <w:t>USB kan met de A</w:t>
+      </w:r>
+      <w:r>
+        <w:t>C input worden verbonden, dan moet apart gedetecteerd worden welke soort USB-poort verbonden</w:t>
+      </w:r>
+      <w:r>
+        <w:t>:</w:t>
+      </w:r>
+      <w:r>
+        <w:t xml:space="preserve"> </w:t>
+      </w:r>
+    </w:p>
+    <w:p>
+      <w:pPr>
+        <w:pStyle w:val="ListParagraph"/>
+        <w:numPr>
+          <w:ilvl w:val="2"/>
+          <w:numId w:val="66"/>
+        </w:numPr>
+        <w:rPr>
+          <w:lang w:val="en-US"/>
+        </w:rPr>
+      </w:pPr>
+      <w:r>
+        <w:rPr>
+          <w:lang w:val="en-US"/>
+        </w:rPr>
+        <w:t xml:space="preserve">USB 2.0: </w:t>
+      </w:r>
+      <w:r>
+        <w:rPr>
+          <w:lang w:val="en-US"/>
+        </w:rPr>
+        <w:t>Data Contact Detect (DCD)</w:t>
+      </w:r>
+      <w:r>
+        <w:rPr>
+          <w:lang w:val="en-US"/>
+        </w:rPr>
+        <w:t xml:space="preserve"> (</w:t>
+      </w:r>
+      <w:r>
+        <w:rPr>
+          <w:lang w:val="en-US"/>
+        </w:rPr>
+        <w:t>USB Battery Charging Specification, Rev 1.2</w:t>
+      </w:r>
+      <w:r>
+        <w:rPr>
+          <w:lang w:val="en-US"/>
+        </w:rPr>
+        <w:t>).</w:t>
+      </w:r>
+    </w:p>
+    <w:p>
+      <w:pPr>
+        <w:pStyle w:val="ListParagraph"/>
+        <w:numPr>
+          <w:ilvl w:val="2"/>
+          <w:numId w:val="66"/>
+        </w:numPr>
+        <w:rPr>
+          <w:lang w:val="en-US"/>
+        </w:rPr>
+      </w:pPr>
+      <w:hyperlink r:id="rId116" w:history="1">
+        <w:r>
+          <w:rPr>
+            <w:rStyle w:val="Hyperlink"/>
+          </w:rPr>
+          <w:t>FSA832</w:t>
+        </w:r>
+      </w:hyperlink>
+      <w:r>
+        <w:t>: USB 2.0 charger detection IC</w:t>
+      </w:r>
+      <w:r>
+        <w:t>, detecteert of een laad-poort of gewone USB-poort is aangeslote</w:t>
+      </w:r>
+      <w:r>
+        <w:t>n.</w:t>
+      </w:r>
+      <w:r>
+        <w:br/>
+        <w:t xml:space="preserve">Als de </w:t>
+      </w:r>
+      <w:r>
+        <w:t>CHG_DET</w:t>
+      </w:r>
+      <w:r>
+        <w:t xml:space="preserve"> pin rechtstreeks met de DCM pin van </w:t>
+      </w:r>
+      <w:r>
+        <w:t>MAX8903</w:t>
+      </w:r>
+      <w:r>
+        <w:t xml:space="preserve"> </w:t>
+      </w:r>
+      <w:r>
+        <w:t>verbonden wordt, zal de input gelimiteerd worden tot 500mA bij een standard downstream usb-poort (SDP) en hoger bij een DCP of CDP poort.</w:t>
+      </w:r>
+      <w:r>
+        <w:t xml:space="preserve"> 100mA kan waarschijnlijk genegeerd worden.</w:t>
+      </w:r>
+    </w:p>
+    <w:p>
+      <w:pPr>
+        <w:pStyle w:val="ListParagraph"/>
+        <w:ind w:left="2160"/>
+      </w:pPr>
+      <w:r>
+        <w:t xml:space="preserve">-&gt; </w:t>
+      </w:r>
+      <w:r>
+        <w:t>Is bedoeld voor BC1.2, tot 1.5A.</w:t>
+      </w:r>
+    </w:p>
+    <w:p>
+      <w:pPr>
+        <w:pStyle w:val="ListParagraph"/>
+        <w:numPr>
+          <w:ilvl w:val="2"/>
+          <w:numId w:val="66"/>
+        </w:numPr>
+        <w:rPr>
+          <w:i/>
+          <w:iCs/>
+          <w:sz w:val="20"/>
+          <w:szCs w:val="20"/>
+          <w:lang w:val="en-BE"/>
+        </w:rPr>
+      </w:pPr>
+      <w:r>
+        <w:rPr>
+          <w:lang w:val="en-US"/>
+        </w:rPr>
+        <w:t>USB-C: CC pinnen</w:t>
+      </w:r>
+      <w:r>
+        <w:rPr>
+          <w:lang w:val="en-US"/>
+        </w:rPr>
+        <w:t xml:space="preserve"> -&gt; tot 3A</w:t>
+      </w:r>
+    </w:p>
+    <w:p>
+      <w:pPr>
+        <w:pStyle w:val="ListParagraph"/>
+        <w:ind w:left="2160"/>
+        <w:rPr>
+          <w:lang w:val="en-US"/>
+        </w:rPr>
+      </w:pPr>
+      <w:hyperlink r:id="rId117" w:history="1">
+        <w:r>
+          <w:rPr>
+            <w:rStyle w:val="Hyperlink"/>
+            <w:lang w:val="en-US"/>
+          </w:rPr>
+          <w:t>https://zbotic.in/usb-type-c-connector-power-delivery-and-data-wiring-guide/</w:t>
+        </w:r>
+      </w:hyperlink>
+    </w:p>
+    <w:p>
+      <w:pPr>
+        <w:pStyle w:val="ListParagraph"/>
+        <w:ind w:left="2160"/>
+        <w:rPr>
+          <w:i/>
+          <w:iCs/>
+          <w:sz w:val="20"/>
+          <w:szCs w:val="20"/>
+          <w:lang w:val="en-BE"/>
+        </w:rPr>
+      </w:pPr>
+      <w:r>
+        <w:rPr>
+          <w:b/>
+          <w:bCs/>
+          <w:i/>
+          <w:iCs/>
+          <w:sz w:val="20"/>
+          <w:szCs w:val="20"/>
+          <w:lang w:val="en-BE"/>
+        </w:rPr>
+        <w:t>Current advertisement (without PD):</w:t>
+      </w:r>
+      <w:r>
+        <w:rPr>
+          <w:i/>
+          <w:iCs/>
+          <w:sz w:val="20"/>
+          <w:szCs w:val="20"/>
+          <w:lang w:val="en-BE"/>
+        </w:rPr>
+        <w:t xml:space="preserve"> A USB-C charger advertises its current capability by placing a resistor on the CC pin: </w:t>
+      </w:r>
+    </w:p>
+    <w:p>
+      <w:pPr>
+        <w:pStyle w:val="ListParagraph"/>
+        <w:numPr>
+          <w:ilvl w:val="2"/>
+          <w:numId w:val="75"/>
+        </w:numPr>
+        <w:rPr>
+          <w:i/>
+          <w:iCs/>
+          <w:sz w:val="20"/>
+          <w:szCs w:val="20"/>
+          <w:lang w:val="en-BE"/>
+        </w:rPr>
+      </w:pPr>
+      <w:r>
+        <w:rPr>
+          <w:i/>
+          <w:iCs/>
+          <w:sz w:val="20"/>
+          <w:szCs w:val="20"/>
+          <w:lang w:val="en-BE"/>
+        </w:rPr>
+        <w:t>56k ohm pull-up: Default USB current (500mA USB 2.0, 900mA USB 3.0)</w:t>
+      </w:r>
+    </w:p>
+    <w:p>
+      <w:pPr>
+        <w:pStyle w:val="ListParagraph"/>
+        <w:numPr>
+          <w:ilvl w:val="2"/>
+          <w:numId w:val="75"/>
+        </w:numPr>
+        <w:rPr>
+          <w:i/>
+          <w:iCs/>
+          <w:sz w:val="20"/>
+          <w:szCs w:val="20"/>
+          <w:lang w:val="en-BE"/>
+        </w:rPr>
+      </w:pPr>
+      <w:r>
+        <w:rPr>
+          <w:i/>
+          <w:iCs/>
+          <w:sz w:val="20"/>
+          <w:szCs w:val="20"/>
+          <w:lang w:val="en-BE"/>
+        </w:rPr>
+        <w:t>22k ohm pull-up: 1.5A at 5V</w:t>
+      </w:r>
+    </w:p>
+    <w:p>
+      <w:pPr>
+        <w:pStyle w:val="ListParagraph"/>
+        <w:numPr>
+          <w:ilvl w:val="2"/>
+          <w:numId w:val="75"/>
+        </w:numPr>
+        <w:rPr>
+          <w:i/>
+          <w:iCs/>
+          <w:sz w:val="20"/>
+          <w:szCs w:val="20"/>
+          <w:lang w:val="en-BE"/>
+        </w:rPr>
+      </w:pPr>
+      <w:r>
+        <w:rPr>
+          <w:i/>
+          <w:iCs/>
+          <w:sz w:val="20"/>
+          <w:szCs w:val="20"/>
+          <w:lang w:val="en-BE"/>
+        </w:rPr>
+        <w:t>10k ohm pull-up: 3A at 5V</w:t>
+      </w:r>
+    </w:p>
+    <w:p>
+      <w:pPr>
+        <w:pStyle w:val="ListParagraph"/>
+        <w:ind w:left="2160"/>
+        <w:rPr>
+          <w:i/>
+          <w:iCs/>
+          <w:sz w:val="20"/>
+          <w:szCs w:val="20"/>
+          <w:lang w:val="en-BE"/>
+        </w:rPr>
+      </w:pPr>
+      <w:r>
+        <w:rPr>
+          <w:i/>
+          <w:iCs/>
+          <w:sz w:val="20"/>
+          <w:szCs w:val="20"/>
+          <w:lang w:val="en-BE"/>
+        </w:rPr>
+        <w:t>For device that draws 5V 1.5A without PD:</w:t>
+      </w:r>
+    </w:p>
+    <w:p>
+      <w:pPr>
+        <w:pStyle w:val="ListParagraph"/>
+        <w:ind w:left="2160" w:firstLine="672"/>
+        <w:rPr>
+          <w:i/>
+          <w:iCs/>
+          <w:sz w:val="20"/>
+          <w:szCs w:val="20"/>
+          <w:lang w:val="en-BE"/>
+        </w:rPr>
+      </w:pPr>
+      <w:r>
+        <w:rPr>
+          <w:i/>
+          <w:iCs/>
+          <w:sz w:val="20"/>
+          <w:szCs w:val="20"/>
+          <w:lang w:val="en-BE"/>
+        </w:rPr>
+        <w:t>Place 5.1k ohm resistor from CC1 to GND</w:t>
+      </w:r>
+    </w:p>
+    <w:p>
+      <w:pPr>
+        <w:pStyle w:val="ListParagraph"/>
+        <w:ind w:left="2160" w:firstLine="672"/>
+        <w:rPr>
+          <w:i/>
+          <w:iCs/>
+          <w:sz w:val="20"/>
+          <w:szCs w:val="20"/>
+          <w:lang w:val="en-BE"/>
+        </w:rPr>
+      </w:pPr>
+      <w:r>
+        <w:rPr>
+          <w:i/>
+          <w:iCs/>
+          <w:sz w:val="20"/>
+          <w:szCs w:val="20"/>
+          <w:lang w:val="en-BE"/>
+        </w:rPr>
+        <w:t>Place 5.1k ohm resistor from CC2 to GND</w:t>
+      </w:r>
+    </w:p>
+    <w:p>
+      <w:pPr>
+        <w:pStyle w:val="ListParagraph"/>
+        <w:ind w:left="2160" w:firstLine="672"/>
+        <w:rPr>
+          <w:i/>
+          <w:iCs/>
+          <w:sz w:val="20"/>
+          <w:szCs w:val="20"/>
+          <w:lang w:val="en-BE"/>
+        </w:rPr>
+      </w:pPr>
+      <w:r>
+        <w:rPr>
+          <w:i/>
+          <w:iCs/>
+          <w:sz w:val="20"/>
+          <w:szCs w:val="20"/>
+          <w:lang w:val="en-BE"/>
+        </w:rPr>
+        <w:t>These resistors tell the charger:</w:t>
+      </w:r>
+    </w:p>
+    <w:p>
+      <w:pPr>
+        <w:pStyle w:val="ListParagraph"/>
+        <w:ind w:left="2160" w:firstLine="672"/>
+        <w:rPr>
+          <w:i/>
+          <w:iCs/>
+          <w:sz w:val="20"/>
+          <w:szCs w:val="20"/>
+          <w:lang w:val="en-BE"/>
+        </w:rPr>
+      </w:pPr>
+      <w:r>
+        <w:rPr>
+          <w:i/>
+          <w:iCs/>
+          <w:sz w:val="20"/>
+          <w:szCs w:val="20"/>
+          <w:lang w:val="en-BE"/>
+        </w:rPr>
+        <w:t>"I am a USB-C device, provide appropriate current"</w:t>
+      </w:r>
+    </w:p>
+    <w:p>
+      <w:pPr>
+        <w:pStyle w:val="ListParagraph"/>
+        <w:ind w:left="2160" w:firstLine="672"/>
+        <w:rPr>
+          <w:i/>
+          <w:iCs/>
+          <w:sz w:val="20"/>
+          <w:szCs w:val="20"/>
+          <w:lang w:val="en-BE"/>
+        </w:rPr>
+      </w:pPr>
+      <w:r>
+        <w:rPr>
+          <w:i/>
+          <w:iCs/>
+          <w:sz w:val="20"/>
+          <w:szCs w:val="20"/>
+          <w:lang w:val="en-BE"/>
+        </w:rPr>
+        <w:t>A PD charger will detect 5.1k (sink) and provide 5V</w:t>
+      </w:r>
+    </w:p>
+    <w:p>
+      <w:pPr>
+        <w:pStyle w:val="ListParagraph"/>
+        <w:numPr>
+          <w:ilvl w:val="0"/>
+          <w:numId w:val="66"/>
+        </w:numPr>
+        <w:rPr>
+          <w:lang w:val="en-US"/>
+        </w:rPr>
+      </w:pPr>
+      <w:hyperlink r:id="rId118" w:history="1">
+        <w:r>
+          <w:rPr>
+            <w:rStyle w:val="Hyperlink"/>
+            <w:lang w:val="en-US"/>
+          </w:rPr>
+          <w:t>LTC4066</w:t>
+        </w:r>
+      </w:hyperlink>
+    </w:p>
+    <w:p>
+      <w:pPr>
+        <w:pStyle w:val="ListParagraph"/>
+        <w:numPr>
+          <w:ilvl w:val="1"/>
+          <w:numId w:val="66"/>
+        </w:numPr>
+        <w:rPr>
+          <w:lang w:val="en-US"/>
+        </w:rPr>
+      </w:pPr>
+      <w:r>
+        <w:rPr>
+          <w:lang w:val="en-US"/>
+        </w:rPr>
+        <w:t>Seamless Transition Between Input Power Sources:</w:t>
+      </w:r>
+      <w:r>
+        <w:rPr>
+          <w:lang w:val="en-US"/>
+        </w:rPr>
+        <w:t xml:space="preserve"> </w:t>
+      </w:r>
+      <w:r>
+        <w:rPr>
+          <w:lang w:val="en-US"/>
+        </w:rPr>
+        <w:t>Li-Ion Battery, USB and 5V Wall Adapte</w:t>
+      </w:r>
+      <w:r>
+        <w:rPr>
+          <w:lang w:val="en-US"/>
+        </w:rPr>
+        <w:t>r</w:t>
+      </w:r>
+    </w:p>
+    <w:p>
+      <w:pPr>
+        <w:pStyle w:val="ListParagraph"/>
+        <w:numPr>
+          <w:ilvl w:val="1"/>
+          <w:numId w:val="66"/>
+        </w:numPr>
+        <w:rPr>
+          <w:lang w:val="en-US"/>
+        </w:rPr>
+      </w:pPr>
+      <w:r>
+        <w:rPr>
+          <w:lang w:val="en-US"/>
+        </w:rPr>
+        <w:t>100mA / 500mA / oneindig</w:t>
+      </w:r>
+    </w:p>
+    <w:p>
+      <w:pPr>
+        <w:pStyle w:val="ListParagraph"/>
+        <w:numPr>
+          <w:ilvl w:val="0"/>
+          <w:numId w:val="66"/>
+        </w:numPr>
+        <w:rPr>
+          <w:lang w:val="en-US"/>
+        </w:rPr>
+      </w:pPr>
+      <w:hyperlink r:id="rId119" w:history="1">
+        <w:r>
+          <w:rPr>
+            <w:rStyle w:val="Hyperlink"/>
+            <w:lang w:val="en-US"/>
+          </w:rPr>
+          <w:t>STw4102</w:t>
+        </w:r>
+      </w:hyperlink>
+    </w:p>
+    <w:p>
+      <w:pPr>
+        <w:pStyle w:val="ListParagraph"/>
+        <w:numPr>
+          <w:ilvl w:val="1"/>
+          <w:numId w:val="66"/>
+        </w:numPr>
+        <w:rPr>
+          <w:lang w:val="en-US"/>
+        </w:rPr>
+      </w:pPr>
+      <w:r>
+        <w:rPr>
+          <w:lang w:val="en-US"/>
+        </w:rPr>
+        <w:t>Dual USB/wall adapter Li-ion battery charger with gas gauge</w:t>
+      </w:r>
+    </w:p>
+    <w:p>
+      <w:pPr>
+        <w:pStyle w:val="ListParagraph"/>
+        <w:numPr>
+          <w:ilvl w:val="1"/>
+          <w:numId w:val="66"/>
+        </w:numPr>
+        <w:rPr>
+          <w:lang w:val="en-US"/>
+        </w:rPr>
+      </w:pPr>
+      <w:r>
+        <w:rPr>
+          <w:lang w:val="en-US"/>
+        </w:rPr>
+        <w:t>Fast charge current control up to 1 A for wall</w:t>
+      </w:r>
+      <w:r>
+        <w:rPr>
+          <w:lang w:val="en-US"/>
+        </w:rPr>
+        <w:t xml:space="preserve"> </w:t>
+      </w:r>
+      <w:r>
+        <w:rPr>
+          <w:lang w:val="en-US"/>
+        </w:rPr>
+        <w:t>adapter and up to 500 mA for USB</w:t>
+      </w:r>
+    </w:p>
+    <w:p>
+      <w:pPr>
+        <w:pStyle w:val="ListParagraph"/>
+        <w:numPr>
+          <w:ilvl w:val="1"/>
+          <w:numId w:val="66"/>
+        </w:numPr>
+        <w:rPr>
+          <w:lang w:val="en-US"/>
+        </w:rPr>
+      </w:pPr>
+      <w:r>
+        <w:rPr>
+          <w:lang w:val="en-US"/>
+        </w:rPr>
+        <w:t>Support for currents higher than 1 A using</w:t>
+      </w:r>
+      <w:r>
+        <w:rPr>
+          <w:lang w:val="en-US"/>
+        </w:rPr>
+        <w:t xml:space="preserve"> </w:t>
+      </w:r>
+      <w:r>
+        <w:rPr>
+          <w:lang w:val="en-US"/>
+        </w:rPr>
+        <w:t>external components</w:t>
+      </w:r>
+    </w:p>
+    <w:p>
+      <w:pPr>
+        <w:pStyle w:val="ListParagraph"/>
+        <w:numPr>
+          <w:ilvl w:val="1"/>
+          <w:numId w:val="66"/>
+        </w:numPr>
+        <w:rPr>
+          <w:lang w:val="en-US"/>
+        </w:rPr>
+      </w:pPr>
+      <w:r>
+        <w:rPr>
+          <w:lang w:val="en-US"/>
+        </w:rPr>
+        <w:t>Battery voltage monitor with 7-12 bit AD</w:t>
+      </w:r>
+      <w:r>
+        <w:rPr>
+          <w:lang w:val="en-US"/>
+        </w:rPr>
+        <w:t xml:space="preserve"> </w:t>
+      </w:r>
+      <w:r>
+        <w:rPr>
+          <w:lang w:val="en-US"/>
+        </w:rPr>
+        <w:t>converter</w:t>
+      </w:r>
+    </w:p>
+    <w:p>
+      <w:pPr>
+        <w:pStyle w:val="ListParagraph"/>
+        <w:numPr>
+          <w:ilvl w:val="1"/>
+          <w:numId w:val="66"/>
+        </w:numPr>
+        <w:rPr>
+          <w:lang w:val="en-US"/>
+        </w:rPr>
+      </w:pPr>
+      <w:r>
+        <w:rPr>
+          <w:lang w:val="en-US"/>
+        </w:rPr>
+        <w:t>I²C</w:t>
+      </w:r>
+      <w:r>
+        <w:rPr>
+          <w:lang w:val="en-US"/>
+        </w:rPr>
+        <w:t xml:space="preserve"> interface for device monitoring and contro</w:t>
+      </w:r>
+      <w:r>
+        <w:rPr>
+          <w:lang w:val="en-US"/>
+        </w:rPr>
+        <w:t>l</w:t>
+      </w:r>
+    </w:p>
+    <w:p>
+      <w:pPr>
+        <w:pStyle w:val="ListParagraph"/>
+        <w:numPr>
+          <w:ilvl w:val="1"/>
+          <w:numId w:val="66"/>
+        </w:numPr>
+        <w:rPr>
+          <w:lang w:val="en-US"/>
+        </w:rPr>
+      </w:pPr>
+      <w:r>
+        <w:rPr>
+          <w:lang w:val="en-US"/>
+        </w:rPr>
+        <w:t>Charge status &amp; power detection output</w:t>
+      </w:r>
+    </w:p>
+    <w:p>
+      <w:pPr>
+        <w:spacing w:after="160"/>
+        <w:rPr>
+          <w:lang w:val="en-US"/>
+        </w:rPr>
+      </w:pPr>
+      <w:r>
+        <w:rPr>
+          <w:lang w:val="en-US"/>
+        </w:rPr>
+        <w:br w:type="page"/>
+      </w:r>
+    </w:p>
+    <w:p>
+      <w:pPr>
+        <w:pStyle w:val="ListParagraph"/>
+        <w:numPr>
+          <w:ilvl w:val="0"/>
+          <w:numId w:val="66"/>
+        </w:numPr>
+        <w:rPr>
+          <w:lang w:val="en-US"/>
+        </w:rPr>
+      </w:pPr>
+      <w:hyperlink r:id="rId120" w:history="1">
+        <w:r>
+          <w:rPr>
+            <w:rStyle w:val="Hyperlink"/>
+            <w:lang w:val="en-US"/>
+          </w:rPr>
+          <w:t>MAX77751</w:t>
+        </w:r>
+      </w:hyperlink>
+    </w:p>
+    <w:p>
+      <w:pPr>
+        <w:pStyle w:val="ListParagraph"/>
+        <w:numPr>
+          <w:ilvl w:val="1"/>
+          <w:numId w:val="66"/>
+        </w:numPr>
+        <w:rPr>
+          <w:lang w:val="en-US"/>
+        </w:rPr>
+      </w:pPr>
+      <w:r>
+        <w:rPr>
+          <w:lang w:val="en-US"/>
+        </w:rPr>
+        <w:t>Integrated USB Detection</w:t>
+      </w:r>
+    </w:p>
+    <w:p>
+      <w:pPr>
+        <w:pStyle w:val="ListParagraph"/>
+        <w:numPr>
+          <w:ilvl w:val="2"/>
+          <w:numId w:val="66"/>
+        </w:numPr>
+        <w:rPr>
+          <w:lang w:val="en-US"/>
+        </w:rPr>
+      </w:pPr>
+      <w:r>
+        <w:rPr>
+          <w:lang w:val="en-US"/>
+        </w:rPr>
+        <w:t>• CC Detection for USB Type-C</w:t>
+      </w:r>
+    </w:p>
+    <w:p>
+      <w:pPr>
+        <w:pStyle w:val="ListParagraph"/>
+        <w:numPr>
+          <w:ilvl w:val="2"/>
+          <w:numId w:val="66"/>
+        </w:numPr>
+        <w:rPr>
+          <w:lang w:val="en-US"/>
+        </w:rPr>
+      </w:pPr>
+      <w:r>
+        <w:rPr>
+          <w:lang w:val="en-US"/>
+        </w:rPr>
+        <w:t>• BC1.2 Detection for Legacy SDP, DCP, and CDP</w:t>
+      </w:r>
+    </w:p>
+    <w:p>
+      <w:pPr>
+        <w:pStyle w:val="ListParagraph"/>
+        <w:numPr>
+          <w:ilvl w:val="2"/>
+          <w:numId w:val="66"/>
+        </w:numPr>
+        <w:rPr>
+          <w:lang w:val="en-US"/>
+        </w:rPr>
+      </w:pPr>
+      <w:r>
+        <w:rPr>
+          <w:lang w:val="en-US"/>
+        </w:rPr>
+        <w:t>• Automatic Input Current Limit Configuration</w:t>
+      </w:r>
+    </w:p>
+    <w:p>
+      <w:pPr>
+        <w:pStyle w:val="ListParagraph"/>
+        <w:numPr>
+          <w:ilvl w:val="2"/>
+          <w:numId w:val="66"/>
+        </w:numPr>
+        <w:rPr>
+          <w:lang w:val="en-US"/>
+        </w:rPr>
+      </w:pPr>
+      <w:r>
+        <w:rPr>
+          <w:lang w:val="en-US"/>
+        </w:rPr>
+        <w:t>• Input Voltage Regulation with Adaptive Input</w:t>
+      </w:r>
+    </w:p>
+    <w:p>
+      <w:pPr>
+        <w:pStyle w:val="ListParagraph"/>
+        <w:numPr>
+          <w:ilvl w:val="2"/>
+          <w:numId w:val="66"/>
+        </w:numPr>
+        <w:rPr>
+          <w:lang w:val="en-US"/>
+        </w:rPr>
+      </w:pPr>
+      <w:r>
+        <w:rPr>
+          <w:lang w:val="en-US"/>
+        </w:rPr>
+        <w:t>Current Limit (AICL)</w:t>
+      </w:r>
+    </w:p>
+    <w:p>
+      <w:pPr>
+        <w:pStyle w:val="ListParagraph"/>
+        <w:numPr>
+          <w:ilvl w:val="1"/>
+          <w:numId w:val="66"/>
+        </w:numPr>
+        <w:rPr>
+          <w:lang w:val="en-US"/>
+        </w:rPr>
+      </w:pPr>
+      <w:r>
+        <w:rPr>
+          <w:lang w:val="en-US"/>
+        </w:rPr>
+        <w:t>3.15A Maximum Charging Current</w:t>
+      </w:r>
+    </w:p>
+    <w:p>
+      <w:pPr>
+        <w:pStyle w:val="ListParagraph"/>
+        <w:ind w:left="1440"/>
+        <w:rPr>
+          <w:lang w:val="en-US"/>
+        </w:rPr>
+      </w:pPr>
+      <w:r>
+        <w:rPr>
+          <w:lang w:val="en-US"/>
+        </w:rPr>
+        <w:drawing>
+          <wp:inline distT="0" distB="0" distL="0" distR="0" wp14:anchorId="588F96B9" wp14:editId="5A8ACD7C">
+            <wp:extent cx="3288952" cy="2527300"/>
+            <wp:effectExtent l="0" t="0" r="6985" b="6350"/>
+            <wp:docPr id="734213819" name="Picture 1"/>
+            <wp:cNvGraphicFramePr>
+              <a:graphicFrameLocks xmlns:a="http://schemas.openxmlformats.org/drawingml/2006/main" noChangeAspect="1"/>
+            </wp:cNvGraphicFramePr>
+            <a:graphic xmlns:a="http://schemas.openxmlformats.org/drawingml/2006/main">
+              <a:graphicData uri="http://schemas.openxmlformats.org/drawingml/2006/picture">
+                <pic:pic xmlns:pic="http://schemas.openxmlformats.org/drawingml/2006/picture">
+                  <pic:nvPicPr>
+                    <pic:cNvPr id="734213819" name=""/>
+                    <pic:cNvPicPr/>
+                  </pic:nvPicPr>
+                  <pic:blipFill>
+                    <a:blip r:embed="rId121"/>
+                    <a:stretch>
+                      <a:fillRect/>
+                    </a:stretch>
+                  </pic:blipFill>
+                  <pic:spPr>
+                    <a:xfrm>
+                      <a:off x="0" y="0"/>
+                      <a:ext cx="3295166" cy="2532075"/>
+                    </a:xfrm>
+                    <a:prstGeom prst="rect">
+                      <a:avLst/>
+                    </a:prstGeom>
+                  </pic:spPr>
+                </pic:pic>
+              </a:graphicData>
+            </a:graphic>
+          </wp:inline>
+        </w:drawing>
+      </w:r>
+    </w:p>
+    <w:p>
+      <w:pPr>
+        <w:pStyle w:val="ListParagraph"/>
+        <w:ind w:left="1440"/>
+        <w:rPr>
+          <w:lang w:val="en-US"/>
+        </w:rPr>
+      </w:pPr>
+    </w:p>
+    <w:p>
+      <w:pPr>
+        <w:pStyle w:val="ListParagraph"/>
+        <w:numPr>
+          <w:ilvl w:val="1"/>
+          <w:numId w:val="66"/>
+        </w:numPr>
+      </w:pPr>
+      <w:r>
+        <w:t xml:space="preserve">### </w:t>
+      </w:r>
+      <w:r>
+        <w:t>Kan je de USB d</w:t>
+      </w:r>
+      <w:r>
+        <w:t>ata lijnen nog gebruiken voor STM32?</w:t>
+      </w:r>
+      <w:r>
+        <w:br/>
+      </w:r>
+    </w:p>
     <w:p>
       <w:pPr>
         <w:pStyle w:val="Heading1"/>
       </w:pPr>
-      <w:bookmarkStart w:id="45" w:name="_Toc223965571"/>
-      <w:r>
-        <w:t>SD-</w:t>
-      </w:r>
-      <w:proofErr w:type="spellStart"/>
-      <w:r>
-        <w:t>kaart</w:t>
-      </w:r>
-      <w:bookmarkEnd w:id="45"/>
-      <w:proofErr w:type="spellEnd"/>
+      <w:bookmarkStart w:id="47" w:name="_Toc223965573"/>
+      <w:r>
+        <w:t>Motor/solenoide</w:t>
+      </w:r>
+      <w:bookmarkEnd w:id="47"/>
     </w:p>
     <w:p>
       <w:pPr>
@@ -15051,18 +15885,11 @@
       <w:pPr>
         <w:pStyle w:val="Heading1"/>
       </w:pPr>
-      <w:bookmarkStart w:id="46" w:name="_Toc223965572"/>
-      <w:r>
-        <w:t>Battery management system</w:t>
-      </w:r>
-      <w:bookmarkEnd w:id="46"/>
-    </w:p>
-    <w:p>
-      <w:pPr>
-        <w:rPr>
-          <w:lang w:val="en-US"/>
-        </w:rPr>
-      </w:pPr>
+      <w:bookmarkStart w:id="48" w:name="_Toc223965574"/>
+      <w:r>
+        <w:t>Samenvatting keuzes</w:t>
+      </w:r>
+      <w:bookmarkEnd w:id="48"/>
     </w:p>
     <w:p>
       <w:pPr>
@@ -15075,40 +15902,6 @@
       <w:pPr>
         <w:pStyle w:val="Heading1"/>
       </w:pPr>
-      <w:bookmarkStart w:id="47" w:name="_Toc223965573"/>
-      <w:r>
-        <w:t>Motor/solenoide</w:t>
-      </w:r>
-      <w:bookmarkEnd w:id="47"/>
-    </w:p>
-    <w:p>
-      <w:pPr>
-        <w:rPr>
-          <w:lang w:val="en-US"/>
-        </w:rPr>
-      </w:pPr>
-    </w:p>
-    <w:p>
-      <w:pPr>
-        <w:pStyle w:val="Heading1"/>
-      </w:pPr>
-      <w:bookmarkStart w:id="48" w:name="_Toc223965574"/>
-      <w:r>
-        <w:t>Samenvatting keuzes</w:t>
-      </w:r>
-      <w:bookmarkEnd w:id="48"/>
-    </w:p>
-    <w:p>
-      <w:pPr>
-        <w:rPr>
-          <w:lang w:val="en-US"/>
-        </w:rPr>
-      </w:pPr>
-    </w:p>
-    <w:p>
-      <w:pPr>
-        <w:pStyle w:val="Heading1"/>
-      </w:pPr>
       <w:bookmarkStart w:id="49" w:name="_Toc223965575"/>
       <w:r>
         <w:t>BOM</w:t>
@@ -15130,7 +15923,7 @@
       </w:pPr>
     </w:p>
     <w:sectPr>
-      <w:headerReference w:type="default" r:id="rId110"/>
+      <w:headerReference w:type="default" r:id="rId122"/>
       <w:type w:val="continuous"/>
       <w:pgSz w:w="11906" w:h="16838"/>
       <w:pgMar w:top="1417" w:right="1417" w:bottom="1417" w:left="1417" w:header="708" w:footer="708" w:gutter="0"/>
@@ -15230,22 +16023,15 @@
     <w:pPr>
       <w:pStyle w:val="Header"/>
     </w:pPr>
-    <w:proofErr w:type="spellStart"/>
     <w:r>
       <w:t>Bikera</w:t>
     </w:r>
-    <w:proofErr w:type="spellEnd"/>
     <w:r>
-      <w:t xml:space="preserve"> fietsslot </w:t>
-    </w:r>
-    <w:proofErr w:type="gramStart"/>
-    <w:r>
-      <w:t>PCB c</w:t>
+      <w:t xml:space="preserve"> fietsslot PCB c</w:t>
     </w:r>
     <w:r>
       <w:t>omponenten</w:t>
     </w:r>
-    <w:proofErr w:type="gramEnd"/>
     <w:r>
       <w:tab/>
     </w:r>
@@ -15265,22 +16051,12 @@
     <w:pPr>
       <w:pStyle w:val="Header"/>
     </w:pPr>
-    <w:proofErr w:type="spellStart"/>
     <w:r>
-      <w:t>Bikera</w:t>
-    </w:r>
-    <w:proofErr w:type="spellEnd"/>
-    <w:r>
-      <w:t xml:space="preserve"> fietsslot </w:t>
-    </w:r>
-    <w:proofErr w:type="gramStart"/>
-    <w:r>
-      <w:t>PCB c</w:t>
+      <w:t>Bikera fietsslot PCB c</w:t>
     </w:r>
     <w:r>
       <w:t>omponenten</w:t>
     </w:r>
-    <w:proofErr w:type="gramEnd"/>
     <w:r>
       <w:tab/>
     </w:r>
@@ -15300,33 +16076,21 @@
     <w:pPr>
       <w:pStyle w:val="Header"/>
     </w:pPr>
-    <w:proofErr w:type="spellStart"/>
     <w:r>
-      <w:t>Bikera</w:t>
-    </w:r>
-    <w:proofErr w:type="spellEnd"/>
-    <w:r>
-      <w:t xml:space="preserve"> fietsslot </w:t>
-    </w:r>
-    <w:proofErr w:type="gramStart"/>
-    <w:r>
-      <w:t>PCB c</w:t>
+      <w:t>Bikera fietsslot PCB c</w:t>
     </w:r>
     <w:r>
       <w:t>omponenten</w:t>
     </w:r>
-    <w:proofErr w:type="gramEnd"/>
     <w:r>
       <w:tab/>
     </w:r>
     <w:r>
       <w:tab/>
     </w:r>
-    <w:proofErr w:type="spellStart"/>
     <w:r>
       <w:t>LoRa</w:t>
     </w:r>
-    <w:proofErr w:type="spellEnd"/>
   </w:p>
 </w:hdr>
 </file>
@@ -15337,22 +16101,12 @@
     <w:pPr>
       <w:pStyle w:val="Header"/>
     </w:pPr>
-    <w:proofErr w:type="spellStart"/>
     <w:r>
-      <w:t>Bikera</w:t>
-    </w:r>
-    <w:proofErr w:type="spellEnd"/>
-    <w:r>
-      <w:t xml:space="preserve"> fietsslot </w:t>
-    </w:r>
-    <w:proofErr w:type="gramStart"/>
-    <w:r>
-      <w:t>PCB c</w:t>
+      <w:t>Bikera fietsslot PCB c</w:t>
     </w:r>
     <w:r>
       <w:t>omponenten</w:t>
     </w:r>
-    <w:proofErr w:type="gramEnd"/>
     <w:r>
       <w:tab/>
     </w:r>
@@ -15372,33 +16126,21 @@
     <w:pPr>
       <w:pStyle w:val="Header"/>
     </w:pPr>
-    <w:proofErr w:type="spellStart"/>
     <w:r>
-      <w:t>Bikera</w:t>
-    </w:r>
-    <w:proofErr w:type="spellEnd"/>
-    <w:r>
-      <w:t xml:space="preserve"> fietsslot </w:t>
-    </w:r>
-    <w:proofErr w:type="gramStart"/>
-    <w:r>
-      <w:t>PCB c</w:t>
+      <w:t>Bikera fietsslot PCB c</w:t>
     </w:r>
     <w:r>
       <w:t>omponenten</w:t>
     </w:r>
-    <w:proofErr w:type="gramEnd"/>
     <w:r>
       <w:tab/>
     </w:r>
     <w:r>
       <w:tab/>
     </w:r>
-    <w:proofErr w:type="gramStart"/>
     <w:r>
       <w:t>ECC chip</w:t>
     </w:r>
-    <w:proofErr w:type="gramEnd"/>
   </w:p>
 </w:hdr>
 </file>
@@ -19248,6 +19990,155 @@
     </w:lvl>
   </w:abstractNum>
   <w:abstractNum w:abstractNumId="34" w15:restartNumberingAfterBreak="0">
+    <w:nsid w:val="2F324539"/>
+    <w:multiLevelType w:val="multilevel"/>
+    <w:tmpl w:val="C52474A6"/>
+    <w:lvl w:ilvl="0">
+      <w:start w:val="1"/>
+      <w:numFmt w:val="bullet"/>
+      <w:lvlText w:val=""/>
+      <w:lvlJc w:val="left"/>
+      <w:pPr>
+        <w:tabs>
+          <w:tab w:val="num" w:pos="720"/>
+        </w:tabs>
+        <w:ind w:left="720" w:hanging="360"/>
+      </w:pPr>
+      <w:rPr>
+        <w:rFonts w:ascii="Symbol" w:hAnsi="Symbol" w:hint="default"/>
+        <w:sz w:val="20"/>
+      </w:rPr>
+    </w:lvl>
+    <w:lvl w:ilvl="1" w:tentative="1">
+      <w:start w:val="1"/>
+      <w:numFmt w:val="bullet"/>
+      <w:lvlText w:val="o"/>
+      <w:lvlJc w:val="left"/>
+      <w:pPr>
+        <w:tabs>
+          <w:tab w:val="num" w:pos="1440"/>
+        </w:tabs>
+        <w:ind w:left="1440" w:hanging="360"/>
+      </w:pPr>
+      <w:rPr>
+        <w:rFonts w:ascii="Courier New" w:hAnsi="Courier New" w:hint="default"/>
+        <w:sz w:val="20"/>
+      </w:rPr>
+    </w:lvl>
+    <w:lvl w:ilvl="2" w:tentative="1">
+      <w:start w:val="1"/>
+      <w:numFmt w:val="bullet"/>
+      <w:lvlText w:val=""/>
+      <w:lvlJc w:val="left"/>
+      <w:pPr>
+        <w:tabs>
+          <w:tab w:val="num" w:pos="2160"/>
+        </w:tabs>
+        <w:ind w:left="2160" w:hanging="360"/>
+      </w:pPr>
+      <w:rPr>
+        <w:rFonts w:ascii="Wingdings" w:hAnsi="Wingdings" w:hint="default"/>
+        <w:sz w:val="20"/>
+      </w:rPr>
+    </w:lvl>
+    <w:lvl w:ilvl="3" w:tentative="1">
+      <w:start w:val="1"/>
+      <w:numFmt w:val="bullet"/>
+      <w:lvlText w:val=""/>
+      <w:lvlJc w:val="left"/>
+      <w:pPr>
+        <w:tabs>
+          <w:tab w:val="num" w:pos="2880"/>
+        </w:tabs>
+        <w:ind w:left="2880" w:hanging="360"/>
+      </w:pPr>
+      <w:rPr>
+        <w:rFonts w:ascii="Wingdings" w:hAnsi="Wingdings" w:hint="default"/>
+        <w:sz w:val="20"/>
+      </w:rPr>
+    </w:lvl>
+    <w:lvl w:ilvl="4" w:tentative="1">
+      <w:start w:val="1"/>
+      <w:numFmt w:val="bullet"/>
+      <w:lvlText w:val=""/>
+      <w:lvlJc w:val="left"/>
+      <w:pPr>
+        <w:tabs>
+          <w:tab w:val="num" w:pos="3600"/>
+        </w:tabs>
+        <w:ind w:left="3600" w:hanging="360"/>
+      </w:pPr>
+      <w:rPr>
+        <w:rFonts w:ascii="Wingdings" w:hAnsi="Wingdings" w:hint="default"/>
+        <w:sz w:val="20"/>
+      </w:rPr>
+    </w:lvl>
+    <w:lvl w:ilvl="5" w:tentative="1">
+      <w:start w:val="1"/>
+      <w:numFmt w:val="bullet"/>
+      <w:lvlText w:val=""/>
+      <w:lvlJc w:val="left"/>
+      <w:pPr>
+        <w:tabs>
+          <w:tab w:val="num" w:pos="4320"/>
+        </w:tabs>
+        <w:ind w:left="4320" w:hanging="360"/>
+      </w:pPr>
+      <w:rPr>
+        <w:rFonts w:ascii="Wingdings" w:hAnsi="Wingdings" w:hint="default"/>
+        <w:sz w:val="20"/>
+      </w:rPr>
+    </w:lvl>
+    <w:lvl w:ilvl="6" w:tentative="1">
+      <w:start w:val="1"/>
+      <w:numFmt w:val="bullet"/>
+      <w:lvlText w:val=""/>
+      <w:lvlJc w:val="left"/>
+      <w:pPr>
+        <w:tabs>
+          <w:tab w:val="num" w:pos="5040"/>
+        </w:tabs>
+        <w:ind w:left="5040" w:hanging="360"/>
+      </w:pPr>
+      <w:rPr>
+        <w:rFonts w:ascii="Wingdings" w:hAnsi="Wingdings" w:hint="default"/>
+        <w:sz w:val="20"/>
+      </w:rPr>
+    </w:lvl>
+    <w:lvl w:ilvl="7" w:tentative="1">
+      <w:start w:val="1"/>
+      <w:numFmt w:val="bullet"/>
+      <w:lvlText w:val=""/>
+      <w:lvlJc w:val="left"/>
+      <w:pPr>
+        <w:tabs>
+          <w:tab w:val="num" w:pos="5760"/>
+        </w:tabs>
+        <w:ind w:left="5760" w:hanging="360"/>
+      </w:pPr>
+      <w:rPr>
+        <w:rFonts w:ascii="Wingdings" w:hAnsi="Wingdings" w:hint="default"/>
+        <w:sz w:val="20"/>
+      </w:rPr>
+    </w:lvl>
+    <w:lvl w:ilvl="8" w:tentative="1">
+      <w:start w:val="1"/>
+      <w:numFmt w:val="bullet"/>
+      <w:lvlText w:val=""/>
+      <w:lvlJc w:val="left"/>
+      <w:pPr>
+        <w:tabs>
+          <w:tab w:val="num" w:pos="6480"/>
+        </w:tabs>
+        <w:ind w:left="6480" w:hanging="360"/>
+      </w:pPr>
+      <w:rPr>
+        <w:rFonts w:ascii="Wingdings" w:hAnsi="Wingdings" w:hint="default"/>
+        <w:sz w:val="20"/>
+      </w:rPr>
+    </w:lvl>
+  </w:abstractNum>
+  <w:abstractNum w:abstractNumId="35" w15:restartNumberingAfterBreak="0">
     <w:nsid w:val="32291833"/>
     <w:multiLevelType w:val="hybridMultilevel"/>
     <w:tmpl w:val="0FE4165C"/>
@@ -19360,7 +20251,7 @@
       </w:rPr>
     </w:lvl>
   </w:abstractNum>
-  <w:abstractNum w:abstractNumId="35" w15:restartNumberingAfterBreak="0">
+  <w:abstractNum w:abstractNumId="36" w15:restartNumberingAfterBreak="0">
     <w:nsid w:val="34253C89"/>
     <w:multiLevelType w:val="hybridMultilevel"/>
     <w:tmpl w:val="D77AE6C4"/>
@@ -19472,7 +20363,7 @@
       </w:rPr>
     </w:lvl>
   </w:abstractNum>
-  <w:abstractNum w:abstractNumId="36" w15:restartNumberingAfterBreak="0">
+  <w:abstractNum w:abstractNumId="37" w15:restartNumberingAfterBreak="0">
     <w:nsid w:val="34416F2C"/>
     <w:multiLevelType w:val="hybridMultilevel"/>
     <w:tmpl w:val="9B2A0ADC"/>
@@ -19585,7 +20476,7 @@
       </w:rPr>
     </w:lvl>
   </w:abstractNum>
-  <w:abstractNum w:abstractNumId="37" w15:restartNumberingAfterBreak="0">
+  <w:abstractNum w:abstractNumId="38" w15:restartNumberingAfterBreak="0">
     <w:nsid w:val="366C0D2B"/>
     <w:multiLevelType w:val="hybridMultilevel"/>
     <w:tmpl w:val="C6CE5D44"/>
@@ -19698,7 +20589,7 @@
       </w:rPr>
     </w:lvl>
   </w:abstractNum>
-  <w:abstractNum w:abstractNumId="38" w15:restartNumberingAfterBreak="0">
+  <w:abstractNum w:abstractNumId="39" w15:restartNumberingAfterBreak="0">
     <w:nsid w:val="3B637E71"/>
     <w:multiLevelType w:val="hybridMultilevel"/>
     <w:tmpl w:val="FE746B66"/>
@@ -19811,7 +20702,7 @@
       </w:rPr>
     </w:lvl>
   </w:abstractNum>
-  <w:abstractNum w:abstractNumId="39" w15:restartNumberingAfterBreak="0">
+  <w:abstractNum w:abstractNumId="40" w15:restartNumberingAfterBreak="0">
     <w:nsid w:val="3C3E5D87"/>
     <w:multiLevelType w:val="hybridMultilevel"/>
     <w:tmpl w:val="8C365678"/>
@@ -19924,7 +20815,7 @@
       </w:rPr>
     </w:lvl>
   </w:abstractNum>
-  <w:abstractNum w:abstractNumId="40" w15:restartNumberingAfterBreak="0">
+  <w:abstractNum w:abstractNumId="41" w15:restartNumberingAfterBreak="0">
     <w:nsid w:val="3CD1597C"/>
     <w:multiLevelType w:val="hybridMultilevel"/>
     <w:tmpl w:val="57061936"/>
@@ -20036,7 +20927,7 @@
       </w:rPr>
     </w:lvl>
   </w:abstractNum>
-  <w:abstractNum w:abstractNumId="41" w15:restartNumberingAfterBreak="0">
+  <w:abstractNum w:abstractNumId="42" w15:restartNumberingAfterBreak="0">
     <w:nsid w:val="4229574E"/>
     <w:multiLevelType w:val="hybridMultilevel"/>
     <w:tmpl w:val="1A2A300C"/>
@@ -20149,7 +21040,7 @@
       </w:rPr>
     </w:lvl>
   </w:abstractNum>
-  <w:abstractNum w:abstractNumId="42" w15:restartNumberingAfterBreak="0">
+  <w:abstractNum w:abstractNumId="43" w15:restartNumberingAfterBreak="0">
     <w:nsid w:val="4358512A"/>
     <w:multiLevelType w:val="hybridMultilevel"/>
     <w:tmpl w:val="03C88DAC"/>
@@ -20262,7 +21153,7 @@
       </w:rPr>
     </w:lvl>
   </w:abstractNum>
-  <w:abstractNum w:abstractNumId="43" w15:restartNumberingAfterBreak="0">
+  <w:abstractNum w:abstractNumId="44" w15:restartNumberingAfterBreak="0">
     <w:nsid w:val="450106E0"/>
     <w:multiLevelType w:val="hybridMultilevel"/>
     <w:tmpl w:val="ACACDACE"/>
@@ -20375,7 +21266,7 @@
       </w:rPr>
     </w:lvl>
   </w:abstractNum>
-  <w:abstractNum w:abstractNumId="44" w15:restartNumberingAfterBreak="0">
+  <w:abstractNum w:abstractNumId="45" w15:restartNumberingAfterBreak="0">
     <w:nsid w:val="48D84E1E"/>
     <w:multiLevelType w:val="hybridMultilevel"/>
     <w:tmpl w:val="4746B60E"/>
@@ -20488,7 +21379,7 @@
       </w:rPr>
     </w:lvl>
   </w:abstractNum>
-  <w:abstractNum w:abstractNumId="45" w15:restartNumberingAfterBreak="0">
+  <w:abstractNum w:abstractNumId="46" w15:restartNumberingAfterBreak="0">
     <w:nsid w:val="4BFF433C"/>
     <w:multiLevelType w:val="hybridMultilevel"/>
     <w:tmpl w:val="26363A30"/>
@@ -20601,7 +21492,7 @@
       </w:rPr>
     </w:lvl>
   </w:abstractNum>
-  <w:abstractNum w:abstractNumId="46" w15:restartNumberingAfterBreak="0">
+  <w:abstractNum w:abstractNumId="47" w15:restartNumberingAfterBreak="0">
     <w:nsid w:val="4E0716DC"/>
     <w:multiLevelType w:val="hybridMultilevel"/>
     <w:tmpl w:val="C40236D6"/>
@@ -20714,7 +21605,7 @@
       </w:rPr>
     </w:lvl>
   </w:abstractNum>
-  <w:abstractNum w:abstractNumId="47" w15:restartNumberingAfterBreak="0">
+  <w:abstractNum w:abstractNumId="48" w15:restartNumberingAfterBreak="0">
     <w:nsid w:val="504072F4"/>
     <w:multiLevelType w:val="hybridMultilevel"/>
     <w:tmpl w:val="7AA6AFAA"/>
@@ -20827,7 +21718,7 @@
       </w:rPr>
     </w:lvl>
   </w:abstractNum>
-  <w:abstractNum w:abstractNumId="48" w15:restartNumberingAfterBreak="0">
+  <w:abstractNum w:abstractNumId="49" w15:restartNumberingAfterBreak="0">
     <w:nsid w:val="510C7DAA"/>
     <w:multiLevelType w:val="hybridMultilevel"/>
     <w:tmpl w:val="7EFE5306"/>
@@ -20940,7 +21831,7 @@
       </w:rPr>
     </w:lvl>
   </w:abstractNum>
-  <w:abstractNum w:abstractNumId="49" w15:restartNumberingAfterBreak="0">
+  <w:abstractNum w:abstractNumId="50" w15:restartNumberingAfterBreak="0">
     <w:nsid w:val="51A02072"/>
     <w:multiLevelType w:val="hybridMultilevel"/>
     <w:tmpl w:val="1D9E8FB8"/>
@@ -21053,7 +21944,7 @@
       </w:rPr>
     </w:lvl>
   </w:abstractNum>
-  <w:abstractNum w:abstractNumId="50" w15:restartNumberingAfterBreak="0">
+  <w:abstractNum w:abstractNumId="51" w15:restartNumberingAfterBreak="0">
     <w:nsid w:val="523B68D4"/>
     <w:multiLevelType w:val="hybridMultilevel"/>
     <w:tmpl w:val="D4F8BA8E"/>
@@ -21166,7 +22057,7 @@
       </w:rPr>
     </w:lvl>
   </w:abstractNum>
-  <w:abstractNum w:abstractNumId="51" w15:restartNumberingAfterBreak="0">
+  <w:abstractNum w:abstractNumId="52" w15:restartNumberingAfterBreak="0">
     <w:nsid w:val="53151341"/>
     <w:multiLevelType w:val="hybridMultilevel"/>
     <w:tmpl w:val="88AEFA22"/>
@@ -21279,7 +22170,7 @@
       </w:rPr>
     </w:lvl>
   </w:abstractNum>
-  <w:abstractNum w:abstractNumId="52" w15:restartNumberingAfterBreak="0">
+  <w:abstractNum w:abstractNumId="53" w15:restartNumberingAfterBreak="0">
     <w:nsid w:val="540477FE"/>
     <w:multiLevelType w:val="hybridMultilevel"/>
     <w:tmpl w:val="5D284B20"/>
@@ -21391,7 +22282,7 @@
       </w:rPr>
     </w:lvl>
   </w:abstractNum>
-  <w:abstractNum w:abstractNumId="53" w15:restartNumberingAfterBreak="0">
+  <w:abstractNum w:abstractNumId="54" w15:restartNumberingAfterBreak="0">
     <w:nsid w:val="55753688"/>
     <w:multiLevelType w:val="hybridMultilevel"/>
     <w:tmpl w:val="7DD0FCDE"/>
@@ -21503,7 +22394,7 @@
       </w:rPr>
     </w:lvl>
   </w:abstractNum>
-  <w:abstractNum w:abstractNumId="54" w15:restartNumberingAfterBreak="0">
+  <w:abstractNum w:abstractNumId="55" w15:restartNumberingAfterBreak="0">
     <w:nsid w:val="557B2A58"/>
     <w:multiLevelType w:val="hybridMultilevel"/>
     <w:tmpl w:val="708C4562"/>
@@ -21616,7 +22507,7 @@
       </w:rPr>
     </w:lvl>
   </w:abstractNum>
-  <w:abstractNum w:abstractNumId="55" w15:restartNumberingAfterBreak="0">
+  <w:abstractNum w:abstractNumId="56" w15:restartNumberingAfterBreak="0">
     <w:nsid w:val="564E3E2A"/>
     <w:multiLevelType w:val="hybridMultilevel"/>
     <w:tmpl w:val="AD9259B4"/>
@@ -21729,7 +22620,7 @@
       </w:rPr>
     </w:lvl>
   </w:abstractNum>
-  <w:abstractNum w:abstractNumId="56" w15:restartNumberingAfterBreak="0">
+  <w:abstractNum w:abstractNumId="57" w15:restartNumberingAfterBreak="0">
     <w:nsid w:val="597513F1"/>
     <w:multiLevelType w:val="hybridMultilevel"/>
     <w:tmpl w:val="5372A88A"/>
@@ -21842,7 +22733,7 @@
       </w:rPr>
     </w:lvl>
   </w:abstractNum>
-  <w:abstractNum w:abstractNumId="57" w15:restartNumberingAfterBreak="0">
+  <w:abstractNum w:abstractNumId="58" w15:restartNumberingAfterBreak="0">
     <w:nsid w:val="5A7E5FD6"/>
     <w:multiLevelType w:val="hybridMultilevel"/>
     <w:tmpl w:val="CA2238D4"/>
@@ -21955,7 +22846,7 @@
       </w:rPr>
     </w:lvl>
   </w:abstractNum>
-  <w:abstractNum w:abstractNumId="58" w15:restartNumberingAfterBreak="0">
+  <w:abstractNum w:abstractNumId="59" w15:restartNumberingAfterBreak="0">
     <w:nsid w:val="5D7D5C8F"/>
     <w:multiLevelType w:val="hybridMultilevel"/>
     <w:tmpl w:val="4016FC48"/>
@@ -22068,7 +22959,7 @@
       </w:rPr>
     </w:lvl>
   </w:abstractNum>
-  <w:abstractNum w:abstractNumId="59" w15:restartNumberingAfterBreak="0">
+  <w:abstractNum w:abstractNumId="60" w15:restartNumberingAfterBreak="0">
     <w:nsid w:val="5E581D9F"/>
     <w:multiLevelType w:val="multilevel"/>
     <w:tmpl w:val="37CCDC1E"/>
@@ -22217,7 +23108,7 @@
       </w:rPr>
     </w:lvl>
   </w:abstractNum>
-  <w:abstractNum w:abstractNumId="60" w15:restartNumberingAfterBreak="0">
+  <w:abstractNum w:abstractNumId="61" w15:restartNumberingAfterBreak="0">
     <w:nsid w:val="5EF80A9E"/>
     <w:multiLevelType w:val="hybridMultilevel"/>
     <w:tmpl w:val="9AD8E2E8"/>
@@ -22330,7 +23221,7 @@
       </w:rPr>
     </w:lvl>
   </w:abstractNum>
-  <w:abstractNum w:abstractNumId="61" w15:restartNumberingAfterBreak="0">
+  <w:abstractNum w:abstractNumId="62" w15:restartNumberingAfterBreak="0">
     <w:nsid w:val="5FFB6413"/>
     <w:multiLevelType w:val="hybridMultilevel"/>
     <w:tmpl w:val="DCCACF38"/>
@@ -22443,7 +23334,7 @@
       </w:rPr>
     </w:lvl>
   </w:abstractNum>
-  <w:abstractNum w:abstractNumId="62" w15:restartNumberingAfterBreak="0">
+  <w:abstractNum w:abstractNumId="63" w15:restartNumberingAfterBreak="0">
     <w:nsid w:val="632E3488"/>
     <w:multiLevelType w:val="hybridMultilevel"/>
     <w:tmpl w:val="FB467338"/>
@@ -22556,7 +23447,7 @@
       </w:rPr>
     </w:lvl>
   </w:abstractNum>
-  <w:abstractNum w:abstractNumId="63" w15:restartNumberingAfterBreak="0">
+  <w:abstractNum w:abstractNumId="64" w15:restartNumberingAfterBreak="0">
     <w:nsid w:val="637D7A77"/>
     <w:multiLevelType w:val="hybridMultilevel"/>
     <w:tmpl w:val="0A1C4700"/>
@@ -22669,7 +23560,7 @@
       </w:rPr>
     </w:lvl>
   </w:abstractNum>
-  <w:abstractNum w:abstractNumId="64" w15:restartNumberingAfterBreak="0">
+  <w:abstractNum w:abstractNumId="65" w15:restartNumberingAfterBreak="0">
     <w:nsid w:val="644D3424"/>
     <w:multiLevelType w:val="hybridMultilevel"/>
     <w:tmpl w:val="29FC1E0A"/>
@@ -22782,7 +23673,7 @@
       </w:rPr>
     </w:lvl>
   </w:abstractNum>
-  <w:abstractNum w:abstractNumId="65" w15:restartNumberingAfterBreak="0">
+  <w:abstractNum w:abstractNumId="66" w15:restartNumberingAfterBreak="0">
     <w:nsid w:val="651F35E7"/>
     <w:multiLevelType w:val="hybridMultilevel"/>
     <w:tmpl w:val="BCDA6C58"/>
@@ -22895,7 +23786,7 @@
       </w:rPr>
     </w:lvl>
   </w:abstractNum>
-  <w:abstractNum w:abstractNumId="66" w15:restartNumberingAfterBreak="0">
+  <w:abstractNum w:abstractNumId="67" w15:restartNumberingAfterBreak="0">
     <w:nsid w:val="66521EBA"/>
     <w:multiLevelType w:val="hybridMultilevel"/>
     <w:tmpl w:val="F32C6FC8"/>
@@ -23008,7 +23899,7 @@
       </w:rPr>
     </w:lvl>
   </w:abstractNum>
-  <w:abstractNum w:abstractNumId="67" w15:restartNumberingAfterBreak="0">
+  <w:abstractNum w:abstractNumId="68" w15:restartNumberingAfterBreak="0">
     <w:nsid w:val="67056837"/>
     <w:multiLevelType w:val="hybridMultilevel"/>
     <w:tmpl w:val="91921294"/>
@@ -23121,7 +24012,7 @@
       </w:rPr>
     </w:lvl>
   </w:abstractNum>
-  <w:abstractNum w:abstractNumId="68" w15:restartNumberingAfterBreak="0">
+  <w:abstractNum w:abstractNumId="69" w15:restartNumberingAfterBreak="0">
     <w:nsid w:val="679349C3"/>
     <w:multiLevelType w:val="hybridMultilevel"/>
     <w:tmpl w:val="115A0B9E"/>
@@ -23234,7 +24125,7 @@
       </w:rPr>
     </w:lvl>
   </w:abstractNum>
-  <w:abstractNum w:abstractNumId="69" w15:restartNumberingAfterBreak="0">
+  <w:abstractNum w:abstractNumId="70" w15:restartNumberingAfterBreak="0">
     <w:nsid w:val="6E6A3A9B"/>
     <w:multiLevelType w:val="hybridMultilevel"/>
     <w:tmpl w:val="95D208A2"/>
@@ -23347,7 +24238,7 @@
       </w:rPr>
     </w:lvl>
   </w:abstractNum>
-  <w:abstractNum w:abstractNumId="70" w15:restartNumberingAfterBreak="0">
+  <w:abstractNum w:abstractNumId="71" w15:restartNumberingAfterBreak="0">
     <w:nsid w:val="6F4A2F3E"/>
     <w:multiLevelType w:val="hybridMultilevel"/>
     <w:tmpl w:val="1ACED72E"/>
@@ -23460,7 +24351,7 @@
       </w:rPr>
     </w:lvl>
   </w:abstractNum>
-  <w:abstractNum w:abstractNumId="71" w15:restartNumberingAfterBreak="0">
+  <w:abstractNum w:abstractNumId="72" w15:restartNumberingAfterBreak="0">
     <w:nsid w:val="71C90956"/>
     <w:multiLevelType w:val="hybridMultilevel"/>
     <w:tmpl w:val="DAD84AAC"/>
@@ -23572,7 +24463,7 @@
       </w:rPr>
     </w:lvl>
   </w:abstractNum>
-  <w:abstractNum w:abstractNumId="72" w15:restartNumberingAfterBreak="0">
+  <w:abstractNum w:abstractNumId="73" w15:restartNumberingAfterBreak="0">
     <w:nsid w:val="741A5DB8"/>
     <w:multiLevelType w:val="hybridMultilevel"/>
     <w:tmpl w:val="3BDE4022"/>
@@ -23685,7 +24576,7 @@
       </w:rPr>
     </w:lvl>
   </w:abstractNum>
-  <w:abstractNum w:abstractNumId="73" w15:restartNumberingAfterBreak="0">
+  <w:abstractNum w:abstractNumId="74" w15:restartNumberingAfterBreak="0">
     <w:nsid w:val="74C87631"/>
     <w:multiLevelType w:val="hybridMultilevel"/>
     <w:tmpl w:val="F7BCA7E2"/>
@@ -23798,7 +24689,7 @@
       </w:rPr>
     </w:lvl>
   </w:abstractNum>
-  <w:abstractNum w:abstractNumId="74" w15:restartNumberingAfterBreak="0">
+  <w:abstractNum w:abstractNumId="75" w15:restartNumberingAfterBreak="0">
     <w:nsid w:val="74D141A1"/>
     <w:multiLevelType w:val="hybridMultilevel"/>
     <w:tmpl w:val="F85469FE"/>
@@ -23911,7 +24802,7 @@
       </w:rPr>
     </w:lvl>
   </w:abstractNum>
-  <w:abstractNum w:abstractNumId="75" w15:restartNumberingAfterBreak="0">
+  <w:abstractNum w:abstractNumId="76" w15:restartNumberingAfterBreak="0">
     <w:nsid w:val="75E525F6"/>
     <w:multiLevelType w:val="hybridMultilevel"/>
     <w:tmpl w:val="F81282EA"/>
@@ -24024,7 +24915,7 @@
       </w:rPr>
     </w:lvl>
   </w:abstractNum>
-  <w:abstractNum w:abstractNumId="76" w15:restartNumberingAfterBreak="0">
+  <w:abstractNum w:abstractNumId="77" w15:restartNumberingAfterBreak="0">
     <w:nsid w:val="75F338E4"/>
     <w:multiLevelType w:val="hybridMultilevel"/>
     <w:tmpl w:val="84AAE260"/>
@@ -24137,7 +25028,7 @@
       </w:rPr>
     </w:lvl>
   </w:abstractNum>
-  <w:abstractNum w:abstractNumId="77" w15:restartNumberingAfterBreak="0">
+  <w:abstractNum w:abstractNumId="78" w15:restartNumberingAfterBreak="0">
     <w:nsid w:val="791851F9"/>
     <w:multiLevelType w:val="hybridMultilevel"/>
     <w:tmpl w:val="5DCE1C32"/>
@@ -24250,7 +25141,7 @@
       </w:rPr>
     </w:lvl>
   </w:abstractNum>
-  <w:abstractNum w:abstractNumId="78" w15:restartNumberingAfterBreak="0">
+  <w:abstractNum w:abstractNumId="79" w15:restartNumberingAfterBreak="0">
     <w:nsid w:val="7A444A60"/>
     <w:multiLevelType w:val="hybridMultilevel"/>
     <w:tmpl w:val="5DA2727C"/>
@@ -24363,7 +25254,7 @@
       </w:rPr>
     </w:lvl>
   </w:abstractNum>
-  <w:abstractNum w:abstractNumId="79" w15:restartNumberingAfterBreak="0">
+  <w:abstractNum w:abstractNumId="80" w15:restartNumberingAfterBreak="0">
     <w:nsid w:val="7B6356A5"/>
     <w:multiLevelType w:val="hybridMultilevel"/>
     <w:tmpl w:val="200260D6"/>
@@ -24476,7 +25367,7 @@
       </w:rPr>
     </w:lvl>
   </w:abstractNum>
-  <w:abstractNum w:abstractNumId="80" w15:restartNumberingAfterBreak="0">
+  <w:abstractNum w:abstractNumId="81" w15:restartNumberingAfterBreak="0">
     <w:nsid w:val="7D5C78F2"/>
     <w:multiLevelType w:val="hybridMultilevel"/>
     <w:tmpl w:val="1B829CD4"/>
@@ -24596,28 +25487,28 @@
     <w:abstractNumId w:val="1"/>
   </w:num>
   <w:num w:numId="3" w16cid:durableId="789128436">
-    <w:abstractNumId w:val="46"/>
+    <w:abstractNumId w:val="47"/>
   </w:num>
   <w:num w:numId="4" w16cid:durableId="1848787272">
-    <w:abstractNumId w:val="53"/>
+    <w:abstractNumId w:val="54"/>
   </w:num>
   <w:num w:numId="5" w16cid:durableId="356471441">
-    <w:abstractNumId w:val="35"/>
+    <w:abstractNumId w:val="36"/>
   </w:num>
   <w:num w:numId="6" w16cid:durableId="743836020">
-    <w:abstractNumId w:val="36"/>
+    <w:abstractNumId w:val="37"/>
   </w:num>
   <w:num w:numId="7" w16cid:durableId="674382978">
-    <w:abstractNumId w:val="51"/>
+    <w:abstractNumId w:val="52"/>
   </w:num>
   <w:num w:numId="8" w16cid:durableId="1714619866">
     <w:abstractNumId w:val="31"/>
   </w:num>
   <w:num w:numId="9" w16cid:durableId="2091583283">
-    <w:abstractNumId w:val="64"/>
+    <w:abstractNumId w:val="65"/>
   </w:num>
   <w:num w:numId="10" w16cid:durableId="717321902">
-    <w:abstractNumId w:val="41"/>
+    <w:abstractNumId w:val="42"/>
   </w:num>
   <w:num w:numId="11" w16cid:durableId="1163350528">
     <w:abstractNumId w:val="18"/>
@@ -24626,19 +25517,19 @@
     <w:abstractNumId w:val="11"/>
   </w:num>
   <w:num w:numId="13" w16cid:durableId="1150249162">
-    <w:abstractNumId w:val="63"/>
+    <w:abstractNumId w:val="64"/>
   </w:num>
   <w:num w:numId="14" w16cid:durableId="693072010">
-    <w:abstractNumId w:val="37"/>
+    <w:abstractNumId w:val="38"/>
   </w:num>
   <w:num w:numId="15" w16cid:durableId="349912257">
-    <w:abstractNumId w:val="70"/>
+    <w:abstractNumId w:val="71"/>
   </w:num>
   <w:num w:numId="16" w16cid:durableId="1681615006">
-    <w:abstractNumId w:val="50"/>
+    <w:abstractNumId w:val="51"/>
   </w:num>
   <w:num w:numId="17" w16cid:durableId="1941257141">
-    <w:abstractNumId w:val="44"/>
+    <w:abstractNumId w:val="45"/>
   </w:num>
   <w:num w:numId="18" w16cid:durableId="1130131433">
     <w:abstractNumId w:val="7"/>
@@ -24647,25 +25538,25 @@
     <w:abstractNumId w:val="5"/>
   </w:num>
   <w:num w:numId="20" w16cid:durableId="644089116">
-    <w:abstractNumId w:val="34"/>
+    <w:abstractNumId w:val="35"/>
   </w:num>
   <w:num w:numId="21" w16cid:durableId="100687704">
-    <w:abstractNumId w:val="79"/>
+    <w:abstractNumId w:val="80"/>
   </w:num>
   <w:num w:numId="22" w16cid:durableId="1046561978">
-    <w:abstractNumId w:val="58"/>
+    <w:abstractNumId w:val="59"/>
   </w:num>
   <w:num w:numId="23" w16cid:durableId="1998806147">
-    <w:abstractNumId w:val="47"/>
+    <w:abstractNumId w:val="48"/>
   </w:num>
   <w:num w:numId="24" w16cid:durableId="233591470">
     <w:abstractNumId w:val="28"/>
   </w:num>
   <w:num w:numId="25" w16cid:durableId="121195139">
-    <w:abstractNumId w:val="54"/>
+    <w:abstractNumId w:val="55"/>
   </w:num>
   <w:num w:numId="26" w16cid:durableId="1176307363">
-    <w:abstractNumId w:val="56"/>
+    <w:abstractNumId w:val="57"/>
   </w:num>
   <w:num w:numId="27" w16cid:durableId="1161505821">
     <w:abstractNumId w:val="15"/>
@@ -24674,22 +25565,22 @@
     <w:abstractNumId w:val="3"/>
   </w:num>
   <w:num w:numId="29" w16cid:durableId="1857763406">
-    <w:abstractNumId w:val="38"/>
+    <w:abstractNumId w:val="39"/>
   </w:num>
   <w:num w:numId="30" w16cid:durableId="653529482">
     <w:abstractNumId w:val="4"/>
   </w:num>
   <w:num w:numId="31" w16cid:durableId="1548105315">
-    <w:abstractNumId w:val="43"/>
+    <w:abstractNumId w:val="44"/>
   </w:num>
   <w:num w:numId="32" w16cid:durableId="880627598">
-    <w:abstractNumId w:val="49"/>
+    <w:abstractNumId w:val="50"/>
   </w:num>
   <w:num w:numId="33" w16cid:durableId="1852914999">
     <w:abstractNumId w:val="22"/>
   </w:num>
   <w:num w:numId="34" w16cid:durableId="1724712719">
-    <w:abstractNumId w:val="72"/>
+    <w:abstractNumId w:val="73"/>
   </w:num>
   <w:num w:numId="35" w16cid:durableId="2019887224">
     <w:abstractNumId w:val="27"/>
@@ -24698,10 +25589,10 @@
     <w:abstractNumId w:val="29"/>
   </w:num>
   <w:num w:numId="37" w16cid:durableId="2064450452">
-    <w:abstractNumId w:val="75"/>
+    <w:abstractNumId w:val="76"/>
   </w:num>
   <w:num w:numId="38" w16cid:durableId="988097607">
-    <w:abstractNumId w:val="67"/>
+    <w:abstractNumId w:val="68"/>
   </w:num>
   <w:num w:numId="39" w16cid:durableId="613251167">
     <w:abstractNumId w:val="24"/>
@@ -24713,7 +25604,7 @@
     <w:abstractNumId w:val="6"/>
   </w:num>
   <w:num w:numId="42" w16cid:durableId="1177385931">
-    <w:abstractNumId w:val="61"/>
+    <w:abstractNumId w:val="62"/>
   </w:num>
   <w:num w:numId="43" w16cid:durableId="1029523250">
     <w:abstractNumId w:val="12"/>
@@ -24776,22 +25667,22 @@
     </w:lvlOverride>
   </w:num>
   <w:num w:numId="45" w16cid:durableId="717558721">
-    <w:abstractNumId w:val="74"/>
+    <w:abstractNumId w:val="75"/>
   </w:num>
   <w:num w:numId="46" w16cid:durableId="141433691">
     <w:abstractNumId w:val="13"/>
   </w:num>
   <w:num w:numId="47" w16cid:durableId="1626233528">
-    <w:abstractNumId w:val="71"/>
+    <w:abstractNumId w:val="72"/>
   </w:num>
   <w:num w:numId="48" w16cid:durableId="1619022656">
-    <w:abstractNumId w:val="65"/>
+    <w:abstractNumId w:val="66"/>
   </w:num>
   <w:num w:numId="49" w16cid:durableId="936015151">
-    <w:abstractNumId w:val="45"/>
+    <w:abstractNumId w:val="46"/>
   </w:num>
   <w:num w:numId="50" w16cid:durableId="1175345243">
-    <w:abstractNumId w:val="68"/>
+    <w:abstractNumId w:val="69"/>
   </w:num>
   <w:num w:numId="51" w16cid:durableId="463892170">
     <w:abstractNumId w:val="20"/>
@@ -24803,7 +25694,7 @@
     <w:abstractNumId w:val="9"/>
   </w:num>
   <w:num w:numId="54" w16cid:durableId="2018653919">
-    <w:abstractNumId w:val="57"/>
+    <w:abstractNumId w:val="58"/>
   </w:num>
   <w:num w:numId="55" w16cid:durableId="413095000">
     <w:abstractNumId w:val="8"/>
@@ -24812,7 +25703,7 @@
     <w:abstractNumId w:val="17"/>
   </w:num>
   <w:num w:numId="57" w16cid:durableId="1355304957">
-    <w:abstractNumId w:val="66"/>
+    <w:abstractNumId w:val="67"/>
   </w:num>
   <w:num w:numId="58" w16cid:durableId="595209479">
     <w:abstractNumId w:val="30"/>
@@ -24821,7 +25712,7 @@
     <w:abstractNumId w:val="25"/>
   </w:num>
   <w:num w:numId="60" w16cid:durableId="1713535263">
-    <w:abstractNumId w:val="78"/>
+    <w:abstractNumId w:val="79"/>
   </w:num>
   <w:num w:numId="61" w16cid:durableId="180318862">
     <w:abstractNumId w:val="0"/>
@@ -24833,7 +25724,7 @@
     <w:abstractNumId w:val="33"/>
   </w:num>
   <w:num w:numId="64" w16cid:durableId="1479305054">
-    <w:abstractNumId w:val="55"/>
+    <w:abstractNumId w:val="56"/>
   </w:num>
   <w:num w:numId="65" w16cid:durableId="749737118">
     <w:abstractNumId w:val="21"/>
@@ -24842,19 +25733,19 @@
     <w:abstractNumId w:val="2"/>
   </w:num>
   <w:num w:numId="67" w16cid:durableId="1738938323">
-    <w:abstractNumId w:val="77"/>
+    <w:abstractNumId w:val="78"/>
   </w:num>
   <w:num w:numId="68" w16cid:durableId="1028868218">
-    <w:abstractNumId w:val="40"/>
+    <w:abstractNumId w:val="41"/>
   </w:num>
   <w:num w:numId="69" w16cid:durableId="18896586">
+    <w:abstractNumId w:val="61"/>
+  </w:num>
+  <w:num w:numId="70" w16cid:durableId="286011553">
     <w:abstractNumId w:val="60"/>
   </w:num>
-  <w:num w:numId="70" w16cid:durableId="286011553">
-    <w:abstractNumId w:val="59"/>
-  </w:num>
   <w:num w:numId="71" w16cid:durableId="1250040698">
-    <w:abstractNumId w:val="52"/>
+    <w:abstractNumId w:val="53"/>
   </w:num>
   <w:num w:numId="72" w16cid:durableId="1192066717">
     <w:abstractNumId w:val="23"/>
@@ -24863,34 +25754,37 @@
     <w:abstractNumId w:val="14"/>
   </w:num>
   <w:num w:numId="74" w16cid:durableId="1624772097">
-    <w:abstractNumId w:val="62"/>
+    <w:abstractNumId w:val="63"/>
   </w:num>
   <w:num w:numId="75" w16cid:durableId="518545594">
-    <w:abstractNumId w:val="80"/>
+    <w:abstractNumId w:val="81"/>
   </w:num>
   <w:num w:numId="76" w16cid:durableId="978650203">
-    <w:abstractNumId w:val="42"/>
+    <w:abstractNumId w:val="43"/>
   </w:num>
   <w:num w:numId="77" w16cid:durableId="1053889101">
-    <w:abstractNumId w:val="48"/>
+    <w:abstractNumId w:val="49"/>
   </w:num>
   <w:num w:numId="78" w16cid:durableId="1663389904">
-    <w:abstractNumId w:val="73"/>
+    <w:abstractNumId w:val="74"/>
   </w:num>
   <w:num w:numId="79" w16cid:durableId="809517631">
     <w:abstractNumId w:val="19"/>
   </w:num>
   <w:num w:numId="80" w16cid:durableId="1915697748">
-    <w:abstractNumId w:val="76"/>
+    <w:abstractNumId w:val="77"/>
   </w:num>
   <w:num w:numId="81" w16cid:durableId="1301419200">
     <w:abstractNumId w:val="32"/>
   </w:num>
   <w:num w:numId="82" w16cid:durableId="378941063">
-    <w:abstractNumId w:val="39"/>
+    <w:abstractNumId w:val="40"/>
   </w:num>
   <w:num w:numId="83" w16cid:durableId="26374723">
-    <w:abstractNumId w:val="69"/>
+    <w:abstractNumId w:val="70"/>
+  </w:num>
+  <w:num w:numId="84" w16cid:durableId="791830485">
+    <w:abstractNumId w:val="34"/>
   </w:num>
   <w:numIdMacAtCleanup w:val="62"/>
 </w:numbering>

</xml_diff>

<commit_message>
5V boost en accelerometer
</commit_message>
<xml_diff>
--- a/Componenten.docx
+++ b/Componenten.docx
@@ -6641,8 +6641,13 @@
           <w:lang w:val="en-US"/>
         </w:rPr>
       </w:pPr>
-      <w:r>
-        <w:t>EEC chip: elliptische curve bereke</w:t>
+      <w:proofErr w:type="gramStart"/>
+      <w:r>
+        <w:t>EEC chip</w:t>
+      </w:r>
+      <w:proofErr w:type="gramEnd"/>
+      <w:r>
+        <w:t>: elliptische curve bereke</w:t>
       </w:r>
       <w:r>
         <w:t>ning</w:t>
@@ -6819,11 +6824,16 @@
       <w:r>
         <w:t xml:space="preserve">externe </w:t>
       </w:r>
+      <w:proofErr w:type="gramStart"/>
       <w:r>
         <w:t>EEC c</w:t>
       </w:r>
       <w:r>
-        <w:t>hip)</w:t>
+        <w:t>hip</w:t>
+      </w:r>
+      <w:proofErr w:type="gramEnd"/>
+      <w:r>
+        <w:t>)</w:t>
       </w:r>
     </w:p>
     <w:p>
@@ -7117,8 +7127,13 @@
             <w:pPr>
               <w:spacing w:line="240" w:lineRule="auto"/>
             </w:pPr>
-            <w:r>
-              <w:t>Debug / utils</w:t>
+            <w:proofErr w:type="gramStart"/>
+            <w:r>
+              <w:t>Debug /</w:t>
+            </w:r>
+            <w:proofErr w:type="gramEnd"/>
+            <w:r>
+              <w:t xml:space="preserve"> utils</w:t>
             </w:r>
           </w:p>
         </w:tc>
@@ -7353,9 +7368,11 @@
             <w:pPr>
               <w:spacing w:line="240" w:lineRule="auto"/>
             </w:pPr>
+            <w:proofErr w:type="gramStart"/>
             <w:r>
               <w:t>QR matrix</w:t>
             </w:r>
+            <w:proofErr w:type="gramEnd"/>
           </w:p>
         </w:tc>
         <w:tc>
@@ -8263,8 +8280,16 @@
               <w:rPr>
                 <w:lang w:val="en-US"/>
               </w:rPr>
-              <w:t>1-3 ?</w:t>
-            </w:r>
+              <w:t>1-</w:t>
+            </w:r>
+            <w:proofErr w:type="gramStart"/>
+            <w:r>
+              <w:rPr>
+                <w:lang w:val="en-US"/>
+              </w:rPr>
+              <w:t>3 ?</w:t>
+            </w:r>
+            <w:proofErr w:type="gramEnd"/>
           </w:p>
           <w:p>
             <w:pPr>
@@ -9852,10 +9877,26 @@
         <w:t>868MHz voor Europa</w:t>
       </w:r>
       <w:r>
-        <w:t xml:space="preserve"> (863–870 MHz</w:t>
-      </w:r>
-      <w:r>
-        <w:t xml:space="preserve"> / EU868 / ISM band)</w:t>
+        <w:t xml:space="preserve"> (863–870 </w:t>
+      </w:r>
+      <w:proofErr w:type="gramStart"/>
+      <w:r>
+        <w:t>MHz</w:t>
+      </w:r>
+      <w:r>
+        <w:t xml:space="preserve"> /</w:t>
+      </w:r>
+      <w:proofErr w:type="gramEnd"/>
+      <w:r>
+        <w:t xml:space="preserve"> EU</w:t>
+      </w:r>
+      <w:proofErr w:type="gramStart"/>
+      <w:r>
+        <w:t>868 /</w:t>
+      </w:r>
+      <w:proofErr w:type="gramEnd"/>
+      <w:r>
+        <w:t xml:space="preserve"> ISM band)</w:t>
       </w:r>
     </w:p>
     <w:p>
@@ -9897,8 +9938,16 @@
         <w:rPr>
           <w:lang w:val="nl-NL"/>
         </w:rPr>
-        <w:t>ETSI EN 300 220-conform</w:t>
-      </w:r>
+        <w:t>ETSI EN 300 220-</w:t>
+      </w:r>
+      <w:proofErr w:type="gramStart"/>
+      <w:r>
+        <w:rPr>
+          <w:lang w:val="nl-NL"/>
+        </w:rPr>
+        <w:t>conform</w:t>
+      </w:r>
+      <w:proofErr w:type="gramEnd"/>
     </w:p>
     <w:p>
       <w:pPr>
@@ -9912,14 +9961,22 @@
         <w:rPr>
           <w:lang w:val="nl-NL"/>
         </w:rPr>
-        <w:t xml:space="preserve">RX-stroom ≈ 4–6 mA </w:t>
-      </w:r>
+        <w:t xml:space="preserve">RX-stroom ≈ 4–6 </w:t>
+      </w:r>
+      <w:proofErr w:type="gramStart"/>
       <w:r>
         <w:rPr>
           <w:lang w:val="nl-NL"/>
         </w:rPr>
+        <w:t xml:space="preserve">mA </w:t>
+      </w:r>
+      <w:r>
+        <w:rPr>
+          <w:lang w:val="nl-NL"/>
+        </w:rPr>
         <w:t>?</w:t>
       </w:r>
+      <w:proofErr w:type="gramEnd"/>
     </w:p>
     <w:p>
       <w:pPr>
@@ -9933,14 +9990,22 @@
         <w:rPr>
           <w:lang w:val="nl-NL"/>
         </w:rPr>
-        <w:t xml:space="preserve">TX-stroom ≈ 40–120 mA (afhankelijk van het vermogen) </w:t>
-      </w:r>
+        <w:t>TX-stroom ≈ 40–120 mA (afhankelijk van het vermogen</w:t>
+      </w:r>
+      <w:proofErr w:type="gramStart"/>
       <w:r>
         <w:rPr>
           <w:lang w:val="nl-NL"/>
         </w:rPr>
+        <w:t xml:space="preserve">) </w:t>
+      </w:r>
+      <w:r>
+        <w:rPr>
+          <w:lang w:val="nl-NL"/>
+        </w:rPr>
         <w:t>?</w:t>
       </w:r>
+      <w:proofErr w:type="gramEnd"/>
     </w:p>
     <w:p>
       <w:pPr>
@@ -10043,8 +10108,13 @@
           <w:numId w:val="67"/>
         </w:numPr>
       </w:pPr>
-      <w:r>
-        <w:t>RF matching en antenne design zelf doe</w:t>
+      <w:proofErr w:type="gramStart"/>
+      <w:r>
+        <w:t>RF matching</w:t>
+      </w:r>
+      <w:proofErr w:type="gramEnd"/>
+      <w:r>
+        <w:t xml:space="preserve"> en antenne design zelf doe</w:t>
       </w:r>
       <w:r>
         <w:t>n</w:t>
@@ -10197,8 +10267,13 @@
           <w:numId w:val="67"/>
         </w:numPr>
       </w:pPr>
-      <w:r>
-        <w:t>RF ontwerp moeilijker (antenne interface, ground keep-outs)</w:t>
+      <w:proofErr w:type="gramStart"/>
+      <w:r>
+        <w:t>RF ontwerp</w:t>
+      </w:r>
+      <w:proofErr w:type="gramEnd"/>
+      <w:r>
+        <w:t xml:space="preserve"> moeilijker (antenne interface, ground keep-outs)</w:t>
       </w:r>
     </w:p>
     <w:p>
@@ -10210,7 +10285,31 @@
         </w:numPr>
       </w:pPr>
       <w:r>
-        <w:t>Moeilijkere configuratie (EU regels, RF matching zelf instellen,…)</w:t>
+        <w:t>Moeilijkere configuratie (</w:t>
+      </w:r>
+      <w:proofErr w:type="gramStart"/>
+      <w:r>
+        <w:t>EU regels</w:t>
+      </w:r>
+      <w:proofErr w:type="gramEnd"/>
+      <w:r>
+        <w:t xml:space="preserve">, </w:t>
+      </w:r>
+      <w:proofErr w:type="gramStart"/>
+      <w:r>
+        <w:t>RF matching</w:t>
+      </w:r>
+      <w:proofErr w:type="gramEnd"/>
+      <w:r>
+        <w:t xml:space="preserve"> zelf </w:t>
+      </w:r>
+      <w:proofErr w:type="gramStart"/>
+      <w:r>
+        <w:t>instellen,…</w:t>
+      </w:r>
+      <w:proofErr w:type="gramEnd"/>
+      <w:r>
+        <w:t>)</w:t>
       </w:r>
     </w:p>
     <w:p>
@@ -10393,8 +10492,13 @@
           <w:numId w:val="75"/>
         </w:numPr>
       </w:pPr>
-      <w:r>
-        <w:t>met STM32WLE5CCU6</w:t>
+      <w:proofErr w:type="gramStart"/>
+      <w:r>
+        <w:t>met</w:t>
+      </w:r>
+      <w:proofErr w:type="gramEnd"/>
+      <w:r>
+        <w:t xml:space="preserve"> STM32WLE5CCU6</w:t>
       </w:r>
     </w:p>
     <w:p>
@@ -10405,12 +10509,14 @@
           <w:numId w:val="75"/>
         </w:numPr>
       </w:pPr>
+      <w:proofErr w:type="gramStart"/>
       <w:r>
         <w:t>UART</w:t>
       </w:r>
       <w:r>
         <w:t xml:space="preserve"> interface</w:t>
       </w:r>
+      <w:proofErr w:type="gramEnd"/>
     </w:p>
     <w:p>
       <w:pPr>
@@ -10424,7 +10530,15 @@
         <w:t>SPI mogelijk?? “</w:t>
       </w:r>
       <w:r>
-        <w:t xml:space="preserve">SPI voor communicatie met RF subsysteem van </w:t>
+        <w:t xml:space="preserve">SPI voor communicatie met </w:t>
+      </w:r>
+      <w:proofErr w:type="gramStart"/>
+      <w:r>
+        <w:t>RF subsysteem</w:t>
+      </w:r>
+      <w:proofErr w:type="gramEnd"/>
+      <w:r>
+        <w:t xml:space="preserve"> van </w:t>
       </w:r>
       <w:r>
         <w:t>STM32WLE5CCU6</w:t>
@@ -10986,8 +11100,13 @@
       <w:r>
         <w:t xml:space="preserve">, </w:t>
       </w:r>
-      <w:r>
-        <w:t>RF ervaring nodig</w:t>
+      <w:proofErr w:type="gramStart"/>
+      <w:r>
+        <w:t>RF ervaring</w:t>
+      </w:r>
+      <w:proofErr w:type="gramEnd"/>
+      <w:r>
+        <w:t xml:space="preserve"> nodig</w:t>
       </w:r>
     </w:p>
     <w:p>
@@ -10998,6 +11117,7 @@
           <w:numId w:val="75"/>
         </w:numPr>
       </w:pPr>
+      <w:proofErr w:type="gramStart"/>
       <w:r>
         <w:rPr>
           <w:b/>
@@ -11012,6 +11132,7 @@
         </w:rPr>
         <w:t xml:space="preserve"> antenne</w:t>
       </w:r>
+      <w:proofErr w:type="gramEnd"/>
       <w:r>
         <w:t>:</w:t>
       </w:r>
@@ -11078,8 +11199,21 @@
     </w:p>
     <w:p/>
     <w:p>
-      <w:r>
-        <w:t>FPC antenne voor prototype, eventueel PCB antenne later?</w:t>
+      <w:proofErr w:type="gramStart"/>
+      <w:r>
+        <w:t>FPC antenne</w:t>
+      </w:r>
+      <w:proofErr w:type="gramEnd"/>
+      <w:r>
+        <w:t xml:space="preserve"> voor prototype, eventueel </w:t>
+      </w:r>
+      <w:proofErr w:type="gramStart"/>
+      <w:r>
+        <w:t>PCB antenne</w:t>
+      </w:r>
+      <w:proofErr w:type="gramEnd"/>
+      <w:r>
+        <w:t xml:space="preserve"> later?</w:t>
       </w:r>
     </w:p>
     <w:p/>
@@ -11304,10 +11438,18 @@
         <w:t>8.6 cm</w:t>
       </w:r>
       <w:r>
-        <w:t xml:space="preserve">: ~ 73 Ω </w:t>
-      </w:r>
-      <w:r>
-        <w:t xml:space="preserve">, </w:t>
+        <w:t xml:space="preserve">: ~ 73 </w:t>
+      </w:r>
+      <w:proofErr w:type="gramStart"/>
+      <w:r>
+        <w:t xml:space="preserve">Ω </w:t>
+      </w:r>
+      <w:r>
+        <w:t>,</w:t>
+      </w:r>
+      <w:proofErr w:type="gramEnd"/>
+      <w:r>
+        <w:t xml:space="preserve"> </w:t>
       </w:r>
       <w:r>
         <w:t>VSWR</w:t>
@@ -11914,13 +12056,27 @@
         <w:rPr>
           <w:lang w:val="nl-NL"/>
         </w:rPr>
-        <w:t>a. FPC ante</w:t>
-      </w:r>
+        <w:t xml:space="preserve">a. </w:t>
+      </w:r>
+      <w:proofErr w:type="gramStart"/>
       <w:r>
         <w:rPr>
           <w:lang w:val="nl-NL"/>
         </w:rPr>
-        <w:t>nne lijkt best.</w:t>
+        <w:t>FPC ante</w:t>
+      </w:r>
+      <w:r>
+        <w:rPr>
+          <w:lang w:val="nl-NL"/>
+        </w:rPr>
+        <w:t>nne</w:t>
+      </w:r>
+      <w:proofErr w:type="gramEnd"/>
+      <w:r>
+        <w:rPr>
+          <w:lang w:val="nl-NL"/>
+        </w:rPr>
+        <w:t xml:space="preserve"> lijkt best.</w:t>
       </w:r>
     </w:p>
     <w:p>
@@ -14784,8 +14940,13 @@
         <w:t>1.54″ 200×200</w:t>
       </w:r>
       <w:r>
-        <w:t xml:space="preserve"> wordt veel gebruikt voor QR codes</w:t>
-      </w:r>
+        <w:t xml:space="preserve"> wordt veel gebruikt voor </w:t>
+      </w:r>
+      <w:proofErr w:type="gramStart"/>
+      <w:r>
+        <w:t>QR codes</w:t>
+      </w:r>
+      <w:proofErr w:type="gramEnd"/>
     </w:p>
     <w:p>
       <w:pPr>
@@ -14795,11 +14956,24 @@
           <w:numId w:val="66"/>
         </w:numPr>
       </w:pPr>
-      <w:r>
-        <w:t>QR code versie? (z</w:t>
-      </w:r>
-      <w:r>
-        <w:t xml:space="preserve">ie </w:t>
+      <w:proofErr w:type="gramStart"/>
+      <w:r>
+        <w:t>QR code</w:t>
+      </w:r>
+      <w:proofErr w:type="gramEnd"/>
+      <w:r>
+        <w:t xml:space="preserve"> versie? (</w:t>
+      </w:r>
+      <w:proofErr w:type="gramStart"/>
+      <w:r>
+        <w:t>z</w:t>
+      </w:r>
+      <w:r>
+        <w:t>ie</w:t>
+      </w:r>
+      <w:proofErr w:type="gramEnd"/>
+      <w:r>
+        <w:t xml:space="preserve"> </w:t>
       </w:r>
       <w:hyperlink r:id="rId96" w:history="1">
         <w:r>
@@ -14891,14 +15065,31 @@
           <w:b/>
           <w:bCs/>
         </w:rPr>
-        <w:t>Berekening grootst mogelijke QR code</w:t>
-      </w:r>
+        <w:t xml:space="preserve">Berekening grootst mogelijke </w:t>
+      </w:r>
+      <w:proofErr w:type="gramStart"/>
+      <w:r>
+        <w:rPr>
+          <w:b/>
+          <w:bCs/>
+        </w:rPr>
+        <w:t>QR code</w:t>
+      </w:r>
+      <w:proofErr w:type="gramEnd"/>
       <w:r>
         <w:t>:</w:t>
       </w:r>
       <w:r>
         <w:br/>
-        <w:t>De kleinste scanbare QR code is 1x1cm 38x38 pixel -&gt; 0.263mm per pixel</w:t>
+        <w:t xml:space="preserve">De kleinste scanbare </w:t>
+      </w:r>
+      <w:proofErr w:type="gramStart"/>
+      <w:r>
+        <w:t>QR code</w:t>
+      </w:r>
+      <w:proofErr w:type="gramEnd"/>
+      <w:r>
+        <w:t xml:space="preserve"> is 1x1cm 38x38 pixel -&gt; 0.263mm per pixel</w:t>
       </w:r>
       <w:r>
         <w:br/>
@@ -14906,11 +15097,27 @@
       </w:r>
       <w:r>
         <w:br/>
-        <w:t>kleinste mogelijke QR pixel is 2x2 pixels op het scherm (0.27x0.27mm)</w:t>
+        <w:t xml:space="preserve">kleinste mogelijke </w:t>
+      </w:r>
+      <w:proofErr w:type="gramStart"/>
+      <w:r>
+        <w:t>QR pixel</w:t>
+      </w:r>
+      <w:proofErr w:type="gramEnd"/>
+      <w:r>
+        <w:t xml:space="preserve"> is 2x2 pixels op het scherm (0.27x0.27mm)</w:t>
       </w:r>
       <w:r>
         <w:br/>
-        <w:t xml:space="preserve">dus grootste QR code is 97x97 (versie 20) </w:t>
+        <w:t xml:space="preserve">dus grootste </w:t>
+      </w:r>
+      <w:proofErr w:type="gramStart"/>
+      <w:r>
+        <w:t>QR code</w:t>
+      </w:r>
+      <w:proofErr w:type="gramEnd"/>
+      <w:r>
+        <w:t xml:space="preserve"> is 97x97 (versie 20) </w:t>
       </w:r>
       <w:r>
         <w:br/>
@@ -15215,7 +15422,21 @@
         <w:rPr>
           <w:lang w:val="en-US"/>
         </w:rPr>
-        <w:t xml:space="preserve"> ( 0.5mm pitch, </w:t>
+        <w:t xml:space="preserve"> </w:t>
+      </w:r>
+      <w:proofErr w:type="gramStart"/>
+      <w:r>
+        <w:rPr>
+          <w:lang w:val="en-US"/>
+        </w:rPr>
+        <w:t>( 0</w:t>
+      </w:r>
+      <w:proofErr w:type="gramEnd"/>
+      <w:r>
+        <w:rPr>
+          <w:lang w:val="en-US"/>
+        </w:rPr>
+        <w:t xml:space="preserve">.5mm pitch, </w:t>
       </w:r>
       <w:r>
         <w:rPr>
@@ -15340,10 +15561,18 @@
         <w:t>, AVDD/VSH</w:t>
       </w:r>
       <w:r>
-        <w:t>, VCOM</w:t>
-      </w:r>
-      <w:r>
-        <w:t>,…)</w:t>
+        <w:t xml:space="preserve">, </w:t>
+      </w:r>
+      <w:proofErr w:type="gramStart"/>
+      <w:r>
+        <w:t>VCOM</w:t>
+      </w:r>
+      <w:r>
+        <w:t>,…</w:t>
+      </w:r>
+      <w:proofErr w:type="gramEnd"/>
+      <w:r>
+        <w:t>)</w:t>
       </w:r>
     </w:p>
     <w:p>
@@ -15963,7 +16192,21 @@
         <w:rPr>
           <w:lang w:val="en-US"/>
         </w:rPr>
-        <w:t xml:space="preserve">8-pin JST PH 2.0mm SMT Header Horizontal Right Angle Side </w:t>
+        <w:t xml:space="preserve">8-pin JST PH 2.0mm SMT Header Horizontal </w:t>
+      </w:r>
+      <w:proofErr w:type="gramStart"/>
+      <w:r>
+        <w:rPr>
+          <w:lang w:val="en-US"/>
+        </w:rPr>
+        <w:t>Right Angle</w:t>
+      </w:r>
+      <w:proofErr w:type="gramEnd"/>
+      <w:r>
+        <w:rPr>
+          <w:lang w:val="en-US"/>
+        </w:rPr>
+        <w:t xml:space="preserve"> Side </w:t>
       </w:r>
       <w:r>
         <w:rPr>
@@ -16087,7 +16330,15 @@
       </w:r>
       <w:proofErr w:type="spellEnd"/>
       <w:r>
-        <w:t xml:space="preserve"> en GPS update </w:t>
+        <w:t xml:space="preserve"> en </w:t>
+      </w:r>
+      <w:proofErr w:type="gramStart"/>
+      <w:r>
+        <w:t>GPS update</w:t>
+      </w:r>
+      <w:proofErr w:type="gramEnd"/>
+      <w:r>
+        <w:t xml:space="preserve"> </w:t>
       </w:r>
       <w:proofErr w:type="spellStart"/>
       <w:r>
@@ -16128,7 +16379,27 @@
         <w:rPr>
           <w:lang w:val="en-US"/>
         </w:rPr>
-        <w:t>Low power (1-10µA)</w:t>
+        <w:t>Low power (</w:t>
+      </w:r>
+      <w:proofErr w:type="gramStart"/>
+      <w:r>
+        <w:rPr>
+          <w:lang w:val="en-US"/>
+        </w:rPr>
+        <w:t>&lt;5</w:t>
+      </w:r>
+      <w:r>
+        <w:rPr>
+          <w:lang w:val="en-US"/>
+        </w:rPr>
+        <w:t>µA</w:t>
+      </w:r>
+      <w:proofErr w:type="gramEnd"/>
+      <w:r>
+        <w:rPr>
+          <w:lang w:val="en-US"/>
+        </w:rPr>
+        <w:t>)</w:t>
       </w:r>
     </w:p>
     <w:p>
@@ -16268,42 +16539,6 @@
         <w:t>CU slaapt</w:t>
       </w:r>
     </w:p>
-    <w:p/>
-    <w:p>
-      <w:pPr>
-        <w:pStyle w:val="Heading2"/>
-      </w:pPr>
-      <w:bookmarkStart w:id="47" w:name="_Toc225503318"/>
-      <w:proofErr w:type="spellStart"/>
-      <w:r>
-        <w:lastRenderedPageBreak/>
-        <w:t>Opties</w:t>
-      </w:r>
-      <w:bookmarkEnd w:id="47"/>
-      <w:proofErr w:type="spellEnd"/>
-    </w:p>
-    <w:p>
-      <w:r>
-        <w:t>Moeilijk met hand te so</w:t>
-      </w:r>
-      <w:r>
-        <w:t xml:space="preserve">lderen -&gt; </w:t>
-      </w:r>
-      <w:proofErr w:type="spellStart"/>
-      <w:r>
-        <w:t>breakout</w:t>
-      </w:r>
-      <w:proofErr w:type="spellEnd"/>
-      <w:r>
-        <w:t xml:space="preserve"> voor prototype?</w:t>
-      </w:r>
-    </w:p>
-    <w:p/>
-    <w:p>
-      <w:r>
-        <w:t>LIS2DH12</w:t>
-      </w:r>
-    </w:p>
     <w:p>
       <w:pPr>
         <w:pStyle w:val="ListParagraph"/>
@@ -16311,41 +16546,24 @@
           <w:ilvl w:val="0"/>
           <w:numId w:val="66"/>
         </w:numPr>
-        <w:rPr>
-          <w:lang w:val="en-US"/>
-        </w:rPr>
-      </w:pPr>
-      <w:r>
-        <w:rPr>
-          <w:lang w:val="en-US"/>
-        </w:rPr>
-        <w:t>Ultra</w:t>
-      </w:r>
-      <w:r>
-        <w:rPr>
-          <w:lang w:val="en-US"/>
-        </w:rPr>
-        <w:noBreakHyphen/>
-        <w:t>low</w:t>
-      </w:r>
-      <w:r>
-        <w:rPr>
-          <w:lang w:val="en-US"/>
-        </w:rPr>
-        <w:noBreakHyphen/>
-        <w:t>power (</w:t>
-      </w:r>
-      <w:r>
-        <w:rPr>
-          <w:lang w:val="en-US"/>
-        </w:rPr>
-        <w:t>tot</w:t>
-      </w:r>
-      <w:r>
-        <w:rPr>
-          <w:lang w:val="en-US"/>
-        </w:rPr>
-        <w:t xml:space="preserve"> ~2 µA)</w:t>
+      </w:pPr>
+      <w:r>
+        <w:t>Kracht: tot 2g geparkeerd (</w:t>
+      </w:r>
+      <w:r>
+        <w:rPr>
+          <w:lang w:val="nl-NL"/>
+        </w:rPr>
+        <w:t>sabotage</w:t>
+      </w:r>
+      <w:r>
+        <w:rPr>
+          <w:lang w:val="nl-NL"/>
+        </w:rPr>
+        <w:t xml:space="preserve"> detectie</w:t>
+      </w:r>
+      <w:r>
+        <w:t>), tot 4g tijdens fietsen</w:t>
       </w:r>
     </w:p>
     <w:p>
@@ -16355,16 +16573,48 @@
           <w:ilvl w:val="0"/>
           <w:numId w:val="66"/>
         </w:numPr>
-        <w:rPr>
-          <w:lang w:val="en-US"/>
-        </w:rPr>
-      </w:pPr>
-      <w:r>
-        <w:rPr>
-          <w:lang w:val="en-US"/>
-        </w:rPr>
-        <w:t xml:space="preserve">I²C/SPI, </w:t>
-      </w:r>
+      </w:pPr>
+    </w:p>
+    <w:p/>
+    <w:p>
+      <w:pPr>
+        <w:pStyle w:val="Heading2"/>
+      </w:pPr>
+      <w:bookmarkStart w:id="47" w:name="_Toc225503318"/>
+      <w:proofErr w:type="spellStart"/>
+      <w:r>
+        <w:lastRenderedPageBreak/>
+        <w:t>Opties</w:t>
+      </w:r>
+      <w:bookmarkEnd w:id="47"/>
+      <w:proofErr w:type="spellEnd"/>
+    </w:p>
+    <w:p>
+      <w:r>
+        <w:t>Moeilijk met hand te so</w:t>
+      </w:r>
+      <w:r>
+        <w:t xml:space="preserve">lderen -&gt; </w:t>
+      </w:r>
+      <w:proofErr w:type="spellStart"/>
+      <w:r>
+        <w:t>breakout</w:t>
+      </w:r>
+      <w:proofErr w:type="spellEnd"/>
+      <w:r>
+        <w:t xml:space="preserve"> voor prototype?</w:t>
+      </w:r>
+    </w:p>
+    <w:p/>
+    <w:p>
+      <w:hyperlink r:id="rId110" w:history="1">
+        <w:r>
+          <w:rPr>
+            <w:rStyle w:val="Hyperlink"/>
+          </w:rPr>
+          <w:t>LIS2DH12</w:t>
+        </w:r>
+      </w:hyperlink>
     </w:p>
     <w:p>
       <w:pPr>
@@ -16373,22 +16623,20 @@
           <w:ilvl w:val="0"/>
           <w:numId w:val="66"/>
         </w:numPr>
-        <w:rPr>
-          <w:lang w:val="en-US"/>
-        </w:rPr>
-      </w:pPr>
-      <w:r>
-        <w:rPr>
-          <w:lang w:val="en-US"/>
-        </w:rPr>
-        <w:t>w</w:t>
-      </w:r>
-      <w:r>
-        <w:rPr>
-          <w:lang w:val="en-US"/>
-        </w:rPr>
-        <w:t>ake/sleep logic</w:t>
-      </w:r>
+      </w:pPr>
+      <w:r>
+        <w:t xml:space="preserve">€1.37 </w:t>
+      </w:r>
+      <w:hyperlink r:id="rId111" w:history="1">
+        <w:proofErr w:type="spellStart"/>
+        <w:r>
+          <w:rPr>
+            <w:rStyle w:val="Hyperlink"/>
+          </w:rPr>
+          <w:t>digikey</w:t>
+        </w:r>
+        <w:proofErr w:type="spellEnd"/>
+      </w:hyperlink>
     </w:p>
     <w:p>
       <w:pPr>
@@ -16397,64 +16645,28 @@
           <w:ilvl w:val="0"/>
           <w:numId w:val="66"/>
         </w:numPr>
-        <w:rPr>
-          <w:lang w:val="en-US"/>
-        </w:rPr>
-      </w:pPr>
-      <w:r>
-        <w:rPr>
-          <w:lang w:val="en-US"/>
-        </w:rPr>
-        <w:t>±2/4/8/16 g</w:t>
-      </w:r>
-    </w:p>
-    <w:p>
-      <w:pPr>
-        <w:rPr>
-          <w:lang w:val="en-US"/>
-        </w:rPr>
-      </w:pPr>
-    </w:p>
-    <w:p>
-      <w:pPr>
-        <w:rPr>
-          <w:lang w:val="en-BE"/>
-        </w:rPr>
-      </w:pPr>
-      <w:r>
-        <w:rPr>
-          <w:lang w:val="en-BE"/>
-        </w:rPr>
-        <w:t>ADXL362</w:t>
-      </w:r>
-      <w:r>
-        <w:rPr>
-          <w:b/>
-          <w:bCs/>
-          <w:lang w:val="en-BE"/>
-        </w:rPr>
-        <w:t xml:space="preserve"> </w:t>
-      </w:r>
-      <w:r>
-        <w:rPr>
-          <w:lang w:val="en-BE"/>
-        </w:rPr>
-        <w:t>of</w:t>
-      </w:r>
-      <w:r>
-        <w:rPr>
-          <w:b/>
-          <w:bCs/>
-          <w:lang w:val="en-BE"/>
-        </w:rPr>
-        <w:t xml:space="preserve"> </w:t>
-      </w:r>
-      <w:r>
-        <w:rPr>
-          <w:lang w:val="en-BE"/>
-        </w:rPr>
-        <w:t>ADXL363</w:t>
-      </w:r>
+      </w:pPr>
+      <w:r>
+        <w:t xml:space="preserve">Eventueel </w:t>
+      </w:r>
+      <w:proofErr w:type="spellStart"/>
+      <w:r>
+        <w:t>breakout</w:t>
+      </w:r>
+      <w:proofErr w:type="spellEnd"/>
+      <w:r>
+        <w:t xml:space="preserve"> bord voor prototype: €6 bij </w:t>
+      </w:r>
+      <w:hyperlink r:id="rId112" w:history="1">
+        <w:proofErr w:type="spellStart"/>
+        <w:r>
+          <w:rPr>
+            <w:rStyle w:val="Hyperlink"/>
+          </w:rPr>
+          <w:t>tinytronics</w:t>
+        </w:r>
+        <w:proofErr w:type="spellEnd"/>
+      </w:hyperlink>
     </w:p>
     <w:p>
       <w:pPr>
@@ -16464,37 +16676,29 @@
           <w:numId w:val="66"/>
         </w:numPr>
         <w:rPr>
-          <w:lang w:val="en-BE"/>
-        </w:rPr>
-      </w:pPr>
-      <w:r>
-        <w:rPr>
-          <w:lang w:val="en-BE"/>
-        </w:rPr>
-        <w:t xml:space="preserve">Zeer </w:t>
-      </w:r>
-      <w:proofErr w:type="spellStart"/>
-      <w:r>
-        <w:rPr>
-          <w:lang w:val="en-BE"/>
-        </w:rPr>
-        <w:t>laag</w:t>
-      </w:r>
-      <w:proofErr w:type="spellEnd"/>
-      <w:r>
-        <w:rPr>
-          <w:lang w:val="en-BE"/>
-        </w:rPr>
-        <w:t xml:space="preserve"> </w:t>
-      </w:r>
-      <w:proofErr w:type="spellStart"/>
-      <w:r>
-        <w:rPr>
-          <w:lang w:val="en-BE"/>
-        </w:rPr>
-        <w:t>verbruik</w:t>
-      </w:r>
-      <w:proofErr w:type="spellEnd"/>
+          <w:lang w:val="en-US"/>
+        </w:rPr>
+      </w:pPr>
+      <w:r>
+        <w:rPr>
+          <w:lang w:val="en-US"/>
+        </w:rPr>
+        <w:t>Ultra</w:t>
+      </w:r>
+      <w:r>
+        <w:rPr>
+          <w:lang w:val="en-US"/>
+        </w:rPr>
+        <w:noBreakHyphen/>
+        <w:t>low</w:t>
+      </w:r>
+      <w:r>
+        <w:rPr>
+          <w:lang w:val="en-US"/>
+        </w:rPr>
+        <w:noBreakHyphen/>
+        <w:t>power (tot ~2 µA)</w:t>
+      </w:r>
     </w:p>
     <w:p>
       <w:pPr>
@@ -16504,105 +16708,14 @@
           <w:numId w:val="66"/>
         </w:numPr>
         <w:rPr>
-          <w:lang w:val="en-BE"/>
-        </w:rPr>
-      </w:pPr>
-      <w:r>
-        <w:rPr>
-          <w:lang w:val="en-BE"/>
-        </w:rPr>
-        <w:t>SPI</w:t>
-      </w:r>
-    </w:p>
-    <w:p/>
-    <w:p>
-      <w:pPr>
-        <w:pStyle w:val="Heading1"/>
-      </w:pPr>
-      <w:bookmarkStart w:id="48" w:name="_Toc225503319"/>
-      <w:r>
-        <w:t>SD-</w:t>
-      </w:r>
-      <w:proofErr w:type="spellStart"/>
-      <w:r>
-        <w:t>kaart</w:t>
-      </w:r>
-      <w:bookmarkEnd w:id="48"/>
-      <w:proofErr w:type="spellEnd"/>
-    </w:p>
-    <w:p>
-      <w:pPr>
-        <w:rPr>
-          <w:lang w:val="en-US"/>
-        </w:rPr>
-      </w:pPr>
-    </w:p>
-    <w:p>
-      <w:pPr>
-        <w:pStyle w:val="Heading1"/>
-      </w:pPr>
-      <w:bookmarkStart w:id="49" w:name="_Toc225503320"/>
-      <w:proofErr w:type="spellStart"/>
-      <w:r>
-        <w:t>Geheugen</w:t>
-      </w:r>
-      <w:proofErr w:type="spellEnd"/>
-      <w:r>
-        <w:t xml:space="preserve"> chip</w:t>
-      </w:r>
-      <w:bookmarkEnd w:id="49"/>
-    </w:p>
-    <w:p>
-      <w:pPr>
-        <w:rPr>
-          <w:lang w:val="en-US"/>
-        </w:rPr>
-      </w:pPr>
-      <w:r>
-        <w:rPr>
-          <w:lang w:val="en-US"/>
-        </w:rPr>
-        <w:t>FRAM (</w:t>
-      </w:r>
-      <w:r>
-        <w:rPr>
-          <w:lang w:val="en-US"/>
-        </w:rPr>
-        <w:t>Ferroelectric Random Access Memory</w:t>
-      </w:r>
-      <w:r>
-        <w:rPr>
-          <w:lang w:val="en-US"/>
-        </w:rPr>
-        <w:t xml:space="preserve">): </w:t>
-      </w:r>
-      <w:proofErr w:type="spellStart"/>
-      <w:r>
-        <w:rPr>
-          <w:lang w:val="en-US"/>
-        </w:rPr>
-        <w:t>zoals</w:t>
-      </w:r>
-      <w:proofErr w:type="spellEnd"/>
-      <w:r>
-        <w:rPr>
-          <w:lang w:val="en-US"/>
-        </w:rPr>
-        <w:t xml:space="preserve"> EEPROM, maar </w:t>
-      </w:r>
-      <w:proofErr w:type="spellStart"/>
-      <w:r>
-        <w:rPr>
-          <w:lang w:val="en-US"/>
-        </w:rPr>
-        <w:t>beter</w:t>
-      </w:r>
-      <w:proofErr w:type="spellEnd"/>
-      <w:r>
-        <w:rPr>
-          <w:lang w:val="en-US"/>
-        </w:rPr>
-        <w:t>.</w:t>
+          <w:lang w:val="en-US"/>
+        </w:rPr>
+      </w:pPr>
+      <w:r>
+        <w:rPr>
+          <w:lang w:val="en-US"/>
+        </w:rPr>
+        <w:t xml:space="preserve">I²C/SPI, </w:t>
       </w:r>
     </w:p>
     <w:p>
@@ -16620,35 +16733,13 @@
         <w:rPr>
           <w:lang w:val="en-US"/>
         </w:rPr>
-        <w:t xml:space="preserve">Hoge </w:t>
-      </w:r>
-      <w:proofErr w:type="spellStart"/>
-      <w:r>
-        <w:rPr>
-          <w:lang w:val="en-US"/>
-        </w:rPr>
-        <w:t>snelheid</w:t>
-      </w:r>
-      <w:proofErr w:type="spellEnd"/>
-      <w:r>
-        <w:rPr>
-          <w:lang w:val="en-US"/>
-        </w:rPr>
-        <w:t xml:space="preserve">, </w:t>
-      </w:r>
-      <w:proofErr w:type="spellStart"/>
-      <w:r>
-        <w:rPr>
-          <w:lang w:val="en-US"/>
-        </w:rPr>
-        <w:t>zoals</w:t>
-      </w:r>
-      <w:proofErr w:type="spellEnd"/>
-      <w:r>
-        <w:rPr>
-          <w:lang w:val="en-US"/>
-        </w:rPr>
-        <w:t xml:space="preserve"> RAM</w:t>
+        <w:t>w</w:t>
+      </w:r>
+      <w:r>
+        <w:rPr>
+          <w:lang w:val="en-US"/>
+        </w:rPr>
+        <w:t>ake/sleep logic</w:t>
       </w:r>
     </w:p>
     <w:p>
@@ -16662,33 +16753,11 @@
           <w:lang w:val="en-US"/>
         </w:rPr>
       </w:pPr>
-      <w:proofErr w:type="spellStart"/>
-      <w:r>
-        <w:rPr>
-          <w:lang w:val="en-US"/>
-        </w:rPr>
-        <w:t>Niet</w:t>
-      </w:r>
-      <w:proofErr w:type="spellEnd"/>
-      <w:r>
-        <w:rPr>
-          <w:lang w:val="en-US"/>
-        </w:rPr>
-        <w:t xml:space="preserve"> volatile, </w:t>
-      </w:r>
-      <w:proofErr w:type="spellStart"/>
-      <w:r>
-        <w:rPr>
-          <w:lang w:val="en-US"/>
-        </w:rPr>
-        <w:t>zoals</w:t>
-      </w:r>
-      <w:proofErr w:type="spellEnd"/>
-      <w:r>
-        <w:rPr>
-          <w:lang w:val="en-US"/>
-        </w:rPr>
-        <w:t xml:space="preserve"> EEPROM</w:t>
+      <w:r>
+        <w:rPr>
+          <w:lang w:val="en-US"/>
+        </w:rPr>
+        <w:t>±2/4/8/16 g</w:t>
       </w:r>
     </w:p>
     <w:p>
@@ -16706,14 +16775,43 @@
         <w:rPr>
           <w:lang w:val="en-US"/>
         </w:rPr>
-        <w:t>Meer write cycles (10</w:t>
-      </w:r>
-      <w:r>
-        <w:rPr>
-          <w:vertAlign w:val="superscript"/>
-          <w:lang w:val="en-US"/>
-        </w:rPr>
-        <w:t>14</w:t>
+        <w:t>10-bit, 32-level FIFO</w:t>
+      </w:r>
+      <w:r>
+        <w:rPr>
+          <w:lang w:val="en-US"/>
+        </w:rPr>
+        <w:t xml:space="preserve"> buffer </w:t>
+      </w:r>
+      <w:r>
+        <w:rPr>
+          <w:lang w:val="en-US"/>
+        </w:rPr>
+        <w:t>for each channel</w:t>
+      </w:r>
+      <w:r>
+        <w:rPr>
+          <w:lang w:val="en-US"/>
+        </w:rPr>
+        <w:t xml:space="preserve"> (</w:t>
+      </w:r>
+      <w:r>
+        <w:rPr>
+          <w:lang w:val="en-US"/>
+        </w:rPr>
+        <w:t>X, Y</w:t>
+      </w:r>
+      <w:r>
+        <w:rPr>
+          <w:lang w:val="en-US"/>
+        </w:rPr>
+        <w:t>,</w:t>
+      </w:r>
+      <w:r>
+        <w:rPr>
+          <w:lang w:val="en-US"/>
+        </w:rPr>
+        <w:t xml:space="preserve"> Z</w:t>
       </w:r>
       <w:r>
         <w:rPr>
@@ -16721,6 +16819,35 @@
         </w:rPr>
         <w:t>)</w:t>
       </w:r>
+      <w:r>
+        <w:rPr>
+          <w:lang w:val="en-US"/>
+        </w:rPr>
+        <w:t xml:space="preserve"> </w:t>
+      </w:r>
+    </w:p>
+    <w:p>
+      <w:pPr>
+        <w:rPr>
+          <w:lang w:val="en-US"/>
+        </w:rPr>
+      </w:pPr>
+    </w:p>
+    <w:p>
+      <w:pPr>
+        <w:rPr>
+          <w:lang w:val="en-US"/>
+        </w:rPr>
+      </w:pPr>
+      <w:hyperlink r:id="rId113" w:history="1">
+        <w:r>
+          <w:rPr>
+            <w:rStyle w:val="Hyperlink"/>
+            <w:lang w:val="en-US"/>
+          </w:rPr>
+          <w:t>LIS2DW12</w:t>
+        </w:r>
+      </w:hyperlink>
     </w:p>
     <w:p>
       <w:pPr>
@@ -16729,15 +16856,654 @@
           <w:ilvl w:val="0"/>
           <w:numId w:val="66"/>
         </w:numPr>
-        <w:rPr>
-          <w:lang w:val="en-US"/>
-        </w:rPr>
-      </w:pPr>
+      </w:pPr>
+      <w:r>
+        <w:t>Gelijkaardig aan LIS2DH12, met m</w:t>
+      </w:r>
+      <w:r>
+        <w:t>inder verbruik en minder ruis</w:t>
+      </w:r>
+    </w:p>
+    <w:p>
+      <w:pPr>
+        <w:pStyle w:val="ListParagraph"/>
+        <w:numPr>
+          <w:ilvl w:val="0"/>
+          <w:numId w:val="66"/>
+        </w:numPr>
+        <w:rPr>
+          <w:lang w:val="en-US"/>
+        </w:rPr>
+      </w:pPr>
+      <w:r>
+        <w:rPr>
+          <w:lang w:val="en-US"/>
+        </w:rPr>
+        <w:t xml:space="preserve">€1.19 </w:t>
+      </w:r>
+      <w:hyperlink r:id="rId114" w:history="1">
+        <w:proofErr w:type="spellStart"/>
+        <w:r>
+          <w:rPr>
+            <w:rStyle w:val="Hyperlink"/>
+            <w:lang w:val="en-US"/>
+          </w:rPr>
+          <w:t>digikey</w:t>
+        </w:r>
+        <w:proofErr w:type="spellEnd"/>
+      </w:hyperlink>
+      <w:r>
+        <w:rPr>
+          <w:lang w:val="en-US"/>
+        </w:rPr>
+        <w:t xml:space="preserve"> (</w:t>
+      </w:r>
       <w:proofErr w:type="spellStart"/>
       <w:r>
         <w:rPr>
           <w:lang w:val="en-US"/>
         </w:rPr>
+        <w:t>niet</w:t>
+      </w:r>
+      <w:proofErr w:type="spellEnd"/>
+      <w:r>
+        <w:rPr>
+          <w:lang w:val="en-US"/>
+        </w:rPr>
+        <w:t xml:space="preserve"> op </w:t>
+      </w:r>
+      <w:proofErr w:type="spellStart"/>
+      <w:r>
+        <w:rPr>
+          <w:lang w:val="en-US"/>
+        </w:rPr>
+        <w:t>voorraad</w:t>
+      </w:r>
+      <w:proofErr w:type="spellEnd"/>
+      <w:r>
+        <w:rPr>
+          <w:lang w:val="en-US"/>
+        </w:rPr>
+        <w:t>)</w:t>
+      </w:r>
+    </w:p>
+    <w:p>
+      <w:pPr>
+        <w:pStyle w:val="ListParagraph"/>
+        <w:numPr>
+          <w:ilvl w:val="0"/>
+          <w:numId w:val="66"/>
+        </w:numPr>
+      </w:pPr>
+      <w:r>
+        <w:t xml:space="preserve">€1.19 </w:t>
+      </w:r>
+      <w:hyperlink r:id="rId115" w:history="1">
+        <w:proofErr w:type="spellStart"/>
+        <w:r>
+          <w:rPr>
+            <w:rStyle w:val="Hyperlink"/>
+          </w:rPr>
+          <w:t>mouser</w:t>
+        </w:r>
+        <w:proofErr w:type="spellEnd"/>
+      </w:hyperlink>
+      <w:r>
+        <w:t xml:space="preserve"> (ook niet op v</w:t>
+      </w:r>
+      <w:r>
+        <w:t>oorraad)</w:t>
+      </w:r>
+    </w:p>
+    <w:p>
+      <w:pPr>
+        <w:pStyle w:val="ListParagraph"/>
+        <w:numPr>
+          <w:ilvl w:val="0"/>
+          <w:numId w:val="66"/>
+        </w:numPr>
+      </w:pPr>
+      <w:r>
+        <w:t xml:space="preserve">€1.31 </w:t>
+      </w:r>
+      <w:hyperlink r:id="rId116" w:history="1">
+        <w:proofErr w:type="spellStart"/>
+        <w:r>
+          <w:rPr>
+            <w:rStyle w:val="Hyperlink"/>
+          </w:rPr>
+          <w:t>farnell</w:t>
+        </w:r>
+        <w:proofErr w:type="spellEnd"/>
+      </w:hyperlink>
+    </w:p>
+    <w:p>
+      <w:pPr>
+        <w:pStyle w:val="ListParagraph"/>
+        <w:numPr>
+          <w:ilvl w:val="0"/>
+          <w:numId w:val="66"/>
+        </w:numPr>
+      </w:pPr>
+      <w:r>
+        <w:t xml:space="preserve">€5.5 </w:t>
+      </w:r>
+      <w:hyperlink r:id="rId117" w:history="1">
+        <w:proofErr w:type="spellStart"/>
+        <w:r>
+          <w:rPr>
+            <w:rStyle w:val="Hyperlink"/>
+          </w:rPr>
+          <w:t>tinytronics</w:t>
+        </w:r>
+        <w:proofErr w:type="spellEnd"/>
+      </w:hyperlink>
+      <w:r>
+        <w:t xml:space="preserve"> (</w:t>
+      </w:r>
+      <w:proofErr w:type="spellStart"/>
+      <w:r>
+        <w:t>breakout</w:t>
+      </w:r>
+      <w:proofErr w:type="spellEnd"/>
+      <w:r>
+        <w:t>)</w:t>
+      </w:r>
+    </w:p>
+    <w:p>
+      <w:pPr>
+        <w:pStyle w:val="ListParagraph"/>
+        <w:numPr>
+          <w:ilvl w:val="0"/>
+          <w:numId w:val="66"/>
+        </w:numPr>
+        <w:rPr>
+          <w:lang w:val="en-US"/>
+        </w:rPr>
+      </w:pPr>
+      <w:r>
+        <w:rPr>
+          <w:lang w:val="en-US"/>
+        </w:rPr>
+        <w:t xml:space="preserve">50 </w:t>
+      </w:r>
+      <w:proofErr w:type="spellStart"/>
+      <w:r>
+        <w:rPr>
+          <w:lang w:val="en-US"/>
+        </w:rPr>
+        <w:t>nA</w:t>
+      </w:r>
+      <w:proofErr w:type="spellEnd"/>
+      <w:r>
+        <w:rPr>
+          <w:lang w:val="en-US"/>
+        </w:rPr>
+        <w:t xml:space="preserve"> in power-down mode, below 1 </w:t>
+      </w:r>
+      <w:r>
+        <w:t>μ</w:t>
+      </w:r>
+      <w:r>
+        <w:rPr>
+          <w:lang w:val="en-US"/>
+        </w:rPr>
+        <w:t>A in active</w:t>
+      </w:r>
+      <w:r>
+        <w:rPr>
+          <w:lang w:val="en-US"/>
+        </w:rPr>
+        <w:t xml:space="preserve"> </w:t>
+      </w:r>
+      <w:r>
+        <w:rPr>
+          <w:lang w:val="en-US"/>
+        </w:rPr>
+        <w:t>low-power mode</w:t>
+      </w:r>
+    </w:p>
+    <w:p>
+      <w:pPr>
+        <w:pStyle w:val="ListParagraph"/>
+        <w:numPr>
+          <w:ilvl w:val="0"/>
+          <w:numId w:val="66"/>
+        </w:numPr>
+        <w:rPr>
+          <w:lang w:val="en-US"/>
+        </w:rPr>
+      </w:pPr>
+      <w:r>
+        <w:rPr>
+          <w:lang w:val="en-US"/>
+        </w:rPr>
+        <w:t>Very low noise: down to 1.3 mg RMS in low-power mode</w:t>
+      </w:r>
+    </w:p>
+    <w:p>
+      <w:pPr>
+        <w:rPr>
+          <w:lang w:val="en-US"/>
+        </w:rPr>
+      </w:pPr>
+    </w:p>
+    <w:p>
+      <w:r>
+        <w:t>LIS3DH = LIS2DH</w:t>
+      </w:r>
+      <w:r>
+        <w:t>12</w:t>
+      </w:r>
+      <w:r>
+        <w:t xml:space="preserve"> met 3 ADC </w:t>
+      </w:r>
+      <w:proofErr w:type="spellStart"/>
+      <w:r>
+        <w:t>inp</w:t>
+      </w:r>
+      <w:r>
+        <w:t>uts</w:t>
+      </w:r>
+      <w:proofErr w:type="spellEnd"/>
+      <w:r>
+        <w:t>.</w:t>
+      </w:r>
+    </w:p>
+    <w:p/>
+    <w:p>
+      <w:pPr>
+        <w:rPr>
+          <w:lang w:val="en-BE"/>
+        </w:rPr>
+      </w:pPr>
+      <w:r>
+        <w:rPr>
+          <w:lang w:val="en-BE"/>
+        </w:rPr>
+        <w:t>ADXL362</w:t>
+      </w:r>
+      <w:r>
+        <w:rPr>
+          <w:b/>
+          <w:bCs/>
+          <w:lang w:val="en-BE"/>
+        </w:rPr>
+        <w:t xml:space="preserve"> </w:t>
+      </w:r>
+      <w:r>
+        <w:rPr>
+          <w:lang w:val="en-BE"/>
+        </w:rPr>
+        <w:t>of</w:t>
+      </w:r>
+      <w:r>
+        <w:rPr>
+          <w:b/>
+          <w:bCs/>
+          <w:lang w:val="en-BE"/>
+        </w:rPr>
+        <w:t xml:space="preserve"> </w:t>
+      </w:r>
+      <w:r>
+        <w:rPr>
+          <w:lang w:val="en-BE"/>
+        </w:rPr>
+        <w:t>ADXL363</w:t>
+      </w:r>
+    </w:p>
+    <w:p>
+      <w:pPr>
+        <w:pStyle w:val="ListParagraph"/>
+        <w:numPr>
+          <w:ilvl w:val="0"/>
+          <w:numId w:val="66"/>
+        </w:numPr>
+        <w:rPr>
+          <w:lang w:val="en-BE"/>
+        </w:rPr>
+      </w:pPr>
+      <w:r>
+        <w:rPr>
+          <w:lang w:val="en-BE"/>
+        </w:rPr>
+        <w:t xml:space="preserve">Zeer </w:t>
+      </w:r>
+      <w:proofErr w:type="spellStart"/>
+      <w:r>
+        <w:rPr>
+          <w:lang w:val="en-BE"/>
+        </w:rPr>
+        <w:t>laag</w:t>
+      </w:r>
+      <w:proofErr w:type="spellEnd"/>
+      <w:r>
+        <w:rPr>
+          <w:lang w:val="en-BE"/>
+        </w:rPr>
+        <w:t xml:space="preserve"> </w:t>
+      </w:r>
+      <w:proofErr w:type="spellStart"/>
+      <w:r>
+        <w:rPr>
+          <w:lang w:val="en-BE"/>
+        </w:rPr>
+        <w:t>verbruik</w:t>
+      </w:r>
+      <w:proofErr w:type="spellEnd"/>
+    </w:p>
+    <w:p>
+      <w:pPr>
+        <w:pStyle w:val="ListParagraph"/>
+        <w:numPr>
+          <w:ilvl w:val="0"/>
+          <w:numId w:val="66"/>
+        </w:numPr>
+        <w:rPr>
+          <w:lang w:val="en-BE"/>
+        </w:rPr>
+      </w:pPr>
+      <w:r>
+        <w:rPr>
+          <w:lang w:val="en-BE"/>
+        </w:rPr>
+        <w:t>SPI</w:t>
+      </w:r>
+    </w:p>
+    <w:p>
+      <w:pPr>
+        <w:pStyle w:val="ListParagraph"/>
+        <w:numPr>
+          <w:ilvl w:val="0"/>
+          <w:numId w:val="66"/>
+        </w:numPr>
+        <w:rPr>
+          <w:lang w:val="en-BE"/>
+        </w:rPr>
+      </w:pPr>
+      <w:proofErr w:type="spellStart"/>
+      <w:r>
+        <w:rPr>
+          <w:lang w:val="en-BE"/>
+        </w:rPr>
+        <w:t>Te</w:t>
+      </w:r>
+      <w:proofErr w:type="spellEnd"/>
+      <w:r>
+        <w:rPr>
+          <w:lang w:val="en-BE"/>
+        </w:rPr>
+        <w:t xml:space="preserve"> </w:t>
+      </w:r>
+      <w:proofErr w:type="spellStart"/>
+      <w:r>
+        <w:rPr>
+          <w:lang w:val="en-BE"/>
+        </w:rPr>
+        <w:t>duur</w:t>
+      </w:r>
+      <w:proofErr w:type="spellEnd"/>
+      <w:r>
+        <w:rPr>
+          <w:lang w:val="en-BE"/>
+        </w:rPr>
+        <w:t xml:space="preserve"> (&gt;€5)</w:t>
+      </w:r>
+    </w:p>
+    <w:p>
+      <w:pPr>
+        <w:rPr>
+          <w:lang w:val="en-BE"/>
+        </w:rPr>
+      </w:pPr>
+    </w:p>
+    <w:p>
+      <w:pPr>
+        <w:rPr>
+          <w:lang w:val="en-BE"/>
+        </w:rPr>
+      </w:pPr>
+      <w:hyperlink r:id="rId118" w:history="1">
+        <w:r>
+          <w:rPr>
+            <w:rStyle w:val="Hyperlink"/>
+            <w:lang w:val="en-BE"/>
+          </w:rPr>
+          <w:t>BMA400</w:t>
+        </w:r>
+      </w:hyperlink>
+    </w:p>
+    <w:p>
+      <w:pPr>
+        <w:rPr>
+          <w:lang w:val="en-BE"/>
+        </w:rPr>
+      </w:pPr>
+    </w:p>
+    <w:p/>
+    <w:p>
+      <w:pPr>
+        <w:pStyle w:val="Heading1"/>
+      </w:pPr>
+      <w:bookmarkStart w:id="48" w:name="_Toc225503319"/>
+      <w:r>
+        <w:t>SD-</w:t>
+      </w:r>
+      <w:proofErr w:type="spellStart"/>
+      <w:r>
+        <w:t>kaart</w:t>
+      </w:r>
+      <w:bookmarkEnd w:id="48"/>
+      <w:proofErr w:type="spellEnd"/>
+    </w:p>
+    <w:p>
+      <w:pPr>
+        <w:rPr>
+          <w:lang w:val="en-US"/>
+        </w:rPr>
+      </w:pPr>
+    </w:p>
+    <w:p>
+      <w:pPr>
+        <w:pStyle w:val="Heading1"/>
+      </w:pPr>
+      <w:bookmarkStart w:id="49" w:name="_Toc225503320"/>
+      <w:proofErr w:type="spellStart"/>
+      <w:r>
+        <w:t>Geheugen</w:t>
+      </w:r>
+      <w:proofErr w:type="spellEnd"/>
+      <w:r>
+        <w:t xml:space="preserve"> chip</w:t>
+      </w:r>
+      <w:bookmarkEnd w:id="49"/>
+    </w:p>
+    <w:p>
+      <w:pPr>
+        <w:rPr>
+          <w:lang w:val="en-US"/>
+        </w:rPr>
+      </w:pPr>
+      <w:r>
+        <w:rPr>
+          <w:lang w:val="en-US"/>
+        </w:rPr>
+        <w:t>FRAM (</w:t>
+      </w:r>
+      <w:r>
+        <w:rPr>
+          <w:lang w:val="en-US"/>
+        </w:rPr>
+        <w:t>Ferroelectric Random Access Memory</w:t>
+      </w:r>
+      <w:r>
+        <w:rPr>
+          <w:lang w:val="en-US"/>
+        </w:rPr>
+        <w:t xml:space="preserve">): </w:t>
+      </w:r>
+      <w:proofErr w:type="spellStart"/>
+      <w:r>
+        <w:rPr>
+          <w:lang w:val="en-US"/>
+        </w:rPr>
+        <w:t>zoals</w:t>
+      </w:r>
+      <w:proofErr w:type="spellEnd"/>
+      <w:r>
+        <w:rPr>
+          <w:lang w:val="en-US"/>
+        </w:rPr>
+        <w:t xml:space="preserve"> EEPROM, maar </w:t>
+      </w:r>
+      <w:proofErr w:type="spellStart"/>
+      <w:r>
+        <w:rPr>
+          <w:lang w:val="en-US"/>
+        </w:rPr>
+        <w:t>beter</w:t>
+      </w:r>
+      <w:proofErr w:type="spellEnd"/>
+      <w:r>
+        <w:rPr>
+          <w:lang w:val="en-US"/>
+        </w:rPr>
+        <w:t>.</w:t>
+      </w:r>
+    </w:p>
+    <w:p>
+      <w:pPr>
+        <w:pStyle w:val="ListParagraph"/>
+        <w:numPr>
+          <w:ilvl w:val="0"/>
+          <w:numId w:val="66"/>
+        </w:numPr>
+        <w:rPr>
+          <w:lang w:val="en-US"/>
+        </w:rPr>
+      </w:pPr>
+      <w:r>
+        <w:rPr>
+          <w:lang w:val="en-US"/>
+        </w:rPr>
+        <w:t xml:space="preserve">Hoge </w:t>
+      </w:r>
+      <w:proofErr w:type="spellStart"/>
+      <w:r>
+        <w:rPr>
+          <w:lang w:val="en-US"/>
+        </w:rPr>
+        <w:t>snelheid</w:t>
+      </w:r>
+      <w:proofErr w:type="spellEnd"/>
+      <w:r>
+        <w:rPr>
+          <w:lang w:val="en-US"/>
+        </w:rPr>
+        <w:t xml:space="preserve">, </w:t>
+      </w:r>
+      <w:proofErr w:type="spellStart"/>
+      <w:r>
+        <w:rPr>
+          <w:lang w:val="en-US"/>
+        </w:rPr>
+        <w:t>zoals</w:t>
+      </w:r>
+      <w:proofErr w:type="spellEnd"/>
+      <w:r>
+        <w:rPr>
+          <w:lang w:val="en-US"/>
+        </w:rPr>
+        <w:t xml:space="preserve"> RAM</w:t>
+      </w:r>
+    </w:p>
+    <w:p>
+      <w:pPr>
+        <w:pStyle w:val="ListParagraph"/>
+        <w:numPr>
+          <w:ilvl w:val="0"/>
+          <w:numId w:val="66"/>
+        </w:numPr>
+        <w:rPr>
+          <w:lang w:val="en-US"/>
+        </w:rPr>
+      </w:pPr>
+      <w:proofErr w:type="spellStart"/>
+      <w:r>
+        <w:rPr>
+          <w:lang w:val="en-US"/>
+        </w:rPr>
+        <w:t>Niet</w:t>
+      </w:r>
+      <w:proofErr w:type="spellEnd"/>
+      <w:r>
+        <w:rPr>
+          <w:lang w:val="en-US"/>
+        </w:rPr>
+        <w:t xml:space="preserve"> volatile, </w:t>
+      </w:r>
+      <w:proofErr w:type="spellStart"/>
+      <w:r>
+        <w:rPr>
+          <w:lang w:val="en-US"/>
+        </w:rPr>
+        <w:t>zoals</w:t>
+      </w:r>
+      <w:proofErr w:type="spellEnd"/>
+      <w:r>
+        <w:rPr>
+          <w:lang w:val="en-US"/>
+        </w:rPr>
+        <w:t xml:space="preserve"> EEPROM</w:t>
+      </w:r>
+    </w:p>
+    <w:p>
+      <w:pPr>
+        <w:pStyle w:val="ListParagraph"/>
+        <w:numPr>
+          <w:ilvl w:val="0"/>
+          <w:numId w:val="66"/>
+        </w:numPr>
+        <w:rPr>
+          <w:lang w:val="en-US"/>
+        </w:rPr>
+      </w:pPr>
+      <w:r>
+        <w:rPr>
+          <w:lang w:val="en-US"/>
+        </w:rPr>
+        <w:t>Meer write cycles (10</w:t>
+      </w:r>
+      <w:r>
+        <w:rPr>
+          <w:vertAlign w:val="superscript"/>
+          <w:lang w:val="en-US"/>
+        </w:rPr>
+        <w:t>14</w:t>
+      </w:r>
+      <w:r>
+        <w:rPr>
+          <w:lang w:val="en-US"/>
+        </w:rPr>
+        <w:t>)</w:t>
+      </w:r>
+    </w:p>
+    <w:p>
+      <w:pPr>
+        <w:pStyle w:val="ListParagraph"/>
+        <w:numPr>
+          <w:ilvl w:val="0"/>
+          <w:numId w:val="66"/>
+        </w:numPr>
+        <w:rPr>
+          <w:lang w:val="en-US"/>
+        </w:rPr>
+      </w:pPr>
+      <w:proofErr w:type="spellStart"/>
+      <w:r>
+        <w:rPr>
+          <w:lang w:val="en-US"/>
+        </w:rPr>
         <w:t>Zuiniger</w:t>
       </w:r>
       <w:proofErr w:type="spellEnd"/>
@@ -16769,7 +17535,7 @@
         </w:rPr>
         <w:t>:</w:t>
       </w:r>
-      <w:hyperlink r:id="rId110" w:history="1">
+      <w:hyperlink r:id="rId119" w:history="1">
         <w:r>
           <w:rPr>
             <w:rStyle w:val="Hyperlink"/>
@@ -16849,6 +17615,7 @@
       </w:pPr>
       <w:bookmarkStart w:id="50" w:name="_Toc225503321"/>
       <w:r>
+        <w:lastRenderedPageBreak/>
         <w:t>Battery management system</w:t>
       </w:r>
       <w:bookmarkEnd w:id="50"/>
@@ -16887,7 +17654,7 @@
       <w:r>
         <w:t xml:space="preserve">Slechte productiekwaliteit kan gevaarlijk zijn: </w:t>
       </w:r>
-      <w:hyperlink r:id="rId111" w:anchor="battery-quality-report" w:history="1">
+      <w:hyperlink r:id="rId120" w:anchor="battery-quality-report" w:history="1">
         <w:r>
           <w:rPr>
             <w:rStyle w:val="Hyperlink"/>
@@ -16926,7 +17693,7 @@
           <w:lang w:val="en-US"/>
         </w:rPr>
       </w:pPr>
-      <w:hyperlink r:id="rId112" w:history="1">
+      <w:hyperlink r:id="rId121" w:history="1">
         <w:r>
           <w:rPr>
             <w:rStyle w:val="Hyperlink"/>
@@ -16968,7 +17735,6 @@
         <w:rPr>
           <w:noProof/>
         </w:rPr>
-        <w:lastRenderedPageBreak/>
         <w:drawing>
           <wp:inline distT="0" distB="0" distL="0" distR="0" wp14:anchorId="3ECE20AE" wp14:editId="04C87766">
             <wp:extent cx="2825750" cy="1112608"/>
@@ -16985,7 +17751,7 @@
                     <pic:cNvPicPr/>
                   </pic:nvPicPr>
                   <pic:blipFill>
-                    <a:blip r:embed="rId113"/>
+                    <a:blip r:embed="rId122"/>
                     <a:stretch>
                       <a:fillRect/>
                     </a:stretch>
@@ -17099,8 +17865,13 @@
         <w:t>1u</w:t>
       </w:r>
       <w:r>
-        <w:t>) of 2A voor 2000mAh,…</w:t>
-      </w:r>
+        <w:t>) of 2A voor 2000</w:t>
+      </w:r>
+      <w:proofErr w:type="gramStart"/>
+      <w:r>
+        <w:t>mAh,…</w:t>
+      </w:r>
+      <w:proofErr w:type="gramEnd"/>
     </w:p>
     <w:p>
       <w:pPr>
@@ -17201,7 +17972,7 @@
                     <pic:cNvPicPr/>
                   </pic:nvPicPr>
                   <pic:blipFill>
-                    <a:blip r:embed="rId114"/>
+                    <a:blip r:embed="rId123"/>
                     <a:stretch>
                       <a:fillRect/>
                     </a:stretch>
@@ -17227,13 +17998,21 @@
         <w:t>Er zijn 3 soorten</w:t>
       </w:r>
       <w:r>
-        <w:t xml:space="preserve"> USB</w:t>
+        <w:t xml:space="preserve"> </w:t>
+      </w:r>
+      <w:proofErr w:type="gramStart"/>
+      <w:r>
+        <w:t>USB</w:t>
       </w:r>
       <w:r>
         <w:t xml:space="preserve"> p</w:t>
       </w:r>
       <w:r>
-        <w:t>oorten:</w:t>
+        <w:t>oorten</w:t>
+      </w:r>
+      <w:proofErr w:type="gramEnd"/>
+      <w:r>
+        <w:t>:</w:t>
       </w:r>
     </w:p>
     <w:p>
@@ -17332,13 +18111,19 @@
         <w:ind w:left="0"/>
       </w:pPr>
       <w:r>
+        <w:lastRenderedPageBreak/>
         <w:t xml:space="preserve">Er is een IC nodig dat de juiste stroom kan trekken afhankelijk van de </w:t>
       </w:r>
+      <w:proofErr w:type="gramStart"/>
       <w:r>
         <w:t>USB</w:t>
       </w:r>
       <w:r>
-        <w:t xml:space="preserve"> poort.</w:t>
+        <w:t xml:space="preserve"> poort</w:t>
+      </w:r>
+      <w:proofErr w:type="gramEnd"/>
+      <w:r>
+        <w:t>.</w:t>
       </w:r>
       <w:r>
         <w:t xml:space="preserve"> </w:t>
@@ -17361,7 +18146,15 @@
         <w:t xml:space="preserve"> te onderschei</w:t>
       </w:r>
       <w:r>
-        <w:t>den tussen een SDP-poort (100mA of 500mA) en DCP of CDP poort (1.5A)</w:t>
+        <w:t xml:space="preserve">den tussen een SDP-poort (100mA of 500mA) en DCP of </w:t>
+      </w:r>
+      <w:proofErr w:type="gramStart"/>
+      <w:r>
+        <w:t>CDP poort</w:t>
+      </w:r>
+      <w:proofErr w:type="gramEnd"/>
+      <w:r>
+        <w:t xml:space="preserve"> (1.5A)</w:t>
       </w:r>
       <w:r>
         <w:t xml:space="preserve"> (USB </w:t>
@@ -17428,7 +18221,7 @@
         <w:pStyle w:val="ListParagraph"/>
         <w:ind w:left="708"/>
       </w:pPr>
-      <w:hyperlink r:id="rId115" w:history="1">
+      <w:hyperlink r:id="rId124" w:history="1">
         <w:r>
           <w:rPr>
             <w:rStyle w:val="Hyperlink"/>
@@ -17695,7 +18488,6 @@
       <w:bookmarkStart w:id="54" w:name="_Toc225503325"/>
       <w:proofErr w:type="spellStart"/>
       <w:r>
-        <w:lastRenderedPageBreak/>
         <w:t>Opties</w:t>
       </w:r>
       <w:proofErr w:type="spellEnd"/>
@@ -17783,9 +18575,17 @@
         <w:t xml:space="preserve"> bepaald worden.</w:t>
       </w:r>
       <w:r>
-        <w:t xml:space="preserve"> (bv. </w:t>
-      </w:r>
-      <w:hyperlink r:id="rId116" w:history="1">
+        <w:t xml:space="preserve"> (</w:t>
+      </w:r>
+      <w:proofErr w:type="gramStart"/>
+      <w:r>
+        <w:t>bv.</w:t>
+      </w:r>
+      <w:proofErr w:type="gramEnd"/>
+      <w:r>
+        <w:t xml:space="preserve"> </w:t>
+      </w:r>
+      <w:hyperlink r:id="rId125" w:history="1">
         <w:r>
           <w:rPr>
             <w:rStyle w:val="Hyperlink"/>
@@ -17858,7 +18658,7 @@
           <w:lang w:val="en-US"/>
         </w:rPr>
       </w:pPr>
-      <w:hyperlink r:id="rId117" w:history="1">
+      <w:hyperlink r:id="rId126" w:history="1">
         <w:r>
           <w:rPr>
             <w:rStyle w:val="Hyperlink"/>
@@ -17959,7 +18759,7 @@
           <w:lang w:val="en-US"/>
         </w:rPr>
       </w:pPr>
-      <w:hyperlink r:id="rId118" w:history="1">
+      <w:hyperlink r:id="rId127" w:history="1">
         <w:r>
           <w:rPr>
             <w:rStyle w:val="Hyperlink"/>
@@ -18052,10 +18852,18 @@
         <w:t xml:space="preserve"> </w:t>
       </w:r>
       <w:r>
-        <w:t>(USB 100mA, 500mA en DC in</w:t>
-      </w:r>
-      <w:r>
-        <w:t>put)</w:t>
+        <w:t xml:space="preserve">(USB 100mA, 500mA en </w:t>
+      </w:r>
+      <w:proofErr w:type="gramStart"/>
+      <w:r>
+        <w:t>DC in</w:t>
+      </w:r>
+      <w:r>
+        <w:t>put</w:t>
+      </w:r>
+      <w:proofErr w:type="gramEnd"/>
+      <w:r>
+        <w:t>)</w:t>
       </w:r>
     </w:p>
     <w:p>
@@ -18069,7 +18877,7 @@
           <w:lang w:val="en-US"/>
         </w:rPr>
       </w:pPr>
-      <w:hyperlink r:id="rId119" w:history="1">
+      <w:hyperlink r:id="rId128" w:history="1">
         <w:r>
           <w:rPr>
             <w:rStyle w:val="Hyperlink"/>
@@ -18156,10 +18964,18 @@
       </w:r>
       <w:proofErr w:type="spellEnd"/>
       <w:r>
-        <w:t xml:space="preserve"> (USB 100mA, 500mA en DC in</w:t>
-      </w:r>
-      <w:r>
-        <w:t>put)</w:t>
+        <w:t xml:space="preserve"> (USB 100mA, 500mA en </w:t>
+      </w:r>
+      <w:proofErr w:type="gramStart"/>
+      <w:r>
+        <w:t>DC in</w:t>
+      </w:r>
+      <w:r>
+        <w:t>put</w:t>
+      </w:r>
+      <w:proofErr w:type="gramEnd"/>
+      <w:r>
+        <w:t>)</w:t>
       </w:r>
     </w:p>
     <w:p>
@@ -18175,6 +18991,7 @@
           <w:noProof/>
           <w:lang w:val="en-US"/>
         </w:rPr>
+        <w:lastRenderedPageBreak/>
         <w:drawing>
           <wp:inline distT="0" distB="0" distL="0" distR="0" wp14:anchorId="373B969A" wp14:editId="100E0FBA">
             <wp:extent cx="3511550" cy="2042212"/>
@@ -18191,7 +19008,7 @@
                     <pic:cNvPicPr/>
                   </pic:nvPicPr>
                   <pic:blipFill>
-                    <a:blip r:embed="rId120"/>
+                    <a:blip r:embed="rId129"/>
                     <a:stretch>
                       <a:fillRect/>
                     </a:stretch>
@@ -18230,15 +19047,23 @@
         <w:t xml:space="preserve">de </w:t>
       </w:r>
       <w:r>
-        <w:t>CHG_DET</w:t>
-      </w:r>
-      <w:r>
-        <w:t xml:space="preserve"> pin </w:t>
+        <w:t>CHG_</w:t>
+      </w:r>
+      <w:proofErr w:type="gramStart"/>
+      <w:r>
+        <w:t>DET</w:t>
+      </w:r>
+      <w:r>
+        <w:t xml:space="preserve"> pin</w:t>
+      </w:r>
+      <w:proofErr w:type="gramEnd"/>
+      <w:r>
+        <w:t xml:space="preserve"> </w:t>
       </w:r>
       <w:r>
         <w:t xml:space="preserve">van de </w:t>
       </w:r>
-      <w:hyperlink r:id="rId121" w:history="1">
+      <w:hyperlink r:id="rId130" w:history="1">
         <w:r>
           <w:rPr>
             <w:rStyle w:val="Hyperlink"/>
@@ -18250,13 +19075,29 @@
         <w:t xml:space="preserve"> lader-detectie-IC </w:t>
       </w:r>
       <w:r>
-        <w:t xml:space="preserve">rechtstreeks met de DCM pin van </w:t>
+        <w:t xml:space="preserve">rechtstreeks met de </w:t>
+      </w:r>
+      <w:proofErr w:type="gramStart"/>
+      <w:r>
+        <w:t>DCM pin</w:t>
+      </w:r>
+      <w:proofErr w:type="gramEnd"/>
+      <w:r>
+        <w:t xml:space="preserve"> van </w:t>
       </w:r>
       <w:r>
         <w:t xml:space="preserve">MAX8903 </w:t>
       </w:r>
       <w:r>
-        <w:t>verbonden wordt, zal de input gelimiteerd worden tot 500mA bij een standard downstream usb-poort (SDP) en hoger bij een DCP of CDP poort.</w:t>
+        <w:t xml:space="preserve">verbonden wordt, zal de input gelimiteerd worden tot 500mA bij een standard downstream usb-poort (SDP) en hoger bij een DCP of </w:t>
+      </w:r>
+      <w:proofErr w:type="gramStart"/>
+      <w:r>
+        <w:t>CDP poort</w:t>
+      </w:r>
+      <w:proofErr w:type="gramEnd"/>
+      <w:r>
+        <w:t>.</w:t>
       </w:r>
       <w:r>
         <w:t xml:space="preserve"> 100mA kan waarschijnlijk genegeerd worden.</w:t>
@@ -18276,7 +19117,7 @@
           <w:lang w:val="en-US"/>
         </w:rPr>
       </w:pPr>
-      <w:hyperlink r:id="rId122" w:history="1">
+      <w:hyperlink r:id="rId131" w:history="1">
         <w:r>
           <w:rPr>
             <w:rStyle w:val="Hyperlink"/>
@@ -18380,7 +19221,7 @@
           <w:lang w:val="en-US"/>
         </w:rPr>
       </w:pPr>
-      <w:hyperlink r:id="rId123" w:history="1">
+      <w:hyperlink r:id="rId132" w:history="1">
         <w:r>
           <w:rPr>
             <w:rStyle w:val="Hyperlink"/>
@@ -18479,7 +19320,35 @@
         <w:rPr>
           <w:lang w:val="en-US"/>
         </w:rPr>
-        <w:t>Battery voltage monitor with 7-12 bit AD</w:t>
+        <w:t xml:space="preserve">Battery voltage </w:t>
+      </w:r>
+      <w:proofErr w:type="gramStart"/>
+      <w:r>
+        <w:rPr>
+          <w:lang w:val="en-US"/>
+        </w:rPr>
+        <w:t>monitor</w:t>
+      </w:r>
+      <w:proofErr w:type="gramEnd"/>
+      <w:r>
+        <w:rPr>
+          <w:lang w:val="en-US"/>
+        </w:rPr>
+        <w:t xml:space="preserve"> with </w:t>
+      </w:r>
+      <w:proofErr w:type="gramStart"/>
+      <w:r>
+        <w:rPr>
+          <w:lang w:val="en-US"/>
+        </w:rPr>
+        <w:t>7-12 bit</w:t>
+      </w:r>
+      <w:proofErr w:type="gramEnd"/>
+      <w:r>
+        <w:rPr>
+          <w:lang w:val="en-US"/>
+        </w:rPr>
+        <w:t xml:space="preserve"> AD</w:t>
       </w:r>
       <w:r>
         <w:rPr>
@@ -18509,7 +19378,6 @@
         <w:rPr>
           <w:lang w:val="en-US"/>
         </w:rPr>
-        <w:lastRenderedPageBreak/>
         <w:t>I²C</w:t>
       </w:r>
       <w:r>
@@ -18564,10 +19432,18 @@
     </w:p>
     <w:p>
       <w:r>
-        <w:t>Kan je de USB d</w:t>
-      </w:r>
-      <w:r>
-        <w:t>ata lijnen nog gebruiken voor STM32?</w:t>
+        <w:t xml:space="preserve">Kan je de </w:t>
+      </w:r>
+      <w:proofErr w:type="gramStart"/>
+      <w:r>
+        <w:t>USB d</w:t>
+      </w:r>
+      <w:r>
+        <w:t>ata</w:t>
+      </w:r>
+      <w:proofErr w:type="gramEnd"/>
+      <w:r>
+        <w:t xml:space="preserve"> lijnen nog gebruiken voor STM32?</w:t>
       </w:r>
     </w:p>
     <w:p/>
@@ -18582,7 +19458,7 @@
           <w:lang w:val="en-US"/>
         </w:rPr>
       </w:pPr>
-      <w:hyperlink r:id="rId124" w:history="1">
+      <w:hyperlink r:id="rId133" w:history="1">
         <w:r>
           <w:rPr>
             <w:rStyle w:val="Hyperlink"/>
@@ -18755,6 +19631,7 @@
           <w:noProof/>
           <w:lang w:val="en-US"/>
         </w:rPr>
+        <w:lastRenderedPageBreak/>
         <w:drawing>
           <wp:inline distT="0" distB="0" distL="0" distR="0" wp14:anchorId="588F96B9" wp14:editId="2A2B93A6">
             <wp:extent cx="2851150" cy="2190883"/>
@@ -18771,7 +19648,7 @@
                     <pic:cNvPicPr/>
                   </pic:nvPicPr>
                   <pic:blipFill>
-                    <a:blip r:embed="rId125"/>
+                    <a:blip r:embed="rId134"/>
                     <a:stretch>
                       <a:fillRect/>
                     </a:stretch>
@@ -18809,7 +19686,7 @@
           <w:numId w:val="66"/>
         </w:numPr>
       </w:pPr>
-      <w:hyperlink r:id="rId126" w:history="1">
+      <w:hyperlink r:id="rId135" w:history="1">
         <w:r>
           <w:rPr>
             <w:rStyle w:val="Hyperlink"/>
@@ -18826,7 +19703,7 @@
           <w:numId w:val="66"/>
         </w:numPr>
       </w:pPr>
-      <w:hyperlink r:id="rId127" w:history="1">
+      <w:hyperlink r:id="rId136" w:history="1">
         <w:r>
           <w:rPr>
             <w:rStyle w:val="Hyperlink"/>
@@ -18843,7 +19720,7 @@
           <w:numId w:val="66"/>
         </w:numPr>
       </w:pPr>
-      <w:hyperlink r:id="rId128" w:tgtFrame="_blank" w:history="1">
+      <w:hyperlink r:id="rId137" w:tgtFrame="_blank" w:history="1">
         <w:r>
           <w:rPr>
             <w:rStyle w:val="Hyperlink"/>
@@ -18940,7 +19817,7 @@
                     <pic:cNvPicPr/>
                   </pic:nvPicPr>
                   <pic:blipFill>
-                    <a:blip r:embed="rId129"/>
+                    <a:blip r:embed="rId138"/>
                     <a:stretch>
                       <a:fillRect/>
                     </a:stretch>
@@ -19028,7 +19905,7 @@
           <w:lang w:val="en-US"/>
         </w:rPr>
       </w:pPr>
-      <w:hyperlink r:id="rId130" w:history="1">
+      <w:hyperlink r:id="rId139" w:history="1">
         <w:r>
           <w:rPr>
             <w:rStyle w:val="Hyperlink"/>
@@ -19049,7 +19926,7 @@
           <w:lang w:val="en-US"/>
         </w:rPr>
       </w:pPr>
-      <w:hyperlink r:id="rId131" w:history="1">
+      <w:hyperlink r:id="rId140" w:history="1">
         <w:r>
           <w:rPr>
             <w:rStyle w:val="Hyperlink"/>
@@ -19067,7 +19944,7 @@
           <w:numId w:val="66"/>
         </w:numPr>
       </w:pPr>
-      <w:hyperlink r:id="rId132" w:tgtFrame="_blank" w:history="1">
+      <w:hyperlink r:id="rId141" w:tgtFrame="_blank" w:history="1">
         <w:r>
           <w:rPr>
             <w:rStyle w:val="Hyperlink"/>
@@ -19091,7 +19968,6 @@
         </w:numPr>
       </w:pPr>
       <w:r>
-        <w:lastRenderedPageBreak/>
         <w:t>Gelijkaardig aan BQ25895 (5A laadstroom, USB-detectie)</w:t>
       </w:r>
       <w:r>
@@ -19106,7 +19982,7 @@
           <w:numId w:val="66"/>
         </w:numPr>
       </w:pPr>
-      <w:hyperlink r:id="rId133" w:history="1">
+      <w:hyperlink r:id="rId142" w:history="1">
         <w:r>
           <w:rPr>
             <w:rStyle w:val="Hyperlink"/>
@@ -19167,6 +20043,7 @@
         <w:rPr>
           <w:noProof/>
         </w:rPr>
+        <w:lastRenderedPageBreak/>
         <w:drawing>
           <wp:inline distT="0" distB="0" distL="0" distR="0" wp14:anchorId="31E89331" wp14:editId="32E5DD17">
             <wp:extent cx="3771900" cy="2483417"/>
@@ -19183,7 +20060,7 @@
                     <pic:cNvPicPr/>
                   </pic:nvPicPr>
                   <pic:blipFill>
-                    <a:blip r:embed="rId134"/>
+                    <a:blip r:embed="rId143"/>
                     <a:stretch>
                       <a:fillRect/>
                     </a:stretch>
@@ -19244,7 +20121,7 @@
                     <pic:cNvPicPr/>
                   </pic:nvPicPr>
                   <pic:blipFill>
-                    <a:blip r:embed="rId135"/>
+                    <a:blip r:embed="rId144"/>
                     <a:stretch>
                       <a:fillRect/>
                     </a:stretch>
@@ -19414,7 +20291,7 @@
       <w:r>
         <w:t>(</w:t>
       </w:r>
-      <w:hyperlink r:id="rId136" w:history="1">
+      <w:hyperlink r:id="rId145" w:history="1">
         <w:r>
           <w:rPr>
             <w:rStyle w:val="Hyperlink"/>
@@ -19476,7 +20353,6 @@
         <w:rPr>
           <w:lang w:val="en-US"/>
         </w:rPr>
-        <w:lastRenderedPageBreak/>
         <w:t xml:space="preserve">3.3V buck-boost </w:t>
       </w:r>
       <w:proofErr w:type="spellStart"/>
@@ -19634,6 +20510,7 @@
       <w:bookmarkStart w:id="58" w:name="_Toc225503329"/>
       <w:proofErr w:type="spellStart"/>
       <w:r>
+        <w:lastRenderedPageBreak/>
         <w:t>Opties</w:t>
       </w:r>
       <w:proofErr w:type="spellEnd"/>
@@ -19665,7 +20542,7 @@
           <w:lang w:val="en-US"/>
         </w:rPr>
       </w:pPr>
-      <w:hyperlink r:id="rId137" w:history="1">
+      <w:hyperlink r:id="rId146" w:history="1">
         <w:r>
           <w:rPr>
             <w:rStyle w:val="Hyperlink"/>
@@ -19693,7 +20570,7 @@
           <w:lang w:val="en-US"/>
         </w:rPr>
       </w:pPr>
-      <w:hyperlink r:id="rId138" w:history="1">
+      <w:hyperlink r:id="rId147" w:history="1">
         <w:r>
           <w:rPr>
             <w:rStyle w:val="Hyperlink"/>
@@ -19708,7 +20585,7 @@
         </w:rPr>
         <w:t xml:space="preserve"> of </w:t>
       </w:r>
-      <w:hyperlink r:id="rId139" w:history="1">
+      <w:hyperlink r:id="rId148" w:history="1">
         <w:r>
           <w:rPr>
             <w:rStyle w:val="Hyperlink"/>
@@ -19796,7 +20673,7 @@
           <w:numId w:val="66"/>
         </w:numPr>
       </w:pPr>
-      <w:hyperlink r:id="rId140" w:history="1">
+      <w:hyperlink r:id="rId149" w:history="1">
         <w:r>
           <w:rPr>
             <w:rStyle w:val="Hyperlink"/>
@@ -19813,7 +20690,7 @@
           <w:numId w:val="66"/>
         </w:numPr>
       </w:pPr>
-      <w:hyperlink r:id="rId141" w:history="1">
+      <w:hyperlink r:id="rId150" w:history="1">
         <w:r>
           <w:rPr>
             <w:rStyle w:val="Hyperlink"/>
@@ -19962,7 +20839,7 @@
           <w:lang w:val="en-US"/>
         </w:rPr>
       </w:pPr>
-      <w:hyperlink r:id="rId142" w:history="1">
+      <w:hyperlink r:id="rId151" w:history="1">
         <w:r>
           <w:rPr>
             <w:rStyle w:val="Hyperlink"/>
@@ -19989,7 +20866,7 @@
         </w:rPr>
         <w:t xml:space="preserve">€0.43 </w:t>
       </w:r>
-      <w:hyperlink r:id="rId143" w:history="1">
+      <w:hyperlink r:id="rId152" w:history="1">
         <w:proofErr w:type="spellStart"/>
         <w:r>
           <w:rPr>
@@ -20098,7 +20975,7 @@
           <w:numId w:val="66"/>
         </w:numPr>
       </w:pPr>
-      <w:hyperlink r:id="rId144" w:history="1">
+      <w:hyperlink r:id="rId153" w:history="1">
         <w:r>
           <w:rPr>
             <w:rStyle w:val="Hyperlink"/>
@@ -20118,7 +20995,7 @@
       <w:r>
         <w:t xml:space="preserve">€1.28 </w:t>
       </w:r>
-      <w:hyperlink r:id="rId145" w:history="1">
+      <w:hyperlink r:id="rId154" w:history="1">
         <w:proofErr w:type="spellStart"/>
         <w:r>
           <w:rPr>
@@ -20131,7 +21008,7 @@
       <w:r>
         <w:t xml:space="preserve">, </w:t>
       </w:r>
-      <w:hyperlink r:id="rId146" w:history="1">
+      <w:hyperlink r:id="rId155" w:history="1">
         <w:proofErr w:type="spellStart"/>
         <w:r>
           <w:rPr>
@@ -20233,7 +21110,7 @@
         </w:rPr>
         <w:t xml:space="preserve">Package: </w:t>
       </w:r>
-      <w:hyperlink r:id="rId147" w:tgtFrame="_blank" w:history="1">
+      <w:hyperlink r:id="rId156" w:tgtFrame="_blank" w:history="1">
         <w:r>
           <w:rPr>
             <w:rStyle w:val="Hyperlink"/>
@@ -20253,7 +21130,7 @@
           <w:lang w:val="en-US"/>
         </w:rPr>
       </w:pPr>
-      <w:hyperlink r:id="rId148" w:history="1">
+      <w:hyperlink r:id="rId157" w:history="1">
         <w:r>
           <w:rPr>
             <w:rStyle w:val="Hyperlink"/>
@@ -20280,7 +21157,7 @@
         </w:rPr>
         <w:t xml:space="preserve">€1.42 </w:t>
       </w:r>
-      <w:hyperlink r:id="rId149" w:history="1">
+      <w:hyperlink r:id="rId158" w:history="1">
         <w:r>
           <w:rPr>
             <w:rStyle w:val="Hyperlink"/>
@@ -20363,7 +21240,7 @@
           <w:lang w:val="en-US"/>
         </w:rPr>
       </w:pPr>
-      <w:hyperlink r:id="rId150" w:history="1">
+      <w:hyperlink r:id="rId159" w:history="1">
         <w:r>
           <w:rPr>
             <w:rStyle w:val="Hyperlink"/>
@@ -20404,7 +21281,7 @@
           <w:lang w:val="en-US"/>
         </w:rPr>
       </w:pPr>
-      <w:hyperlink r:id="rId151" w:history="1">
+      <w:hyperlink r:id="rId160" w:history="1">
         <w:r>
           <w:rPr>
             <w:rStyle w:val="Hyperlink"/>
@@ -20425,7 +21302,7 @@
           <w:lang w:val="en-US"/>
         </w:rPr>
       </w:pPr>
-      <w:hyperlink r:id="rId152" w:tgtFrame="_blank" w:history="1">
+      <w:hyperlink r:id="rId161" w:tgtFrame="_blank" w:history="1">
         <w:r>
           <w:rPr>
             <w:rStyle w:val="Hyperlink"/>
@@ -20451,7 +21328,6 @@
           <w:noProof/>
           <w:lang w:val="en-US"/>
         </w:rPr>
-        <w:lastRenderedPageBreak/>
         <w:drawing>
           <wp:inline distT="0" distB="0" distL="0" distR="0" wp14:anchorId="15D527B6" wp14:editId="2540E164">
             <wp:extent cx="2838450" cy="1052707"/>
@@ -20468,7 +21344,7 @@
                     <pic:cNvPicPr/>
                   </pic:nvPicPr>
                   <pic:blipFill>
-                    <a:blip r:embed="rId153"/>
+                    <a:blip r:embed="rId162"/>
                     <a:stretch>
                       <a:fillRect/>
                     </a:stretch>
@@ -20521,7 +21397,15 @@
       </w:r>
       <w:proofErr w:type="spellEnd"/>
       <w:r>
-        <w:t xml:space="preserve"> en ECC chip (</w:t>
+        <w:t xml:space="preserve"> en </w:t>
+      </w:r>
+      <w:proofErr w:type="gramStart"/>
+      <w:r>
+        <w:t>ECC chip</w:t>
+      </w:r>
+      <w:proofErr w:type="gramEnd"/>
+      <w:r>
+        <w:t xml:space="preserve"> (</w:t>
       </w:r>
       <w:proofErr w:type="spellStart"/>
       <w:r>
@@ -20529,7 +21413,15 @@
       </w:r>
       <w:proofErr w:type="spellEnd"/>
       <w:r>
-        <w:t>, ROM en SD module?)</w:t>
+        <w:t xml:space="preserve">, ROM en </w:t>
+      </w:r>
+      <w:proofErr w:type="gramStart"/>
+      <w:r>
+        <w:t>SD module</w:t>
+      </w:r>
+      <w:proofErr w:type="gramEnd"/>
+      <w:r>
+        <w:t>?)</w:t>
       </w:r>
     </w:p>
     <w:p>
@@ -20558,7 +21450,7 @@
           <w:numId w:val="66"/>
         </w:numPr>
       </w:pPr>
-      <w:hyperlink r:id="rId154" w:history="1">
+      <w:hyperlink r:id="rId163" w:history="1">
         <w:r>
           <w:rPr>
             <w:rStyle w:val="Hyperlink"/>
@@ -20576,9 +21468,10 @@
         </w:numPr>
       </w:pPr>
       <w:r>
+        <w:lastRenderedPageBreak/>
         <w:t xml:space="preserve">€1.5 </w:t>
       </w:r>
-      <w:hyperlink r:id="rId155" w:history="1">
+      <w:hyperlink r:id="rId164" w:history="1">
         <w:proofErr w:type="spellStart"/>
         <w:r>
           <w:rPr>
@@ -20711,7 +21604,7 @@
           <w:lang w:val="en-US"/>
         </w:rPr>
       </w:pPr>
-      <w:hyperlink r:id="rId156" w:history="1">
+      <w:hyperlink r:id="rId165" w:history="1">
         <w:r>
           <w:rPr>
             <w:rStyle w:val="Hyperlink"/>
@@ -20738,7 +21631,7 @@
         </w:rPr>
         <w:t xml:space="preserve">€1.58 </w:t>
       </w:r>
-      <w:hyperlink r:id="rId157" w:history="1">
+      <w:hyperlink r:id="rId166" w:history="1">
         <w:proofErr w:type="spellStart"/>
         <w:r>
           <w:rPr>
@@ -20829,7 +21722,7 @@
       <w:bookmarkEnd w:id="63"/>
     </w:p>
     <w:p>
-      <w:hyperlink r:id="rId158" w:history="1">
+      <w:hyperlink r:id="rId167" w:history="1">
         <w:proofErr w:type="spellStart"/>
         <w:r>
           <w:rPr>
@@ -20847,7 +21740,7 @@
       </w:hyperlink>
     </w:p>
     <w:p>
-      <w:hyperlink r:id="rId159" w:history="1">
+      <w:hyperlink r:id="rId168" w:history="1">
         <w:proofErr w:type="spellStart"/>
         <w:r>
           <w:rPr>
@@ -20865,7 +21758,7 @@
       </w:hyperlink>
     </w:p>
     <w:p>
-      <w:hyperlink r:id="rId160" w:history="1">
+      <w:hyperlink r:id="rId169" w:history="1">
         <w:r>
           <w:rPr>
             <w:rStyle w:val="Hyperlink"/>
@@ -20882,7 +21775,7 @@
           <w:numId w:val="66"/>
         </w:numPr>
       </w:pPr>
-      <w:hyperlink r:id="rId161" w:history="1">
+      <w:hyperlink r:id="rId170" w:history="1">
         <w:r>
           <w:rPr>
             <w:rStyle w:val="Hyperlink"/>
@@ -20902,13 +21795,25 @@
       <w:r>
         <w:t xml:space="preserve">€1.18 </w:t>
       </w:r>
-      <w:hyperlink r:id="rId162" w:history="1">
+      <w:hyperlink r:id="rId171" w:history="1">
         <w:proofErr w:type="spellStart"/>
         <w:r>
           <w:rPr>
             <w:rStyle w:val="Hyperlink"/>
           </w:rPr>
-          <w:t>mouser</w:t>
+          <w:t>m</w:t>
+        </w:r>
+        <w:r>
+          <w:rPr>
+            <w:rStyle w:val="Hyperlink"/>
+          </w:rPr>
+          <w:t>o</w:t>
+        </w:r>
+        <w:r>
+          <w:rPr>
+            <w:rStyle w:val="Hyperlink"/>
+          </w:rPr>
+          <w:t>user</w:t>
         </w:r>
         <w:proofErr w:type="spellEnd"/>
       </w:hyperlink>
@@ -21010,7 +21915,7 @@
                     <pic:cNvPicPr/>
                   </pic:nvPicPr>
                   <pic:blipFill>
-                    <a:blip r:embed="rId163"/>
+                    <a:blip r:embed="rId172"/>
                     <a:stretch>
                       <a:fillRect/>
                     </a:stretch>
@@ -21039,7 +21944,7 @@
           <w:numId w:val="66"/>
         </w:numPr>
       </w:pPr>
-      <w:hyperlink r:id="rId164" w:history="1">
+      <w:hyperlink r:id="rId173" w:history="1">
         <w:r>
           <w:rPr>
             <w:rStyle w:val="Hyperlink"/>
@@ -21079,7 +21984,7 @@
           <w:numId w:val="66"/>
         </w:numPr>
       </w:pPr>
-      <w:hyperlink r:id="rId165" w:history="1">
+      <w:hyperlink r:id="rId174" w:history="1">
         <w:r>
           <w:rPr>
             <w:rStyle w:val="Hyperlink"/>
@@ -21099,7 +22004,7 @@
       <w:r>
         <w:t xml:space="preserve">€ 1.75 </w:t>
       </w:r>
-      <w:hyperlink r:id="rId166" w:history="1">
+      <w:hyperlink r:id="rId175" w:history="1">
         <w:proofErr w:type="spellStart"/>
         <w:r>
           <w:rPr>
@@ -21203,7 +22108,6 @@
         <w:rPr>
           <w:lang w:val="en-US"/>
         </w:rPr>
-        <w:lastRenderedPageBreak/>
         <w:drawing>
           <wp:inline distT="0" distB="0" distL="0" distR="0" wp14:anchorId="5E1C11D9" wp14:editId="403FCB8C">
             <wp:extent cx="4979670" cy="1829502"/>
@@ -21220,7 +22124,7 @@
                     <pic:cNvPicPr/>
                   </pic:nvPicPr>
                   <pic:blipFill>
-                    <a:blip r:embed="rId167"/>
+                    <a:blip r:embed="rId176"/>
                     <a:stretch>
                       <a:fillRect/>
                     </a:stretch>
@@ -21253,6 +22157,7 @@
         <w:rPr>
           <w:lang w:val="en-US"/>
         </w:rPr>
+        <w:lastRenderedPageBreak/>
         <w:drawing>
           <wp:inline distT="0" distB="0" distL="0" distR="0" wp14:anchorId="6B3EF108" wp14:editId="676C629B">
             <wp:extent cx="4598670" cy="2216709"/>
@@ -21269,7 +22174,7 @@
                     <pic:cNvPicPr/>
                   </pic:nvPicPr>
                   <pic:blipFill>
-                    <a:blip r:embed="rId168"/>
+                    <a:blip r:embed="rId177"/>
                     <a:stretch>
                       <a:fillRect/>
                     </a:stretch>
@@ -21318,7 +22223,7 @@
         </w:rPr>
         <w:t xml:space="preserve">: </w:t>
       </w:r>
-      <w:hyperlink r:id="rId169" w:history="1">
+      <w:hyperlink r:id="rId178" w:history="1">
         <w:r>
           <w:rPr>
             <w:rStyle w:val="Hyperlink"/>
@@ -21350,7 +22255,7 @@
           <w:numId w:val="66"/>
         </w:numPr>
       </w:pPr>
-      <w:hyperlink r:id="rId170" w:history="1">
+      <w:hyperlink r:id="rId179" w:history="1">
         <w:proofErr w:type="spellStart"/>
         <w:r>
           <w:rPr>
@@ -21390,7 +22295,7 @@
       <w:r>
         <w:tab/>
       </w:r>
-      <w:hyperlink r:id="rId171" w:history="1">
+      <w:hyperlink r:id="rId180" w:history="1">
         <w:proofErr w:type="spellStart"/>
         <w:r>
           <w:rPr>
@@ -21425,7 +22330,7 @@
                     <pic:cNvPicPr/>
                   </pic:nvPicPr>
                   <pic:blipFill>
-                    <a:blip r:embed="rId172"/>
+                    <a:blip r:embed="rId181"/>
                     <a:stretch>
                       <a:fillRect/>
                     </a:stretch>
@@ -21471,7 +22376,7 @@
                     <pic:cNvPicPr/>
                   </pic:nvPicPr>
                   <pic:blipFill>
-                    <a:blip r:embed="rId173"/>
+                    <a:blip r:embed="rId182"/>
                     <a:stretch>
                       <a:fillRect/>
                     </a:stretch>
@@ -21548,7 +22453,7 @@
         </w:rPr>
         <w:t xml:space="preserve"> </w:t>
       </w:r>
-      <w:hyperlink r:id="rId174" w:history="1">
+      <w:hyperlink r:id="rId183" w:history="1">
         <w:r>
           <w:rPr>
             <w:rStyle w:val="Hyperlink"/>
@@ -21566,8 +22471,9 @@
           <w:numId w:val="66"/>
         </w:numPr>
       </w:pPr>
-      <w:hyperlink r:id="rId175" w:history="1">
+      <w:hyperlink r:id="rId184" w:history="1">
         <w:proofErr w:type="spellStart"/>
+        <w:proofErr w:type="gramStart"/>
         <w:r>
           <w:rPr>
             <w:rStyle w:val="Hyperlink"/>
@@ -21599,6 +22505,7 @@
           <w:t>er</w:t>
         </w:r>
         <w:proofErr w:type="spellEnd"/>
+        <w:proofErr w:type="gramEnd"/>
       </w:hyperlink>
       <w:r>
         <w:tab/>
@@ -21618,7 +22525,7 @@
       <w:r>
         <w:tab/>
       </w:r>
-      <w:hyperlink r:id="rId176" w:history="1">
+      <w:hyperlink r:id="rId185" w:history="1">
         <w:proofErr w:type="spellStart"/>
         <w:r>
           <w:rPr>
@@ -21637,7 +22544,6 @@
         <w:pStyle w:val="ListParagraph"/>
       </w:pPr>
       <w:r>
-        <w:lastRenderedPageBreak/>
         <w:drawing>
           <wp:inline distT="0" distB="0" distL="0" distR="0" wp14:anchorId="283379A9" wp14:editId="581861FE">
             <wp:extent cx="1451500" cy="1371600"/>
@@ -21654,7 +22560,7 @@
                     <pic:cNvPicPr/>
                   </pic:nvPicPr>
                   <pic:blipFill>
-                    <a:blip r:embed="rId177"/>
+                    <a:blip r:embed="rId186"/>
                     <a:stretch>
                       <a:fillRect/>
                     </a:stretch>
@@ -21703,7 +22609,7 @@
                     <pic:cNvPicPr/>
                   </pic:nvPicPr>
                   <pic:blipFill>
-                    <a:blip r:embed="rId178"/>
+                    <a:blip r:embed="rId187"/>
                     <a:stretch>
                       <a:fillRect/>
                     </a:stretch>
@@ -21821,6 +22727,7 @@
           <w:bCs/>
           <w:lang w:val="en-US"/>
         </w:rPr>
+        <w:lastRenderedPageBreak/>
         <w:t xml:space="preserve">LDO: </w:t>
       </w:r>
       <w:r>
@@ -21831,7 +22738,7 @@
         </w:rPr>
         <w:t xml:space="preserve"> </w:t>
       </w:r>
-      <w:hyperlink r:id="rId179" w:history="1">
+      <w:hyperlink r:id="rId188" w:history="1">
         <w:r>
           <w:rPr>
             <w:rStyle w:val="Hyperlink"/>
@@ -21872,7 +22779,7 @@
         </w:rPr>
         <w:t xml:space="preserve">of </w:t>
       </w:r>
-      <w:hyperlink r:id="rId180" w:history="1">
+      <w:hyperlink r:id="rId189" w:history="1">
         <w:r>
           <w:rPr>
             <w:rStyle w:val="Hyperlink"/>
@@ -22000,18 +22907,341 @@
     </w:p>
     <w:p>
       <w:pPr>
-        <w:rPr>
-          <w:b/>
-          <w:bCs/>
-          <w:lang w:val="en-US"/>
-        </w:rPr>
-      </w:pPr>
-      <w:r>
-        <w:rPr>
-          <w:b/>
-          <w:bCs/>
-          <w:lang w:val="en-US"/>
-        </w:rPr>
+        <w:pStyle w:val="ListParagraph"/>
+        <w:numPr>
+          <w:ilvl w:val="0"/>
+          <w:numId w:val="66"/>
+        </w:numPr>
+      </w:pPr>
+      <w:hyperlink r:id="rId190" w:history="1">
+        <w:r>
+          <w:rPr>
+            <w:rStyle w:val="Hyperlink"/>
+          </w:rPr>
+          <w:t>TPS61253</w:t>
+        </w:r>
+      </w:hyperlink>
+    </w:p>
+    <w:p>
+      <w:pPr>
+        <w:pStyle w:val="ListParagraph"/>
+        <w:numPr>
+          <w:ilvl w:val="1"/>
+          <w:numId w:val="66"/>
+        </w:numPr>
+      </w:pPr>
+      <w:hyperlink r:id="rId191" w:history="1">
+        <w:proofErr w:type="spellStart"/>
+        <w:proofErr w:type="gramStart"/>
+        <w:r>
+          <w:rPr>
+            <w:rStyle w:val="Hyperlink"/>
+          </w:rPr>
+          <w:t>mouser</w:t>
+        </w:r>
+        <w:proofErr w:type="spellEnd"/>
+        <w:proofErr w:type="gramEnd"/>
+      </w:hyperlink>
+      <w:r>
+        <w:tab/>
+      </w:r>
+      <w:r>
+        <w:t xml:space="preserve">, </w:t>
+      </w:r>
+      <w:hyperlink r:id="rId192" w:history="1">
+        <w:proofErr w:type="spellStart"/>
+        <w:r>
+          <w:rPr>
+            <w:rStyle w:val="Hyperlink"/>
+          </w:rPr>
+          <w:t>digikey</w:t>
+        </w:r>
+        <w:proofErr w:type="spellEnd"/>
+      </w:hyperlink>
+    </w:p>
+    <w:p>
+      <w:pPr>
+        <w:pStyle w:val="ListParagraph"/>
+        <w:numPr>
+          <w:ilvl w:val="1"/>
+          <w:numId w:val="66"/>
+        </w:numPr>
+      </w:pPr>
+      <w:r>
+        <w:drawing>
+          <wp:inline distT="0" distB="0" distL="0" distR="0" wp14:anchorId="1A82DC31" wp14:editId="30EA9884">
+            <wp:extent cx="4508500" cy="2565353"/>
+            <wp:effectExtent l="0" t="0" r="6350" b="6985"/>
+            <wp:docPr id="325160417" name="Picture 1"/>
+            <wp:cNvGraphicFramePr>
+              <a:graphicFrameLocks xmlns:a="http://schemas.openxmlformats.org/drawingml/2006/main" noChangeAspect="1"/>
+            </wp:cNvGraphicFramePr>
+            <a:graphic xmlns:a="http://schemas.openxmlformats.org/drawingml/2006/main">
+              <a:graphicData uri="http://schemas.openxmlformats.org/drawingml/2006/picture">
+                <pic:pic xmlns:pic="http://schemas.openxmlformats.org/drawingml/2006/picture">
+                  <pic:nvPicPr>
+                    <pic:cNvPr id="325160417" name=""/>
+                    <pic:cNvPicPr/>
+                  </pic:nvPicPr>
+                  <pic:blipFill>
+                    <a:blip r:embed="rId193"/>
+                    <a:stretch>
+                      <a:fillRect/>
+                    </a:stretch>
+                  </pic:blipFill>
+                  <pic:spPr>
+                    <a:xfrm>
+                      <a:off x="0" y="0"/>
+                      <a:ext cx="4520483" cy="2572172"/>
+                    </a:xfrm>
+                    <a:prstGeom prst="rect">
+                      <a:avLst/>
+                    </a:prstGeom>
+                  </pic:spPr>
+                </pic:pic>
+              </a:graphicData>
+            </a:graphic>
+          </wp:inline>
+        </w:drawing>
+      </w:r>
+    </w:p>
+    <w:p>
+      <w:pPr>
+        <w:pStyle w:val="ListParagraph"/>
+        <w:numPr>
+          <w:ilvl w:val="1"/>
+          <w:numId w:val="66"/>
+        </w:numPr>
+        <w:rPr>
+          <w:lang w:val="en-US"/>
+        </w:rPr>
+      </w:pPr>
+      <w:r>
+        <w:rPr>
+          <w:lang w:val="en-US"/>
+        </w:rPr>
+        <w:t>TPS61253A</w:t>
+      </w:r>
+      <w:r>
+        <w:rPr>
+          <w:lang w:val="en-US"/>
+        </w:rPr>
+        <w:t xml:space="preserve">: </w:t>
+      </w:r>
+      <w:hyperlink r:id="rId194" w:history="1">
+        <w:r>
+          <w:rPr>
+            <w:rStyle w:val="Hyperlink"/>
+            <w:lang w:val="en-US"/>
+          </w:rPr>
+          <w:t>mouser</w:t>
+        </w:r>
+      </w:hyperlink>
+      <w:r>
+        <w:rPr>
+          <w:lang w:val="en-US"/>
+        </w:rPr>
+        <w:t xml:space="preserve">, </w:t>
+      </w:r>
+      <w:hyperlink r:id="rId195" w:history="1">
+        <w:proofErr w:type="spellStart"/>
+        <w:r>
+          <w:rPr>
+            <w:rStyle w:val="Hyperlink"/>
+            <w:lang w:val="en-US"/>
+          </w:rPr>
+          <w:t>digikey</w:t>
+        </w:r>
+        <w:proofErr w:type="spellEnd"/>
+      </w:hyperlink>
+      <w:r>
+        <w:rPr>
+          <w:lang w:val="en-US"/>
+        </w:rPr>
+        <w:t xml:space="preserve"> (4A </w:t>
+      </w:r>
+      <w:proofErr w:type="spellStart"/>
+      <w:r>
+        <w:rPr>
+          <w:lang w:val="en-US"/>
+        </w:rPr>
+        <w:t>I</w:t>
+      </w:r>
+      <w:r>
+        <w:rPr>
+          <w:vertAlign w:val="subscript"/>
+          <w:lang w:val="en-US"/>
+        </w:rPr>
+        <w:t>sw</w:t>
+      </w:r>
+      <w:proofErr w:type="spellEnd"/>
+      <w:r>
+        <w:rPr>
+          <w:lang w:val="en-US"/>
+        </w:rPr>
+        <w:t>)</w:t>
+      </w:r>
+    </w:p>
+    <w:p>
+      <w:pPr>
+        <w:pStyle w:val="ListParagraph"/>
+        <w:numPr>
+          <w:ilvl w:val="1"/>
+          <w:numId w:val="66"/>
+        </w:numPr>
+        <w:rPr>
+          <w:lang w:val="en-US"/>
+        </w:rPr>
+      </w:pPr>
+      <w:r>
+        <w:rPr>
+          <w:lang w:val="en-US"/>
+        </w:rPr>
+        <w:t>TPS61253</w:t>
+      </w:r>
+      <w:r>
+        <w:rPr>
+          <w:lang w:val="en-US"/>
+        </w:rPr>
+        <w:t>2</w:t>
+      </w:r>
+      <w:r>
+        <w:rPr>
+          <w:lang w:val="en-US"/>
+        </w:rPr>
+        <w:t xml:space="preserve">A: </w:t>
+      </w:r>
+      <w:hyperlink r:id="rId196" w:history="1">
+        <w:r>
+          <w:rPr>
+            <w:rStyle w:val="Hyperlink"/>
+            <w:lang w:val="en-US"/>
+          </w:rPr>
+          <w:t>mouser</w:t>
+        </w:r>
+      </w:hyperlink>
+      <w:r>
+        <w:rPr>
+          <w:lang w:val="en-US"/>
+        </w:rPr>
+        <w:t xml:space="preserve">, </w:t>
+      </w:r>
+      <w:hyperlink r:id="rId197" w:history="1">
+        <w:proofErr w:type="spellStart"/>
+        <w:r>
+          <w:rPr>
+            <w:rStyle w:val="Hyperlink"/>
+            <w:lang w:val="en-US"/>
+          </w:rPr>
+          <w:t>digikey</w:t>
+        </w:r>
+        <w:proofErr w:type="spellEnd"/>
+      </w:hyperlink>
+      <w:r>
+        <w:rPr>
+          <w:lang w:val="en-US"/>
+        </w:rPr>
+        <w:t xml:space="preserve"> (4A </w:t>
+      </w:r>
+      <w:proofErr w:type="spellStart"/>
+      <w:r>
+        <w:rPr>
+          <w:lang w:val="en-US"/>
+        </w:rPr>
+        <w:t>I</w:t>
+      </w:r>
+      <w:r>
+        <w:rPr>
+          <w:vertAlign w:val="subscript"/>
+          <w:lang w:val="en-US"/>
+        </w:rPr>
+        <w:t>sw</w:t>
+      </w:r>
+      <w:proofErr w:type="spellEnd"/>
+      <w:r>
+        <w:rPr>
+          <w:lang w:val="en-US"/>
+        </w:rPr>
+        <w:t>, auto-discharge)</w:t>
+      </w:r>
+    </w:p>
+    <w:p>
+      <w:pPr>
+        <w:pStyle w:val="ListParagraph"/>
+        <w:numPr>
+          <w:ilvl w:val="1"/>
+          <w:numId w:val="66"/>
+        </w:numPr>
+      </w:pPr>
+      <w:r>
+        <w:t>TPS61253</w:t>
+      </w:r>
+      <w:r>
+        <w:t>F</w:t>
+      </w:r>
+      <w:r>
+        <w:t xml:space="preserve">: </w:t>
+      </w:r>
+      <w:hyperlink r:id="rId198" w:history="1">
+        <w:proofErr w:type="spellStart"/>
+        <w:r>
+          <w:rPr>
+            <w:rStyle w:val="Hyperlink"/>
+          </w:rPr>
+          <w:t>mouser</w:t>
+        </w:r>
+        <w:proofErr w:type="spellEnd"/>
+      </w:hyperlink>
+      <w:r>
+        <w:t xml:space="preserve">, </w:t>
+      </w:r>
+      <w:hyperlink r:id="rId199" w:history="1">
+        <w:proofErr w:type="spellStart"/>
+        <w:r>
+          <w:rPr>
+            <w:rStyle w:val="Hyperlink"/>
+          </w:rPr>
+          <w:t>digikey</w:t>
+        </w:r>
+        <w:proofErr w:type="spellEnd"/>
+      </w:hyperlink>
+      <w:r>
+        <w:t xml:space="preserve"> (4.5A </w:t>
+      </w:r>
+      <w:proofErr w:type="spellStart"/>
+      <w:r>
+        <w:t>I</w:t>
+      </w:r>
+      <w:r>
+        <w:rPr>
+          <w:vertAlign w:val="subscript"/>
+        </w:rPr>
+        <w:t>sw</w:t>
+      </w:r>
+      <w:proofErr w:type="spellEnd"/>
+      <w:r>
+        <w:t xml:space="preserve">, niet in voorraad bij </w:t>
+      </w:r>
+      <w:proofErr w:type="spellStart"/>
+      <w:r>
+        <w:t>mo</w:t>
+      </w:r>
+      <w:r>
+        <w:t>user</w:t>
+      </w:r>
+      <w:proofErr w:type="spellEnd"/>
+      <w:r>
+        <w:t xml:space="preserve">, goedkoopste bij </w:t>
+      </w:r>
+      <w:proofErr w:type="spellStart"/>
+      <w:r>
+        <w:t>digikey</w:t>
+      </w:r>
+      <w:proofErr w:type="spellEnd"/>
+      <w:r>
+        <w:t>)</w:t>
+      </w:r>
+      <w:r>
         <w:br/>
       </w:r>
     </w:p>
@@ -22043,7 +23273,7 @@
           <w:lang w:val="en-US"/>
         </w:rPr>
       </w:pPr>
-      <w:hyperlink r:id="rId181" w:history="1">
+      <w:hyperlink r:id="rId200" w:history="1">
         <w:r>
           <w:rPr>
             <w:rStyle w:val="Hyperlink"/>
@@ -22102,7 +23332,7 @@
       </w:pPr>
     </w:p>
     <w:sectPr>
-      <w:headerReference w:type="default" r:id="rId182"/>
+      <w:headerReference w:type="default" r:id="rId201"/>
       <w:type w:val="continuous"/>
       <w:pgSz w:w="11906" w:h="16838"/>
       <w:pgMar w:top="1417" w:right="1417" w:bottom="1417" w:left="1417" w:header="708" w:footer="708" w:gutter="0"/>
@@ -22208,11 +23438,16 @@
     </w:r>
     <w:proofErr w:type="spellEnd"/>
     <w:r>
-      <w:t xml:space="preserve"> fietsslot PCB c</w:t>
+      <w:t xml:space="preserve"> fietsslot </w:t>
+    </w:r>
+    <w:proofErr w:type="gramStart"/>
+    <w:r>
+      <w:t>PCB c</w:t>
     </w:r>
     <w:r>
       <w:t>omponenten</w:t>
     </w:r>
+    <w:proofErr w:type="gramEnd"/>
     <w:r>
       <w:tab/>
     </w:r>
@@ -22238,11 +23473,16 @@
     </w:r>
     <w:proofErr w:type="spellEnd"/>
     <w:r>
-      <w:t xml:space="preserve"> fietsslot PCB c</w:t>
+      <w:t xml:space="preserve"> fietsslot </w:t>
+    </w:r>
+    <w:proofErr w:type="gramStart"/>
+    <w:r>
+      <w:t>PCB c</w:t>
     </w:r>
     <w:r>
       <w:t>omponenten</w:t>
     </w:r>
+    <w:proofErr w:type="gramEnd"/>
     <w:r>
       <w:tab/>
     </w:r>
@@ -22268,11 +23508,16 @@
     </w:r>
     <w:proofErr w:type="spellEnd"/>
     <w:r>
-      <w:t xml:space="preserve"> fietsslot PCB c</w:t>
+      <w:t xml:space="preserve"> fietsslot </w:t>
+    </w:r>
+    <w:proofErr w:type="gramStart"/>
+    <w:r>
+      <w:t>PCB c</w:t>
     </w:r>
     <w:r>
       <w:t>omponenten</w:t>
     </w:r>
+    <w:proofErr w:type="gramEnd"/>
     <w:r>
       <w:tab/>
     </w:r>
@@ -22300,11 +23545,16 @@
     </w:r>
     <w:proofErr w:type="spellEnd"/>
     <w:r>
-      <w:t xml:space="preserve"> fietsslot PCB c</w:t>
+      <w:t xml:space="preserve"> fietsslot </w:t>
+    </w:r>
+    <w:proofErr w:type="gramStart"/>
+    <w:r>
+      <w:t>PCB c</w:t>
     </w:r>
     <w:r>
       <w:t>omponenten</w:t>
     </w:r>
+    <w:proofErr w:type="gramEnd"/>
     <w:r>
       <w:tab/>
     </w:r>
@@ -22330,20 +23580,27 @@
     </w:r>
     <w:proofErr w:type="spellEnd"/>
     <w:r>
-      <w:t xml:space="preserve"> fietsslot PCB c</w:t>
+      <w:t xml:space="preserve"> fietsslot </w:t>
+    </w:r>
+    <w:proofErr w:type="gramStart"/>
+    <w:r>
+      <w:t>PCB c</w:t>
     </w:r>
     <w:r>
       <w:t>omponenten</w:t>
     </w:r>
+    <w:proofErr w:type="gramEnd"/>
     <w:r>
       <w:tab/>
     </w:r>
     <w:r>
       <w:tab/>
     </w:r>
+    <w:proofErr w:type="gramStart"/>
     <w:r>
       <w:t>ECC chip</w:t>
     </w:r>
+    <w:proofErr w:type="gramEnd"/>
   </w:p>
 </w:hdr>
 </file>

</xml_diff>